<commit_message>
Flood paper: persistence check of the record's lead, fixed-decimal numbers, study area, SoftwareX disclosure
The record of earlier flooding and the 2024 floods come from the same change
detection, so the temporal test is repeated without ground flagged in every
earlier event and without ground the JRC record has seen under water. The
record's lead holds in Rangpur and Rajshahi; in Sylhet it rests on the haor's
seasonal water. Numbers now keep fixed decimals (0.080, 82.0 %, 7.0 times).
</commit_message>
<xml_diff>
--- a/docs/paper/submission/manuscript.docx
+++ b/docs/paper/submission/manuscript.docx
@@ -26,7 +26,7 @@
         <w:pStyle w:val="FirstParagraph"/>
       </w:pPr>
       <w:r>
-        <w:t xml:space="preserve">Flood susceptibility maps are judged by how well they rank the ground that floods, yet they are rarely compared with the simplest alternative, the record of where floods have already been. This study makes that comparison for infrastructure mapped in OpenStreetMap in three regions of Bangladesh, using flood extents mapped from Sentinel-1 radar for thirteen events as labels and reference, and scoring every model on 10 km blocks held out from training over 20 block assignments. Trained on floods up to 2022, a gradient-boosted model ranked the ground the 2024 floods reached at an AUC of 0.801 in Rangpur and Rajshahi and 0.797 in Sylhet, below the record of earlier flooding at 0.896 and 0.851. Given that record as a feature, the model beat both in Rangpur and Rajshahi, at 0.924, because terrain still ranks the ground no earlier flood reached, while in Sylhet it matched the record at 0.849. On the south-west coast, where most assets flooded by the 2024 cyclone stood on ground that had not flooded before, the model beat the record, at 0.807 against 0.668. Training on radar-observed extents rather than terrain-threshold labels raised the AUC by 0.101, 0.087 and 0.08 on held-out areas and by 0.069, 0.024 and 0.071 on the 2024 floods, the Sylhet gain within noise. A graph neural network linking neighbouring assets added nothing over tabular models, and elevation carried almost all of the terrain signal. The radar masks agreed only moderately with an independent MODIS flood map, so the scores measure agreement with flooding as radar sees it. Susceptibility studies with a radar flood history should report that record as a baseline.</w:t>
+        <w:t xml:space="preserve">Flood susceptibility maps are judged by how well they rank the ground that floods, yet they are rarely compared with the simplest alternative, the record of where floods have already been. This study makes that comparison for infrastructure mapped in OpenStreetMap in three regions of Bangladesh, using flood extents mapped from Sentinel-1 radar for thirteen events as labels and reference, and scoring every model on 10 km blocks held out from training over 20 block assignments. Trained on floods up to 2022, a gradient-boosted model ranked the ground the 2024 floods reached at an AUC of 0.801 in Rangpur and Rajshahi and 0.797 in Sylhet, below the record of earlier flooding at 0.896 and 0.851. Given that record as a feature, the model beat both in Rangpur and Rajshahi, at 0.924, because terrain still ranks the ground no earlier flood reached, while in Sylhet it matched the record at 0.849. On the south-west coast, where most assets flooded by the 2024 cyclone stood on ground that had not flooded before, the model beat the record, at 0.807 against 0.668. Training on radar-observed extents rather than terrain-threshold labels raised the AUC by 0.101, 0.087 and 0.080 on held-out areas and by 0.069, 0.024 and 0.071 on the 2024 floods, the Sylhet gain within noise. A graph neural network linking neighbouring assets added nothing over tabular models, and elevation carried almost all of the terrain signal. The radar masks agreed only moderately with an independent MODIS flood map, so the scores measure agreement with flooding as radar sees it. Susceptibility studies with a radar flood history should report that record as a baseline.</w:t>
       </w:r>
     </w:p>
     <w:p>
@@ -543,7 +543,7 @@
         <w:pStyle w:val="FirstParagraph"/>
       </w:pPr>
       <w:r>
-        <w:t xml:space="preserve">Three regions with contrasting flood regimes are studied, riverine flooding in Rangpur and Rajshahi, flash flooding in the Sylhet haor basin and cyclone surge on the south-west coast (Fig. 1a, Table 2), and they share one set of model settings so that results stay comparable. Every dataset the pipeline ingests is openly licensed (Table 3). Administrative boundaries come from geoBoundaries, which unlike GADM may be redistributed and carries the union level for Bangladesh. OpenStreetMap coverage is uneven, so an area with few mapped assets shows low exposure whether or not much stands there, and WorldPop’s constrained product carries population only where buildings were detected in imagery.</w:t>
+        <w:t xml:space="preserve">Three regions with contrasting flood regimes are studied, riverine flooding in Rangpur and Rajshahi, flash flooding in the Sylhet haor basin and cyclone surge on the south-west coast (Fig. 1a, Table 2), and they share one set of model settings so that results stay comparable. The regions differ in how water arrives. Rangpur and Rajshahi, in the north-west, lie on the floodplains of the Teesta and the Brahmaputra–Jamuna, where monsoon rivers rise above their danger levels and stay there for days to weeks, and all five mapped floods fell between late June and October (Table 4). The Sylhet region holds the haor basin, a low bowl of seasonal wetlands fed by rivers from the hills to the north and east, where flash floods rise quickly and can arrive before the monsoon, as in April 2017, when they struck before the rice harvest. The south-west coast is a delta of tidal channels and polders, embanked islands of farmland, where flooding follows the landfall of a cyclone and the overtopping or breach of embankments rather than the stage of a river. The regions hold 23,016, 13,374 and 29,545 mapped assets, across parts of 21, 10 and 16 districts. Every dataset the pipeline ingests is openly licensed (Table 3). Administrative boundaries come from geoBoundaries, which unlike GADM may be redistributed and carries the union level for Bangladesh. OpenStreetMap coverage is uneven, so an area with few mapped assets shows low exposure whether or not much stands there, and WorldPop’s constrained product carries population only where buildings were detected in imagery.</w:t>
       </w:r>
     </w:p>
     <w:bookmarkEnd w:id="16"/>
@@ -707,7 +707,7 @@
         <w:t xml:space="preserve">(Tellman et al., 2021)</w:t>
       </w:r>
       <w:r>
-        <w:t xml:space="preserve">. On that grid, over cells that MODIS saw clear and that are not permanent water, the maps agree on 81.9 % and 82 % of cells, a figure dominated by dry ground. On flooded ground the agreement is only moderate, with a critical success index of 0.29 and 0.339 and a kappa of 0.346 and 0.406. The radar marks more ground as flooded than MODIS in Rangpur and Rajshahi (19.7 % against 13.2 %), consistent with flooded patches smaller than a MODIS pixel and with flooding hidden by cloud. It marks less in the Sylhet haor (13.2 % against 23.3 %), consistent with the difficulty radar has where water stands under vegetation</w:t>
+        <w:t xml:space="preserve">. On that grid, over cells that MODIS saw clear and that are not permanent water, the maps agree on 81.9 % and 82.0 % of cells, a figure dominated by dry ground. On flooded ground the agreement is only moderate, with a critical success index of 0.290 and 0.339 and a kappa of 0.346 and 0.406. The radar marks more ground as flooded than MODIS in Rangpur and Rajshahi (19.7 % against 13.2 %), consistent with flooded patches smaller than a MODIS pixel and with flooding hidden by cloud. It marks less in the Sylhet haor (13.2 % against 23.3 %), consistent with the difficulty radar has where water stands under vegetation</w:t>
       </w:r>
       <w:r>
         <w:t xml:space="preserve"> </w:t>
@@ -889,7 +889,7 @@
         <w:pStyle w:val="FirstParagraph"/>
       </w:pPr>
       <w:r>
-        <w:t xml:space="preserve">Every model is scored on the held-out blocks by the area under the ROC curve (AUC), average precision and its lift over the base rate, and the Brier score, and the hazard surfaces are also scored against observed flooding over every grid cell. Every comparison between models or label sources is repeated over 20 block assignments drawn with different seeds and tested by a paired comparison across them, because one assignment gives a single number with no sense of its spread. A temporal test trains on the floods up to 2022 and scores against those of 2024 (Section 5.4).</w:t>
+        <w:t xml:space="preserve">Every model is scored on the held-out blocks by the area under the ROC curve (AUC), average precision and its lift over the base rate, and the Brier score, and the hazard surfaces are also scored against observed flooding over every grid cell. Every comparison between models or label sources is repeated over 20 block assignments drawn with different seeds and tested by a paired t-test on the differences across them, because one assignment gives a single number with no sense of its spread. A temporal test trains on the floods up to 2022 and scores against those of 2024 (Section 5.4).</w:t>
       </w:r>
     </w:p>
     <w:bookmarkEnd w:id="23"/>
@@ -935,7 +935,7 @@
         <w:pStyle w:val="FirstParagraph"/>
       </w:pPr>
       <w:r>
-        <w:t xml:space="preserve">Table 5 reports the single block assignment behind the published outputs. In Sylhet 14.7 % of assets sit on flood-prone ground and the asset model reaches an AUC of 0.934. In Rangpur and Rajshahi only 6.7 % do, yet the model ranks well (AUC 0.884), with an average precision 7.032 times the base rate. Calibration lowers the Brier score from 0.069 to 0.029 in Rangpur and Rajshahi, slightly below the 0.032 of always predicting the base rate, and its deciles lie close to the diagonal in both riverine regions (Fig. 5). It carries less well to the coast, where the calibration blocks hold 5.5 % flood-prone assets against 1.7 % in the test blocks and the calibrated Brier score of 0.039 is worse than the base rate at 0.017.</w:t>
+        <w:t xml:space="preserve">Table 5 reports the single block assignment behind the published outputs. In Sylhet 14.7 % of assets sit on flood-prone ground and the asset model reaches an AUC of 0.934. In Rangpur and Rajshahi only 6.7 % do, yet the model ranks well (AUC 0.884), with an average precision 7.0 times the base rate. Calibration lowers the Brier score from 0.069 to 0.029 in Rangpur and Rajshahi, slightly below the 0.032 of always predicting the base rate, and its deciles lie close to the diagonal in both riverine regions (Fig. 5). It carries less well to the coast, where the calibration blocks hold 5.5 % flood-prone assets against 1.7 % in the test blocks and the calibrated Brier score of 0.039 is worse than the base rate at 0.017.</w:t>
       </w:r>
     </w:p>
     <w:bookmarkEnd w:id="25"/>
@@ -962,7 +962,10 @@
         <w:pStyle w:val="FirstParagraph"/>
       </w:pPr>
       <w:r>
-        <w:t xml:space="preserve">The terrain-threshold ensemble captures 0.151 of the ground that flooded in at least 2 of the five Rangpur and Rajshahi events, with a false alarm ratio of 0.517, and marks 6.6 % of the region as flood-prone where the radar saw 21.2 % flood that often. Trained on those labels and scored on the same held-out blocks against observed flooding over 20 assignments, the default model reaches 0.716 against 0.817 for observed labels in Rangpur and Rajshahi, 0.77 against 0.857 in Sylhet and 0.758 against 0.839 on the coast. The gaps of 0.101, 0.087 and 0.08 favour the observed labels on 20, 19 and 19 of the assignments (</w:t>
+        <w:t xml:space="preserve">The terrain-threshold ensemble captures 0.151 of the ground that flooded in at least 2 of the five Rangpur and Rajshahi events, with a false alarm ratio of 0.517, and marks 6.6 % of the region as flood-prone where the radar saw 21.2 % flood that often. Trained on those labels and scored on the same held-out blocks against observed flooding over 20 assignments, the default model reaches 0.716 against 0.817 for observed labels in Rangpur and Rajshahi, 0.770 against 0.857 in Sylhet and 0.758 against 0.839 on the coast. The gaps of 0.101, 0.087 and 0.080 favour the observed labels on 20, 19 and 19 of the assignments (all</w:t>
+      </w:r>
+      <w:r>
+        <w:t xml:space="preserve"> </w:t>
       </w:r>
       <m:oMath>
         <m:r>
@@ -979,10 +982,176 @@
         </m:r>
       </m:oMath>
       <w:r>
-        <w:t xml:space="preserve">,</w:t>
-      </w:r>
-      <w:r>
-        <w:t xml:space="preserve"> </w:t>
+        <w:t xml:space="preserve">; Fig. 4). This test favours the observed labels, since that model is scored against the definition it learned, so Section 5.4 repeats it against later floods that neither label source was trained on.</w:t>
+      </w:r>
+    </w:p>
+    <w:bookmarkEnd w:id="26"/>
+    <w:bookmarkStart w:id="27" w:name="the-south-west-coast"/>
+    <w:p>
+      <w:pPr>
+        <w:pStyle w:val="Heading2"/>
+      </w:pPr>
+      <w:r>
+        <w:rPr>
+          <w:rStyle w:val="SectionNumber"/>
+        </w:rPr>
+        <w:t xml:space="preserve">5.3</w:t>
+      </w:r>
+      <w:r>
+        <w:tab/>
+      </w:r>
+      <w:r>
+        <w:t xml:space="preserve">The south-west coast</w:t>
+      </w:r>
+    </w:p>
+    <w:p>
+      <w:pPr>
+        <w:pStyle w:val="FirstParagraph"/>
+      </w:pPr>
+      <w:r>
+        <w:t xml:space="preserve">On the coast the asset model still ranks flooded ground above dry ground (AUC 0.794), but across the grid both hazard surfaces are close to chance, the terrain surface at 0.542 and the Kriged one at 0.538. The same two surfaces reach 0.657 and 0.666 in Rangpur and Rajshahi and 0.822 and 0.544 in Sylhet. Surge flooding is governed by polder embankments, tidal channels and landfall position, none of which elevation describes.</w:t>
+      </w:r>
+    </w:p>
+    <w:bookmarkEnd w:id="27"/>
+    <w:bookmarkStart w:id="28" w:name="sec:temporal"/>
+    <w:p>
+      <w:pPr>
+        <w:pStyle w:val="Heading2"/>
+      </w:pPr>
+      <w:r>
+        <w:rPr>
+          <w:rStyle w:val="SectionNumber"/>
+        </w:rPr>
+        <w:t xml:space="preserve">5.4</w:t>
+      </w:r>
+      <w:r>
+        <w:tab/>
+      </w:r>
+      <w:r>
+        <w:t xml:space="preserve">Transfer to later floods</w:t>
+      </w:r>
+    </w:p>
+    <w:p>
+      <w:pPr>
+        <w:pStyle w:val="FirstParagraph"/>
+      </w:pPr>
+      <w:r>
+        <w:t xml:space="preserve">The held-out blocks separate training from testing in space but not in time. Each model is therefore also trained on the floods up to 2022, keeping each region’s labelling rule capped by the number of earlier events, and scored on the held-out blocks against the ground any 2024 flood reached. Three references are scored on the same assets over 20 assignments (Table 6). The first is the share of earlier events in which the ground flooded, which is the map the radar record alone provides. The second is the same model trained with the 2024 events included, and the third is the same model trained on terrain-threshold labels, which draw on no flood event.</w:t>
+      </w:r>
+    </w:p>
+    <w:p>
+      <w:pPr>
+        <w:pStyle w:val="BodyText"/>
+      </w:pPr>
+      <w:r>
+        <w:t xml:space="preserve">Trained only on earlier floods, the model ranks the 2024 flooding at 0.801 in Rangpur and Rajshahi, 0.797 in Sylhet and 0.807 on the coast, losing nothing measurable in Rangpur and Rajshahi by leaving out 2024 (</w:t>
+      </w:r>
+      <m:oMath>
+        <m:r>
+          <m:t>p</m:t>
+        </m:r>
+        <m:r>
+          <m:rPr>
+            <m:sty m:val="p"/>
+          </m:rPr>
+          <m:t>=</m:t>
+        </m:r>
+        <m:r>
+          <m:t>0.052</m:t>
+        </m:r>
+      </m:oMath>
+      <w:r>
+        <w:t xml:space="preserve">) and 0.053 and 0.028 elsewhere. In both riverine regions the record of earlier flooding ranks the 2024 flooding better, at 0.896 and 0.851, with the model ahead on only 2 and 4 of 20 assignments, whereas on the coast the model leads, at 0.807 against 0.668. Riverine flooding returns to much the same ground, and only 16.9 % and 22.3 % of the assets flooded in 2024 stood on ground no earlier event had reached, against 65.5 % on the coast, where each surge floods the stretch of coast where it lands.</w:t>
+      </w:r>
+    </w:p>
+    <w:p>
+      <w:pPr>
+        <w:pStyle w:val="BodyText"/>
+      </w:pPr>
+      <w:r>
+        <w:t xml:space="preserve">The record and the 2024 floods come from the same change detection, so ground that radar mistakes for water every monsoon, such as wet paddy, would count as flooded in both and favour the record. Surfaces that stay dark in the dry season, such as sand bars and permanent wetland, are already rejected, since a pixel must darken against its dry-season baseline. The comparison was therefore repeated twice on stricter test sets, once without the ground flagged in every earlier event and once without the ground the JRC record has ever seen under water, and each removal also takes away genuinely flood-prone ground, so the check can only work against the record. Without the always-flooded ground the record still led, by 0.063 in Rangpur and Rajshahi and 0.040 in Sylhet (</w:t>
+      </w:r>
+      <m:oMath>
+        <m:r>
+          <m:t>p</m:t>
+        </m:r>
+        <m:r>
+          <m:rPr>
+            <m:sty m:val="p"/>
+          </m:rPr>
+          <m:t>=</m:t>
+        </m:r>
+        <m:r>
+          <m:t>0.008</m:t>
+        </m:r>
+      </m:oMath>
+      <w:r>
+        <w:t xml:space="preserve"> </w:t>
+      </w:r>
+      <w:r>
+        <w:t xml:space="preserve">and</w:t>
+      </w:r>
+      <w:r>
+        <w:t xml:space="preserve"> </w:t>
+      </w:r>
+      <m:oMath>
+        <m:r>
+          <m:t>p</m:t>
+        </m:r>
+        <m:r>
+          <m:rPr>
+            <m:sty m:val="p"/>
+          </m:rPr>
+          <m:t>=</m:t>
+        </m:r>
+        <m:r>
+          <m:t>0.014</m:t>
+        </m:r>
+      </m:oMath>
+      <w:r>
+        <w:t xml:space="preserve">). Outside recorded water it led in Rangpur and Rajshahi by 0.071 (</w:t>
+      </w:r>
+      <m:oMath>
+        <m:r>
+          <m:t>p</m:t>
+        </m:r>
+        <m:r>
+          <m:rPr>
+            <m:sty m:val="p"/>
+          </m:rPr>
+          <m:t>=</m:t>
+        </m:r>
+        <m:r>
+          <m:t>0.012</m:t>
+        </m:r>
+      </m:oMath>
+      <w:r>
+        <w:t xml:space="preserve">), while in Sylhet the model and the record could not be told apart, at 0.799 and 0.794 (</w:t>
+      </w:r>
+      <m:oMath>
+        <m:r>
+          <m:t>p</m:t>
+        </m:r>
+        <m:r>
+          <m:rPr>
+            <m:sty m:val="p"/>
+          </m:rPr>
+          <m:t>=</m:t>
+        </m:r>
+        <m:r>
+          <m:t>0.842</m:t>
+        </m:r>
+      </m:oMath>
+      <w:r>
+        <w:t xml:space="preserve">), on the 72.0 % of assets that hold only 29.9 % of the ground the 2024 floods reached. The record’s lead in Rangpur and Rajshahi therefore does not rest on ground that radar misreads every year, whereas in Sylhet it rests on the margins of the haor’s seasonal water, where floods return to the same ground. On the coast the model’s lead held on both sets, at 0.140 and 0.166.</w:t>
+      </w:r>
+    </w:p>
+    <w:p>
+      <w:pPr>
+        <w:pStyle w:val="BodyText"/>
+      </w:pPr>
+      <w:r>
+        <w:t xml:space="preserve">The record can also enter the model as a feature, provided it comes from floods before the ones the model learns to predict, or the model would copy its own labels. The model is therefore trained to predict the last event year up to 2022 from its usual features and the share of the earlier events in which the ground flooded, and scored against the 2024 floods with that share taken over every event to 2022. In Rangpur and Rajshahi the combination beats both of its parts, at 0.924 against 0.896 for the record alone (</w:t>
       </w:r>
       <m:oMath>
         <m:r>
@@ -999,13 +1168,66 @@
         </m:r>
       </m:oMath>
       <w:r>
-        <w:t xml:space="preserve"> </w:t>
-      </w:r>
-      <w:r>
-        <w:t xml:space="preserve">and</w:t>
-      </w:r>
-      <w:r>
-        <w:t xml:space="preserve"> </w:t>
+        <w:t xml:space="preserve">) and 0.790 for the model without the feature. Its gain comes on the ground no earlier flood reached, 87.7 % of the test assets, where the record gives every asset a score of zero and the combined model still ranks the 2024 flooding at 0.729. In Sylhet the combination, at 0.849, improves on the model without the feature at 0.837 (</w:t>
+      </w:r>
+      <m:oMath>
+        <m:r>
+          <m:t>p</m:t>
+        </m:r>
+        <m:r>
+          <m:rPr>
+            <m:sty m:val="p"/>
+          </m:rPr>
+          <m:t>=</m:t>
+        </m:r>
+        <m:r>
+          <m:t>0.015</m:t>
+        </m:r>
+      </m:oMath>
+      <w:r>
+        <w:t xml:space="preserve">) but not on the record alone at 0.851 (</w:t>
+      </w:r>
+      <m:oMath>
+        <m:r>
+          <m:t>p</m:t>
+        </m:r>
+        <m:r>
+          <m:rPr>
+            <m:sty m:val="p"/>
+          </m:rPr>
+          <m:t>=</m:t>
+        </m:r>
+        <m:r>
+          <m:t>0.767</m:t>
+        </m:r>
+      </m:oMath>
+      <w:r>
+        <w:t xml:space="preserve">). It still ranks the 2024 flooding at 0.777 on the 79.8 % of test assets that no earlier flood reached. On the coast, where the design leaves a single cyclone to train on, the combination at 0.648 cannot be told apart from the record alone (</w:t>
+      </w:r>
+      <m:oMath>
+        <m:r>
+          <m:t>p</m:t>
+        </m:r>
+        <m:r>
+          <m:rPr>
+            <m:sty m:val="p"/>
+          </m:rPr>
+          <m:t>=</m:t>
+        </m:r>
+        <m:r>
+          <m:t>0.315</m:t>
+        </m:r>
+      </m:oMath>
+      <w:r>
+        <w:t xml:space="preserve">).</w:t>
+      </w:r>
+    </w:p>
+    <w:p>
+      <w:pPr>
+        <w:pStyle w:val="BodyText"/>
+      </w:pPr>
+      <w:r>
+        <w:t xml:space="preserve">The 2024 floods also give the label comparison a test that favours neither label source. The observed labels still lead, at 0.801 against 0.732 in Rangpur and Rajshahi, 0.797 against 0.773 in Sylhet and 0.807 against 0.736 on the coast, ahead on 18, 15 and 18 of 20 assignments (</w:t>
       </w:r>
       <m:oMath>
         <m:r>
@@ -1022,69 +1244,10 @@
         </m:r>
       </m:oMath>
       <w:r>
-        <w:t xml:space="preserve">; Fig. 4). This test favours the observed labels, since that model is scored against the definition it learned, so Section 5.4 repeats it against later floods that neither label source was trained on.</w:t>
-      </w:r>
-    </w:p>
-    <w:bookmarkEnd w:id="26"/>
-    <w:bookmarkStart w:id="27" w:name="the-south-west-coast"/>
-    <w:p>
-      <w:pPr>
-        <w:pStyle w:val="Heading2"/>
-      </w:pPr>
-      <w:r>
-        <w:rPr>
-          <w:rStyle w:val="SectionNumber"/>
-        </w:rPr>
-        <w:t xml:space="preserve">5.3</w:t>
-      </w:r>
-      <w:r>
-        <w:tab/>
-      </w:r>
-      <w:r>
-        <w:t xml:space="preserve">The south-west coast</w:t>
-      </w:r>
-    </w:p>
-    <w:p>
-      <w:pPr>
-        <w:pStyle w:val="FirstParagraph"/>
-      </w:pPr>
-      <w:r>
-        <w:t xml:space="preserve">On the coast the asset model still ranks flooded ground above dry ground (AUC 0.794), but across the grid both hazard surfaces are close to chance, the terrain surface at 0.542 and the Kriged one at 0.538. The same two surfaces reach 0.657 and 0.666 in Rangpur and Rajshahi and 0.822 and 0.544 in Sylhet. Surge flooding is governed by polder embankments, tidal channels and landfall position, none of which elevation describes.</w:t>
-      </w:r>
-    </w:p>
-    <w:bookmarkEnd w:id="27"/>
-    <w:bookmarkStart w:id="28" w:name="sec:temporal"/>
-    <w:p>
-      <w:pPr>
-        <w:pStyle w:val="Heading2"/>
-      </w:pPr>
-      <w:r>
-        <w:rPr>
-          <w:rStyle w:val="SectionNumber"/>
-        </w:rPr>
-        <w:t xml:space="preserve">5.4</w:t>
-      </w:r>
-      <w:r>
-        <w:tab/>
-      </w:r>
-      <w:r>
-        <w:t xml:space="preserve">Transfer to later floods</w:t>
-      </w:r>
-    </w:p>
-    <w:p>
-      <w:pPr>
-        <w:pStyle w:val="FirstParagraph"/>
-      </w:pPr>
-      <w:r>
-        <w:t xml:space="preserve">The held-out blocks separate training from testing in space but not in time. Each model is therefore also trained on the floods up to 2022, keeping each region’s labelling rule capped by the number of earlier events, and scored on the held-out blocks against the ground any 2024 flood reached. Three references are scored on the same assets over 20 assignments (Table 6). The first is the share of earlier events in which the ground flooded, which is the map the radar record alone provides. The second is the same model trained with the 2024 events included, and the third is the same model trained on terrain-threshold labels, which draw on no flood event.</w:t>
-      </w:r>
-    </w:p>
-    <w:p>
-      <w:pPr>
-        <w:pStyle w:val="BodyText"/>
-      </w:pPr>
-      <w:r>
-        <w:t xml:space="preserve">Trained only on earlier floods, the model ranks the 2024 flooding at 0.801 in Rangpur and Rajshahi, 0.797 in Sylhet and 0.807 on the coast, losing nothing measurable in Rangpur and Rajshahi by leaving out 2024 (</w:t>
+        <w:t xml:space="preserve">,</w:t>
+      </w:r>
+      <w:r>
+        <w:t xml:space="preserve"> </w:t>
       </w:r>
       <m:oMath>
         <m:r>
@@ -1097,19 +1260,17 @@
           <m:t>=</m:t>
         </m:r>
         <m:r>
-          <m:t>0.052</m:t>
+          <m:t>0.063</m:t>
         </m:r>
       </m:oMath>
       <w:r>
-        <w:t xml:space="preserve">) and 0.053 and 0.028 elsewhere. In both riverine regions the record of earlier flooding ranks the 2024 flooding better, at 0.896 and 0.851, with the model ahead on only 2 and 4 of 20 assignments, whereas on the coast the model leads, at 0.807 against 0.668. Riverine flooding returns to much the same ground, and only 16.9 % and 22.3 % of the assets flooded in 2024 stood on ground no earlier event had reached, against 65.5 % on the coast, where each surge floods the stretch of coast where it lands.</w:t>
-      </w:r>
-    </w:p>
-    <w:p>
-      <w:pPr>
-        <w:pStyle w:val="BodyText"/>
-      </w:pPr>
-      <w:r>
-        <w:t xml:space="preserve">The record can also enter the model as a feature, provided it comes from floods before the ones the model learns to predict, or the model would copy its own labels. The model is therefore trained to predict the last event year up to 2022 from its usual features and the share of the earlier events in which the ground flooded, and scored against the 2024 floods with that share taken over every event to 2022. In Rangpur and Rajshahi the combination beats both of its parts, at 0.924 against 0.896 for the record alone (</w:t>
+        <w:t xml:space="preserve"> </w:t>
+      </w:r>
+      <w:r>
+        <w:t xml:space="preserve">and</w:t>
+      </w:r>
+      <w:r>
+        <w:t xml:space="preserve"> </w:t>
       </w:r>
       <m:oMath>
         <m:r>
@@ -1126,66 +1287,34 @@
         </m:r>
       </m:oMath>
       <w:r>
-        <w:t xml:space="preserve">) and 0.79 for the model without the feature. Its gain comes on the ground no earlier flood reached, 87.7 % of the test assets, where the record gives every asset a score of zero and the combined model still ranks the 2024 flooding at 0.729. In Sylhet the combination, at 0.849, improves on the model without the feature at 0.837 (</w:t>
-      </w:r>
-      <m:oMath>
-        <m:r>
-          <m:t>p</m:t>
-        </m:r>
-        <m:r>
-          <m:rPr>
-            <m:sty m:val="p"/>
-          </m:rPr>
-          <m:t>=</m:t>
-        </m:r>
-        <m:r>
-          <m:t>0.015</m:t>
-        </m:r>
-      </m:oMath>
-      <w:r>
-        <w:t xml:space="preserve">) but not on the record alone at 0.851 (</w:t>
-      </w:r>
-      <m:oMath>
-        <m:r>
-          <m:t>p</m:t>
-        </m:r>
-        <m:r>
-          <m:rPr>
-            <m:sty m:val="p"/>
-          </m:rPr>
-          <m:t>=</m:t>
-        </m:r>
-        <m:r>
-          <m:t>0.767</m:t>
-        </m:r>
-      </m:oMath>
-      <w:r>
-        <w:t xml:space="preserve">). It still ranks the 2024 flooding at 0.777 on the 79.8 % of test assets that no earlier flood reached. On the coast, where the design leaves a single cyclone to train on, the combination at 0.648 cannot be told apart from the record alone (</w:t>
-      </w:r>
-      <m:oMath>
-        <m:r>
-          <m:t>p</m:t>
-        </m:r>
-        <m:r>
-          <m:rPr>
-            <m:sty m:val="p"/>
-          </m:rPr>
-          <m:t>=</m:t>
-        </m:r>
-        <m:r>
-          <m:t>0.315</m:t>
-        </m:r>
-      </m:oMath>
-      <w:r>
-        <w:t xml:space="preserve">).</w:t>
-      </w:r>
-    </w:p>
-    <w:p>
-      <w:pPr>
-        <w:pStyle w:val="BodyText"/>
-      </w:pPr>
-      <w:r>
-        <w:t xml:space="preserve">The 2024 floods also give the label comparison a test that favours neither label source. The observed labels still lead, at 0.801 against 0.732 in Rangpur and Rajshahi, 0.797 against 0.773 in Sylhet and 0.807 against 0.736 on the coast, ahead on 18, 15 and 18 of 20 assignments (</w:t>
+        <w:t xml:space="preserve">). The coastal gap of 0.071 stays close to its spatial 0.080, while the riverine gaps shrink, from 0.101 to 0.069 in Rangpur and Rajshahi and from 0.087 to 0.024 in Sylhet, where the remaining gap cannot be told apart from noise. Much of the Sylhet advantage in the spatial test therefore came from the shared definition rather than from the labels themselves.</w:t>
+      </w:r>
+    </w:p>
+    <w:bookmarkEnd w:id="28"/>
+    <w:bookmarkStart w:id="29" w:name="sec:benchmark"/>
+    <w:p>
+      <w:pPr>
+        <w:pStyle w:val="Heading2"/>
+      </w:pPr>
+      <w:r>
+        <w:rPr>
+          <w:rStyle w:val="SectionNumber"/>
+        </w:rPr>
+        <w:t xml:space="preserve">5.5</w:t>
+      </w:r>
+      <w:r>
+        <w:tab/>
+      </w:r>
+      <w:r>
+        <w:t xml:space="preserve">Model comparison</w:t>
+      </w:r>
+    </w:p>
+    <w:p>
+      <w:pPr>
+        <w:pStyle w:val="FirstParagraph"/>
+      </w:pPr>
+      <w:r>
+        <w:t xml:space="preserve">A graph neural network, the design this system began with, is set against logistic regression, a random forest and gradient boosting on the same features, assets and blocks, with the wetness index alone as a model-free reference, over 20 assignments (Table 7, Fig. 6). The graph network trails the best ordinary model in every region, by 0.028 in AUC in Rangpur and Rajshahi (</w:t>
       </w:r>
       <m:oMath>
         <m:r>
@@ -1202,10 +1331,7 @@
         </m:r>
       </m:oMath>
       <w:r>
-        <w:t xml:space="preserve">,</w:t>
-      </w:r>
-      <w:r>
-        <w:t xml:space="preserve"> </w:t>
+        <w:t xml:space="preserve">, ahead on 2 of 20 assignments) and 0.022 on the coast (</w:t>
       </w:r>
       <m:oMath>
         <m:r>
@@ -1218,91 +1344,7 @@
           <m:t>=</m:t>
         </m:r>
         <m:r>
-          <m:t>0.063</m:t>
-        </m:r>
-      </m:oMath>
-      <w:r>
-        <w:t xml:space="preserve"> </w:t>
-      </w:r>
-      <w:r>
-        <w:t xml:space="preserve">and</w:t>
-      </w:r>
-      <w:r>
-        <w:t xml:space="preserve"> </w:t>
-      </w:r>
-      <m:oMath>
-        <m:r>
-          <m:t>p</m:t>
-        </m:r>
-        <m:r>
-          <m:rPr>
-            <m:sty m:val="p"/>
-          </m:rPr>
-          <m:t>&lt;</m:t>
-        </m:r>
-        <m:r>
-          <m:t>0.001</m:t>
-        </m:r>
-      </m:oMath>
-      <w:r>
-        <w:t xml:space="preserve">). The coastal gap of 0.071 stays close to its spatial 0.08, while the riverine gaps shrink, from 0.101 to 0.069 in Rangpur and Rajshahi and from 0.087 to 0.024 in Sylhet, where the remaining gap cannot be told apart from noise. Much of the Sylhet advantage in the spatial test therefore came from the shared definition rather than from the labels themselves.</w:t>
-      </w:r>
-    </w:p>
-    <w:bookmarkEnd w:id="28"/>
-    <w:bookmarkStart w:id="29" w:name="sec:benchmark"/>
-    <w:p>
-      <w:pPr>
-        <w:pStyle w:val="Heading2"/>
-      </w:pPr>
-      <w:r>
-        <w:rPr>
-          <w:rStyle w:val="SectionNumber"/>
-        </w:rPr>
-        <w:t xml:space="preserve">5.5</w:t>
-      </w:r>
-      <w:r>
-        <w:tab/>
-      </w:r>
-      <w:r>
-        <w:t xml:space="preserve">Model comparison</w:t>
-      </w:r>
-    </w:p>
-    <w:p>
-      <w:pPr>
-        <w:pStyle w:val="FirstParagraph"/>
-      </w:pPr>
-      <w:r>
-        <w:t xml:space="preserve">A graph neural network, the design this system began with, is set against logistic regression, a random forest and gradient boosting on the same features, assets and blocks, with the wetness index alone as a model-free reference, over 20 assignments (Table 7, Fig. 6). The graph network trails the best ordinary model in every region, by 0.028 in AUC in Rangpur and Rajshahi (</w:t>
-      </w:r>
-      <m:oMath>
-        <m:r>
-          <m:t>p</m:t>
-        </m:r>
-        <m:r>
-          <m:rPr>
-            <m:sty m:val="p"/>
-          </m:rPr>
-          <m:t>&lt;</m:t>
-        </m:r>
-        <m:r>
-          <m:t>0.001</m:t>
-        </m:r>
-      </m:oMath>
-      <w:r>
-        <w:t xml:space="preserve">, ahead on 2 of 20 assignments) and 0.022 on the coast (</w:t>
-      </w:r>
-      <m:oMath>
-        <m:r>
-          <m:t>p</m:t>
-        </m:r>
-        <m:r>
-          <m:rPr>
-            <m:sty m:val="p"/>
-          </m:rPr>
-          <m:t>=</m:t>
-        </m:r>
-        <m:r>
-          <m:t>0.04</m:t>
+          <m:t>0.040</m:t>
         </m:r>
       </m:oMath>
       <w:r>
@@ -1350,7 +1392,7 @@
         <w:pStyle w:val="FirstParagraph"/>
       </w:pPr>
       <w:r>
-        <w:t xml:space="preserve">Shuffling each feature across the test assets over the same assignments shows what the default model uses (Fig. 7). Elevation carries almost all of the terrain signal, costing 0.086, 0.22 and 0.129 in AUC when shuffled, while TWI, HAND, slope and flow accumulation cost at most 0, 0.009 and 0.007. Shuffled together, since correlated features can stand in for one another, the five terrain features cost 0.08, 0.214 and 0.132, about as much as elevation alone. The five access distances together cost 0.11, 0.133 and 0.142, more than the terrain in Rangpur and Rajshahi and on the coast and second to it in Sylhet. They describe distance to services rather than any property of flooding and most likely stand in for where roads and settlements sit on the floodplain, a reading that was not tested directly.</w:t>
+        <w:t xml:space="preserve">Shuffling each feature across the test assets over the same assignments shows what the default model uses (Fig. 7). Elevation carries almost all of the terrain signal, costing 0.086, 0.220 and 0.129 in AUC when shuffled, while TWI, HAND, slope and flow accumulation cost at most 0.000, 0.009 and 0.007. Shuffled together, since correlated features can stand in for one another, the five terrain features cost 0.080, 0.214 and 0.132, about as much as elevation alone. The five access distances together cost 0.110, 0.133 and 0.142, more than the terrain in Rangpur and Rajshahi and on the coast and second to it in Sylhet. They describe distance to services rather than any property of flooding and most likely stand in for where roads and settlements sit on the floodplain, a reading that was not tested directly.</w:t>
       </w:r>
     </w:p>
     <w:bookmarkEnd w:id="30"/>
@@ -1396,7 +1438,7 @@
         <w:pStyle w:val="FirstParagraph"/>
       </w:pPr>
       <w:r>
-        <w:t xml:space="preserve">The label source bears most directly on published flood maps. Terrain-threshold labels cost the model 0.101, 0.087 and 0.08 in AUC on held-out blocks. Against later floods that neither label source had seen they still cost 0.069, 0.024 and 0.071, so in Rangpur and Rajshahi and on the coast the advantage of radar labels does not depend on the test sharing their definition, while in Sylhet most of it did. The indices those labels are built on, TWI and HAND, add almost nothing to the model once elevation is known, and a model scored against labels derived from its own inputs measures its recovery of the labelling rule rather than its skill at locating floods. The mean AUCs here, 0.817 and 0.857 in the riverine regions, sit at or below the best-model AUCs of 0.87 to 0.98 in Table 1. The comparison is only indicative, since those studies split their points at random while every figure here comes from 10 km blocks the model never saw. Blocking has its own critics</w:t>
+        <w:t xml:space="preserve">The label source bears most directly on published flood maps. Terrain-threshold labels cost the model 0.101, 0.087 and 0.080 in AUC on held-out blocks. Against later floods that neither label source had seen they still cost 0.069, 0.024 and 0.071, so in Rangpur and Rajshahi and on the coast the advantage of radar labels does not depend on the test sharing their definition, while in Sylhet most of it did. The indices those labels are built on, TWI and HAND, add almost nothing to the model once elevation is known, and a model scored against labels derived from its own inputs measures its recovery of the labelling rule rather than its skill at locating floods. The mean AUCs here, 0.817 and 0.857 in the riverine regions, sit at or below the best-model AUCs of 0.87 to 0.98 in Table 1. The comparison is only indicative, since those studies split their points at random while every figure here comes from 10 km blocks the model never saw. Blocking has its own critics</w:t>
       </w:r>
       <w:r>
         <w:t xml:space="preserve"> </w:t>
@@ -1432,7 +1474,7 @@
         <w:pStyle w:val="FirstParagraph"/>
       </w:pPr>
       <w:r>
-        <w:t xml:space="preserve">Susceptibility studies rarely ask whether a model anticipates a later flood better than the record of earlier ones. In both riverine regions it did not. Given that record as a feature, the model beat both in Rangpur and Rajshahi, gaining on ground no earlier flood had reached, where the record cannot rank at all. In Sylhet it matched the record without improving on it. The record marks where water returns and the terrain ranks where it has not yet been seen, so a susceptibility map for a river basin with a radar flood history should at least report the record beside it, and where the record is informative the two can be combined. On the coast, where most of the ground Cyclone Remal flooded had not flooded in the earlier cyclones, the model trained on those cyclones did best. A study that reports accuracy without the past-flooding reference cannot show that its model knows more than the flood record already does, and the two are simple to compare wherever Sentinel-1 has observed earlier floods.</w:t>
+        <w:t xml:space="preserve">Susceptibility studies rarely ask whether a model anticipates a later flood better than the record of earlier ones. In both riverine regions it did not, and in Rangpur and Rajshahi the record kept its lead when the ground that radar could misread every monsoon was set aside, while in Sylhet its lead lay on the margins of the haor’s seasonal water. Given that record as a feature, the model beat both in Rangpur and Rajshahi, gaining on ground no earlier flood had reached, where the record cannot rank at all. In Sylhet it matched the record without improving on it. The record marks where water returns and the terrain ranks where it has not yet been seen, so a susceptibility map for a river basin with a radar flood history should at least report the record beside it, and where the record is informative the two can be combined. On the coast, where most of the ground Cyclone Remal flooded had not flooded in the earlier cyclones, the model trained on those cyclones did best. A study that reports accuracy without the past-flooding reference cannot show that its model knows more than the flood record already does, and the two are simple to compare wherever Sentinel-1 has observed earlier floods.</w:t>
       </w:r>
     </w:p>
     <w:bookmarkEnd w:id="33"/>
@@ -1531,7 +1573,7 @@
         <w:t xml:space="preserve">(Rahman et al., 2025)</w:t>
       </w:r>
       <w:r>
-        <w:t xml:space="preserve">. The radar labels carry error of their own, agreeing only moderately with an independent MODIS map and counting inundated paddy as flooding. Every score here therefore measures agreement with flooding mapped by radar rather than with flooding on the ground. The calibrated probabilities hold for a region as a whole rather than for any one area. The composite risk has not been checked against losses, and damage records for the 2022 and 2024 floods, where available, or depth-damage curves for infrastructure components such as those derived by expert elicitation</w:t>
+        <w:t xml:space="preserve">. The radar labels carry error of their own, agreeing only moderately with an independent MODIS map and counting inundated paddy as flooding, although setting aside the ground most exposed to a repeated error left the record’s lead in Rangpur and Rajshahi intact (Section 5.4). Every score here therefore measures agreement with flooding mapped by radar rather than with flooding on the ground. The calibrated probabilities hold for a region as a whole rather than for any one area. The composite risk has not been checked against losses, and damage records for the 2022 and 2024 floods, where available, or depth-damage curves for infrastructure components such as those derived by expert elicitation</w:t>
       </w:r>
       <w:r>
         <w:t xml:space="preserve"> </w:t>
@@ -1568,7 +1610,7 @@
         <w:pStyle w:val="FirstParagraph"/>
       </w:pPr>
       <w:r>
-        <w:t xml:space="preserve">Radar-observed flood extents made better training labels than terrain thresholds, by 0.101, 0.087 and 0.08 in AUC on held-out ground and by 0.069, 0.024 and 0.071 against later floods, which bears on how any map trained and scored against terrain-derived labels should be read. In the riverine regions the record of earlier floods predicted the 2024 flooding better than the model, and in Rangpur and Rajshahi a model given that record as a feature beat both, reaching 0.924, while in Sylhet it matched the record. Ordinary tabular models matched or beat a graph neural network, with elevation and the access distances carrying the signal. The terrain hazard surface ranked observed flooding across the grid at 0.657 and 0.822 in the riverine regions and close to chance on the coast. Every number in this paper is generated from the released pipeline outputs, so each can be checked and rebuilt.</w:t>
+        <w:t xml:space="preserve">Radar-observed flood extents made better training labels than terrain thresholds, by 0.101, 0.087 and 0.080 in AUC on held-out ground and by 0.069, 0.024 and 0.071 against later floods, which bears on how any map trained and scored against terrain-derived labels should be read. In the riverine regions the record of earlier floods predicted the 2024 flooding better than the model, and in Rangpur and Rajshahi a model given that record as a feature beat both, reaching 0.924, while in Sylhet it matched the record. Ordinary tabular models matched or beat a graph neural network, with elevation and the access distances carrying the signal. The terrain hazard surface ranked observed flooding across the grid at 0.657 and 0.822 in the riverine regions and close to chance on the coast. Every number in this paper is generated from the released pipeline outputs, so each can be checked and rebuilt.</w:t>
       </w:r>
     </w:p>
     <w:bookmarkEnd w:id="38"/>
@@ -5796,7 +5838,7 @@
               <w:jc w:val="center"/>
             </w:pPr>
             <w:r>
-              <w:t xml:space="preserve">0.85</w:t>
+              <w:t xml:space="preserve">0.850</w:t>
             </w:r>
           </w:p>
         </w:tc>
@@ -6508,7 +6550,7 @@
               <w:t xml:space="preserve"> </w:t>
             </w:r>
             <w:r>
-              <w:t xml:space="preserve">0.03</w:t>
+              <w:t xml:space="preserve">0.030</w:t>
             </w:r>
           </w:p>
         </w:tc>

</xml_diff>

<commit_message>
Corrected resampled t-test (Nadeau and Bengio 2003) for every comparison over block assignments
The 20 assignments reuse the same assets, so a plain t-test overstated the
evidence. refresh-pvalues recomputes saved p-values from the stored scores
without refitting; AUCs are unchanged. Text revised where a verdict moved:
the graph network's deficit is measurable only in Rangpur and Rajshahi, the
Sylhet combined model does not beat the model without the record, and the
narrower record leads of the persistence check are within noise.
</commit_message>
<xml_diff>
--- a/docs/paper/submission/manuscript.docx
+++ b/docs/paper/submission/manuscript.docx
@@ -889,7 +889,16 @@
         <w:pStyle w:val="FirstParagraph"/>
       </w:pPr>
       <w:r>
-        <w:t xml:space="preserve">Every model is scored on the held-out blocks by the area under the ROC curve (AUC), average precision and its lift over the base rate, and the Brier score, and the hazard surfaces are also scored against observed flooding over every grid cell. Every comparison between models or label sources is repeated over 20 block assignments drawn with different seeds and tested by a paired t-test on the differences across them, because one assignment gives a single number with no sense of its spread. A temporal test trains on the floods up to 2022 and scores against those of 2024 (Section 5.4).</w:t>
+        <w:t xml:space="preserve">Every model is scored on the held-out blocks by the area under the ROC curve (AUC), average precision and its lift over the base rate, and the Brier score, and the hazard surfaces are also scored against observed flooding over every grid cell. Every comparison between models or label sources is repeated over 20 block assignments drawn with different seeds, because one assignment gives a single number with no sense of its spread. The paired differences are tested by the corrected resampled t-test of</w:t>
+      </w:r>
+      <w:r>
+        <w:t xml:space="preserve"> </w:t>
+      </w:r>
+      <w:r>
+        <w:t xml:space="preserve">Nadeau &amp; Bengio (2003)</w:t>
+      </w:r>
+      <w:r>
+        <w:t xml:space="preserve">, since the assignments reuse the same assets, and a plain t-test across them would overstate the evidence. A temporal test trains on the floods up to 2022 and scores against those of 2024 (Section 5.4).</w:t>
       </w:r>
     </w:p>
     <w:bookmarkEnd w:id="23"/>
@@ -962,10 +971,7 @@
         <w:pStyle w:val="FirstParagraph"/>
       </w:pPr>
       <w:r>
-        <w:t xml:space="preserve">The terrain-threshold ensemble captures 0.151 of the ground that flooded in at least 2 of the five Rangpur and Rajshahi events, with a false alarm ratio of 0.517, and marks 6.6 % of the region as flood-prone where the radar saw 21.2 % flood that often. Trained on those labels and scored on the same held-out blocks against observed flooding over 20 assignments, the default model reaches 0.716 against 0.817 for observed labels in Rangpur and Rajshahi, 0.770 against 0.857 in Sylhet and 0.758 against 0.839 on the coast. The gaps of 0.101, 0.087 and 0.080 favour the observed labels on 20, 19 and 19 of the assignments (all</w:t>
-      </w:r>
-      <w:r>
-        <w:t xml:space="preserve"> </w:t>
+        <w:t xml:space="preserve">The terrain-threshold ensemble captures 0.151 of the ground that flooded in at least 2 of the five Rangpur and Rajshahi events, with a false alarm ratio of 0.517, and marks 6.6 % of the region as flood-prone where the radar saw 21.2 % flood that often. Trained on those labels and scored on the same held-out blocks against observed flooding over 20 assignments, the default model reaches 0.716 against 0.817 for observed labels in Rangpur and Rajshahi, 0.770 against 0.857 in Sylhet and 0.758 against 0.839 on the coast. The gaps of 0.101, 0.087 and 0.080 favour the observed labels on 20, 19 and 19 of the assignments (</w:t>
       </w:r>
       <m:oMath>
         <m:r>
@@ -982,6 +988,49 @@
         </m:r>
       </m:oMath>
       <w:r>
+        <w:t xml:space="preserve">,</w:t>
+      </w:r>
+      <w:r>
+        <w:t xml:space="preserve"> </w:t>
+      </w:r>
+      <m:oMath>
+        <m:r>
+          <m:t>p</m:t>
+        </m:r>
+        <m:r>
+          <m:rPr>
+            <m:sty m:val="p"/>
+          </m:rPr>
+          <m:t>=</m:t>
+        </m:r>
+        <m:r>
+          <m:t>0.003</m:t>
+        </m:r>
+      </m:oMath>
+      <w:r>
+        <w:t xml:space="preserve"> </w:t>
+      </w:r>
+      <w:r>
+        <w:t xml:space="preserve">and</w:t>
+      </w:r>
+      <w:r>
+        <w:t xml:space="preserve"> </w:t>
+      </w:r>
+      <m:oMath>
+        <m:r>
+          <m:t>p</m:t>
+        </m:r>
+        <m:r>
+          <m:rPr>
+            <m:sty m:val="p"/>
+          </m:rPr>
+          <m:t>&lt;</m:t>
+        </m:r>
+        <m:r>
+          <m:t>0.001</m:t>
+        </m:r>
+      </m:oMath>
+      <w:r>
         <w:t xml:space="preserve">; Fig. 4). This test favours the observed labels, since that model is scored against the definition it learned, so Section 5.4 repeats it against later floods that neither label source was trained on.</w:t>
       </w:r>
     </w:p>
@@ -1044,7 +1093,24 @@
         <w:pStyle w:val="BodyText"/>
       </w:pPr>
       <w:r>
-        <w:t xml:space="preserve">Trained only on earlier floods, the model ranks the 2024 flooding at 0.801 in Rangpur and Rajshahi, 0.797 in Sylhet and 0.807 on the coast, losing nothing measurable in Rangpur and Rajshahi by leaving out 2024 (</w:t>
+        <w:t xml:space="preserve">Trained only on earlier floods, the model ranks the 2024 flooding at 0.801 in Rangpur and Rajshahi, 0.797 in Sylhet and 0.807 on the coast, losing nothing measurable by leaving out 2024 in Rangpur and Rajshahi (</w:t>
+      </w:r>
+      <m:oMath>
+        <m:r>
+          <m:t>p</m:t>
+        </m:r>
+        <m:r>
+          <m:rPr>
+            <m:sty m:val="p"/>
+          </m:rPr>
+          <m:t>=</m:t>
+        </m:r>
+        <m:r>
+          <m:t>0.281</m:t>
+        </m:r>
+      </m:oMath>
+      <w:r>
+        <w:t xml:space="preserve">) or on the coast, where it lost 0.028 (</w:t>
       </w:r>
       <m:oMath>
         <m:r>
@@ -1061,15 +1127,7 @@
         </m:r>
       </m:oMath>
       <w:r>
-        <w:t xml:space="preserve">) and 0.053 and 0.028 elsewhere. In both riverine regions the record of earlier flooding ranks the 2024 flooding better, at 0.896 and 0.851, with the model ahead on only 2 and 4 of 20 assignments, whereas on the coast the model leads, at 0.807 against 0.668. Riverine flooding returns to much the same ground, and only 16.9 % and 22.3 % of the assets flooded in 2024 stood on ground no earlier event had reached, against 65.5 % on the coast, where each surge floods the stretch of coast where it lands.</w:t>
-      </w:r>
-    </w:p>
-    <w:p>
-      <w:pPr>
-        <w:pStyle w:val="BodyText"/>
-      </w:pPr>
-      <w:r>
-        <w:t xml:space="preserve">The record and the 2024 floods come from the same change detection, so ground that radar mistakes for water every monsoon, such as wet paddy, would count as flooded in both and favour the record. Surfaces that stay dark in the dry season, such as sand bars and permanent wetland, are already rejected, since a pixel must darken against its dry-season baseline. The comparison was therefore repeated twice on stricter test sets, once without the ground flagged in every earlier event and once without the ground the JRC record has ever seen under water, and each removal also takes away genuinely flood-prone ground, so the check can only work against the record. Without the always-flooded ground the record still led, by 0.063 in Rangpur and Rajshahi and 0.040 in Sylhet (</w:t>
+        <w:t xml:space="preserve">), and 0.053 in Sylhet (</w:t>
       </w:r>
       <m:oMath>
         <m:r>
@@ -1082,17 +1140,19 @@
           <m:t>=</m:t>
         </m:r>
         <m:r>
-          <m:t>0.008</m:t>
+          <m:t>0.020</m:t>
         </m:r>
       </m:oMath>
       <w:r>
-        <w:t xml:space="preserve"> </w:t>
-      </w:r>
-      <w:r>
-        <w:t xml:space="preserve">and</w:t>
-      </w:r>
-      <w:r>
-        <w:t xml:space="preserve"> </w:t>
+        <w:t xml:space="preserve">). In both riverine regions the record of earlier flooding ranks the 2024 flooding better, at 0.896 and 0.851, with the model ahead on only 2 and 4 of 20 assignments, whereas on the coast the model leads, at 0.807 against 0.668. Riverine flooding returns to much the same ground, and only 16.9 % and 22.3 % of the assets flooded in 2024 stood on ground no earlier event had reached, against 65.5 % on the coast, where each surge floods the stretch of coast where it lands.</w:t>
+      </w:r>
+    </w:p>
+    <w:p>
+      <w:pPr>
+        <w:pStyle w:val="BodyText"/>
+      </w:pPr>
+      <w:r>
+        <w:t xml:space="preserve">The record and the 2024 floods come from the same change detection, so ground that radar mistakes for water every monsoon, such as wet paddy, would count as flooded in both and favour the record. Surfaces that stay dark in the dry season, such as sand bars and permanent wetland, are already rejected, since a pixel must darken against its dry-season baseline. The comparison was therefore repeated twice on stricter test sets, once without the ground flagged in every earlier event and once without the ground the JRC record has ever seen under water, and each removal also takes away genuinely flood-prone ground, so the check can only work against the record. Without the always-flooded ground the record still led, by 0.063 in Rangpur and Rajshahi and 0.040 in Sylhet, ahead on 14 and 12 of 20 assignments, and outside recorded water it led in Rangpur and Rajshahi by 0.071, ahead on 15. These narrower leads cannot be told apart from noise (</w:t>
       </w:r>
       <m:oMath>
         <m:r>
@@ -1105,11 +1165,14 @@
           <m:t>=</m:t>
         </m:r>
         <m:r>
-          <m:t>0.014</m:t>
+          <m:t>0.130</m:t>
         </m:r>
       </m:oMath>
       <w:r>
-        <w:t xml:space="preserve">). Outside recorded water it led in Rangpur and Rajshahi by 0.071 (</w:t>
+        <w:t xml:space="preserve">,</w:t>
+      </w:r>
+      <w:r>
+        <w:t xml:space="preserve"> </w:t>
       </w:r>
       <m:oMath>
         <m:r>
@@ -1122,11 +1185,17 @@
           <m:t>=</m:t>
         </m:r>
         <m:r>
-          <m:t>0.012</m:t>
+          <m:t>0.185</m:t>
         </m:r>
       </m:oMath>
       <w:r>
-        <w:t xml:space="preserve">), while in Sylhet the model and the record could not be told apart, at 0.799 and 0.794 (</w:t>
+        <w:t xml:space="preserve"> </w:t>
+      </w:r>
+      <w:r>
+        <w:t xml:space="preserve">and</w:t>
+      </w:r>
+      <w:r>
+        <w:t xml:space="preserve"> </w:t>
       </w:r>
       <m:oMath>
         <m:r>
@@ -1139,36 +1208,11 @@
           <m:t>=</m:t>
         </m:r>
         <m:r>
-          <m:t>0.842</m:t>
+          <m:t>0.146</m:t>
         </m:r>
       </m:oMath>
       <w:r>
-        <w:t xml:space="preserve">), on the 72.0 % of assets that hold only 29.9 % of the ground the 2024 floods reached. The record’s lead in Rangpur and Rajshahi therefore does not rest on ground that radar misreads every year, whereas in Sylhet it rests on the margins of the haor’s seasonal water, where floods return to the same ground. On the coast the model’s lead held on both sets, at 0.140 and 0.166.</w:t>
-      </w:r>
-    </w:p>
-    <w:p>
-      <w:pPr>
-        <w:pStyle w:val="BodyText"/>
-      </w:pPr>
-      <w:r>
-        <w:t xml:space="preserve">The record can also enter the model as a feature, provided it comes from floods before the ones the model learns to predict, or the model would copy its own labels. The model is therefore trained to predict the last event year up to 2022 from its usual features and the share of the earlier events in which the ground flooded, and scored against the 2024 floods with that share taken over every event to 2022. In Rangpur and Rajshahi the combination beats both of its parts, at 0.924 against 0.896 for the record alone (</w:t>
-      </w:r>
-      <m:oMath>
-        <m:r>
-          <m:t>p</m:t>
-        </m:r>
-        <m:r>
-          <m:rPr>
-            <m:sty m:val="p"/>
-          </m:rPr>
-          <m:t>&lt;</m:t>
-        </m:r>
-        <m:r>
-          <m:t>0.001</m:t>
-        </m:r>
-      </m:oMath>
-      <w:r>
-        <w:t xml:space="preserve">) and 0.790 for the model without the feature. Its gain comes on the ground no earlier flood reached, 87.7 % of the test assets, where the record gives every asset a score of zero and the combined model still ranks the 2024 flooding at 0.729. In Sylhet the combination, at 0.849, improves on the model without the feature at 0.837 (</w:t>
+        <w:t xml:space="preserve">), but none reverses. In Sylhet outside recorded water the model and the record were level, at 0.799 and 0.794 (</w:t>
       </w:r>
       <m:oMath>
         <m:r>
@@ -1181,11 +1225,19 @@
           <m:t>=</m:t>
         </m:r>
         <m:r>
-          <m:t>0.015</m:t>
+          <m:t>0.912</m:t>
         </m:r>
       </m:oMath>
       <w:r>
-        <w:t xml:space="preserve">) but not on the record alone at 0.851 (</w:t>
+        <w:t xml:space="preserve">), on the 72.0 % of assets that hold only 29.9 % of the ground the 2024 floods reached. Ground that radar could misread every year therefore accounts for part of the record’s lead in Rangpur and Rajshahi but does not overturn it, whereas in Sylhet the lead rests on the margins of the haor’s seasonal water, where floods return to the same ground. On the coast the model’s lead held on both sets, at 0.140 and 0.166.</w:t>
+      </w:r>
+    </w:p>
+    <w:p>
+      <w:pPr>
+        <w:pStyle w:val="BodyText"/>
+      </w:pPr>
+      <w:r>
+        <w:t xml:space="preserve">The record can also enter the model as a feature, provided it comes from floods before the ones the model learns to predict, or the model would copy its own labels. The model is therefore trained to predict the last event year up to 2022 from its usual features and the share of the earlier events in which the ground flooded, and scored against the 2024 floods with that share taken over every event to 2022. In Rangpur and Rajshahi the combination beats both of its parts, at 0.924 against 0.896 for the record alone (</w:t>
       </w:r>
       <m:oMath>
         <m:r>
@@ -1198,11 +1250,11 @@
           <m:t>=</m:t>
         </m:r>
         <m:r>
-          <m:t>0.767</m:t>
+          <m:t>0.020</m:t>
         </m:r>
       </m:oMath>
       <w:r>
-        <w:t xml:space="preserve">). It still ranks the 2024 flooding at 0.777 on the 79.8 % of test assets that no earlier flood reached. On the coast, where the design leaves a single cyclone to train on, the combination at 0.648 cannot be told apart from the record alone (</w:t>
+        <w:t xml:space="preserve">) and 0.790 for the model without the feature. Its gain comes on the ground no earlier flood reached, 87.7 % of the test assets, where the record gives every asset a score of zero and the combined model still ranks the 2024 flooding at 0.729. In Sylhet the combination, at 0.849, cannot be told apart from either the model without the feature at 0.837 (</w:t>
       </w:r>
       <m:oMath>
         <m:r>
@@ -1215,39 +1267,11 @@
           <m:t>=</m:t>
         </m:r>
         <m:r>
-          <m:t>0.315</m:t>
+          <m:t>0.196</m:t>
         </m:r>
       </m:oMath>
       <w:r>
-        <w:t xml:space="preserve">).</w:t>
-      </w:r>
-    </w:p>
-    <w:p>
-      <w:pPr>
-        <w:pStyle w:val="BodyText"/>
-      </w:pPr>
-      <w:r>
-        <w:t xml:space="preserve">The 2024 floods also give the label comparison a test that favours neither label source. The observed labels still lead, at 0.801 against 0.732 in Rangpur and Rajshahi, 0.797 against 0.773 in Sylhet and 0.807 against 0.736 on the coast, ahead on 18, 15 and 18 of 20 assignments (</w:t>
-      </w:r>
-      <m:oMath>
-        <m:r>
-          <m:t>p</m:t>
-        </m:r>
-        <m:r>
-          <m:rPr>
-            <m:sty m:val="p"/>
-          </m:rPr>
-          <m:t>&lt;</m:t>
-        </m:r>
-        <m:r>
-          <m:t>0.001</m:t>
-        </m:r>
-      </m:oMath>
-      <w:r>
-        <w:t xml:space="preserve">,</w:t>
-      </w:r>
-      <w:r>
-        <w:t xml:space="preserve"> </w:t>
+        <w:t xml:space="preserve">) or the record alone at 0.851 (</w:t>
       </w:r>
       <m:oMath>
         <m:r>
@@ -1260,78 +1284,11 @@
           <m:t>=</m:t>
         </m:r>
         <m:r>
-          <m:t>0.063</m:t>
+          <m:t>0.881</m:t>
         </m:r>
       </m:oMath>
       <w:r>
-        <w:t xml:space="preserve"> </w:t>
-      </w:r>
-      <w:r>
-        <w:t xml:space="preserve">and</w:t>
-      </w:r>
-      <w:r>
-        <w:t xml:space="preserve"> </w:t>
-      </w:r>
-      <m:oMath>
-        <m:r>
-          <m:t>p</m:t>
-        </m:r>
-        <m:r>
-          <m:rPr>
-            <m:sty m:val="p"/>
-          </m:rPr>
-          <m:t>&lt;</m:t>
-        </m:r>
-        <m:r>
-          <m:t>0.001</m:t>
-        </m:r>
-      </m:oMath>
-      <w:r>
-        <w:t xml:space="preserve">). The coastal gap of 0.071 stays close to its spatial 0.080, while the riverine gaps shrink, from 0.101 to 0.069 in Rangpur and Rajshahi and from 0.087 to 0.024 in Sylhet, where the remaining gap cannot be told apart from noise. Much of the Sylhet advantage in the spatial test therefore came from the shared definition rather than from the labels themselves.</w:t>
-      </w:r>
-    </w:p>
-    <w:bookmarkEnd w:id="28"/>
-    <w:bookmarkStart w:id="29" w:name="sec:benchmark"/>
-    <w:p>
-      <w:pPr>
-        <w:pStyle w:val="Heading2"/>
-      </w:pPr>
-      <w:r>
-        <w:rPr>
-          <w:rStyle w:val="SectionNumber"/>
-        </w:rPr>
-        <w:t xml:space="preserve">5.5</w:t>
-      </w:r>
-      <w:r>
-        <w:tab/>
-      </w:r>
-      <w:r>
-        <w:t xml:space="preserve">Model comparison</w:t>
-      </w:r>
-    </w:p>
-    <w:p>
-      <w:pPr>
-        <w:pStyle w:val="FirstParagraph"/>
-      </w:pPr>
-      <w:r>
-        <w:t xml:space="preserve">A graph neural network, the design this system began with, is set against logistic regression, a random forest and gradient boosting on the same features, assets and blocks, with the wetness index alone as a model-free reference, over 20 assignments (Table 7, Fig. 6). The graph network trails the best ordinary model in every region, by 0.028 in AUC in Rangpur and Rajshahi (</w:t>
-      </w:r>
-      <m:oMath>
-        <m:r>
-          <m:t>p</m:t>
-        </m:r>
-        <m:r>
-          <m:rPr>
-            <m:sty m:val="p"/>
-          </m:rPr>
-          <m:t>&lt;</m:t>
-        </m:r>
-        <m:r>
-          <m:t>0.001</m:t>
-        </m:r>
-      </m:oMath>
-      <w:r>
-        <w:t xml:space="preserve">, ahead on 2 of 20 assignments) and 0.022 on the coast (</w:t>
+        <w:t xml:space="preserve">). It still ranks the 2024 flooding at 0.777 on the 79.8 % of test assets that no earlier flood reached. On the coast, where the design leaves a single cyclone to train on, the combination at 0.648 cannot be told apart from the record alone (</w:t>
       </w:r>
       <m:oMath>
         <m:r>
@@ -1344,11 +1301,19 @@
           <m:t>=</m:t>
         </m:r>
         <m:r>
-          <m:t>0.040</m:t>
+          <m:t>0.580</m:t>
         </m:r>
       </m:oMath>
       <w:r>
-        <w:t xml:space="preserve">, ahead on 6), while in Sylhet its gap of 0.003 is within noise (</w:t>
+        <w:t xml:space="preserve">).</w:t>
+      </w:r>
+    </w:p>
+    <w:p>
+      <w:pPr>
+        <w:pStyle w:val="BodyText"/>
+      </w:pPr>
+      <w:r>
+        <w:t xml:space="preserve">The 2024 floods also give the label comparison a test that favours neither label source. The observed labels still lead, at 0.801 against 0.732 in Rangpur and Rajshahi, 0.797 against 0.773 in Sylhet and 0.807 against 0.736 on the coast, ahead on 18, 15 and 18 of 20 assignments (</w:t>
       </w:r>
       <m:oMath>
         <m:r>
@@ -1361,11 +1326,132 @@
           <m:t>=</m:t>
         </m:r>
         <m:r>
-          <m:t>0.674</m:t>
+          <m:t>0.013</m:t>
         </m:r>
       </m:oMath>
       <w:r>
-        <w:t xml:space="preserve">, ahead on 7). Gradient boosting scores best in every region, although in Sylhet logistic regression, the graph network and the random forest all come within 0.012 of it. The wetness index alone ranks close to chance, at 0.517, 0.535 and 0.577. Gradient boosting is therefore the default for every region, since choosing a model per region would fit the model to the split. Its AUC varies by 0.042 to 0.046 from one assignment to the next, so each single-assignment figure, including those in Table 5, is one draw from a distribution of that width.</w:t>
+        <w:t xml:space="preserve">,</w:t>
+      </w:r>
+      <w:r>
+        <w:t xml:space="preserve"> </w:t>
+      </w:r>
+      <m:oMath>
+        <m:r>
+          <m:t>p</m:t>
+        </m:r>
+        <m:r>
+          <m:rPr>
+            <m:sty m:val="p"/>
+          </m:rPr>
+          <m:t>=</m:t>
+        </m:r>
+        <m:r>
+          <m:t>0.333</m:t>
+        </m:r>
+      </m:oMath>
+      <w:r>
+        <w:t xml:space="preserve"> </w:t>
+      </w:r>
+      <w:r>
+        <w:t xml:space="preserve">and</w:t>
+      </w:r>
+      <w:r>
+        <w:t xml:space="preserve"> </w:t>
+      </w:r>
+      <m:oMath>
+        <m:r>
+          <m:t>p</m:t>
+        </m:r>
+        <m:r>
+          <m:rPr>
+            <m:sty m:val="p"/>
+          </m:rPr>
+          <m:t>=</m:t>
+        </m:r>
+        <m:r>
+          <m:t>0.004</m:t>
+        </m:r>
+      </m:oMath>
+      <w:r>
+        <w:t xml:space="preserve">). The coastal gap of 0.071 stays close to its spatial 0.080, while the riverine gaps shrink, from 0.101 to 0.069 in Rangpur and Rajshahi and from 0.087 to 0.024 in Sylhet, where the remaining gap cannot be told apart from noise. Much of the Sylhet advantage in the spatial test therefore came from the shared definition rather than from the labels themselves.</w:t>
+      </w:r>
+    </w:p>
+    <w:bookmarkEnd w:id="28"/>
+    <w:bookmarkStart w:id="29" w:name="sec:benchmark"/>
+    <w:p>
+      <w:pPr>
+        <w:pStyle w:val="Heading2"/>
+      </w:pPr>
+      <w:r>
+        <w:rPr>
+          <w:rStyle w:val="SectionNumber"/>
+        </w:rPr>
+        <w:t xml:space="preserve">5.5</w:t>
+      </w:r>
+      <w:r>
+        <w:tab/>
+      </w:r>
+      <w:r>
+        <w:t xml:space="preserve">Model comparison</w:t>
+      </w:r>
+    </w:p>
+    <w:p>
+      <w:pPr>
+        <w:pStyle w:val="FirstParagraph"/>
+      </w:pPr>
+      <w:r>
+        <w:t xml:space="preserve">A graph neural network, the design this system began with, is set against logistic regression, a random forest and gradient boosting on the same features, assets and blocks, with the wetness index alone as a model-free reference, over 20 assignments (Table 7, Fig. 6). The graph network trails the best ordinary model in every region but measurably only in Rangpur and Rajshahi, by 0.028 in AUC (</w:t>
+      </w:r>
+      <m:oMath>
+        <m:r>
+          <m:t>p</m:t>
+        </m:r>
+        <m:r>
+          <m:rPr>
+            <m:sty m:val="p"/>
+          </m:rPr>
+          <m:t>=</m:t>
+        </m:r>
+        <m:r>
+          <m:t>0.003</m:t>
+        </m:r>
+      </m:oMath>
+      <w:r>
+        <w:t xml:space="preserve">, ahead on 2 of 20 assignments), while its gaps of 0.022 on the coast (</w:t>
+      </w:r>
+      <m:oMath>
+        <m:r>
+          <m:t>p</m:t>
+        </m:r>
+        <m:r>
+          <m:rPr>
+            <m:sty m:val="p"/>
+          </m:rPr>
+          <m:t>=</m:t>
+        </m:r>
+        <m:r>
+          <m:t>0.243</m:t>
+        </m:r>
+      </m:oMath>
+      <w:r>
+        <w:t xml:space="preserve">, ahead on 6) and 0.003 in Sylhet (</w:t>
+      </w:r>
+      <m:oMath>
+        <m:r>
+          <m:t>p</m:t>
+        </m:r>
+        <m:r>
+          <m:rPr>
+            <m:sty m:val="p"/>
+          </m:rPr>
+          <m:t>=</m:t>
+        </m:r>
+        <m:r>
+          <m:t>0.832</m:t>
+        </m:r>
+      </m:oMath>
+      <w:r>
+        <w:t xml:space="preserve">, ahead on 7) are within noise. Gradient boosting scores best in every region, although in Sylhet logistic regression, the graph network and the random forest all come within 0.012 of it. The wetness index alone ranks close to chance, at 0.517, 0.535 and 0.577. Gradient boosting is therefore the default for every region, since choosing a model per region would fit the model to the split. Its AUC varies by 0.042 to 0.046 from one assignment to the next, so each single-assignment figure, including those in Table 5, is one draw from a distribution of that width.</w:t>
       </w:r>
     </w:p>
     <w:bookmarkEnd w:id="29"/>
@@ -1474,7 +1560,7 @@
         <w:pStyle w:val="FirstParagraph"/>
       </w:pPr>
       <w:r>
-        <w:t xml:space="preserve">Susceptibility studies rarely ask whether a model anticipates a later flood better than the record of earlier ones. In both riverine regions it did not, and in Rangpur and Rajshahi the record kept its lead when the ground that radar could misread every monsoon was set aside, while in Sylhet its lead lay on the margins of the haor’s seasonal water. Given that record as a feature, the model beat both in Rangpur and Rajshahi, gaining on ground no earlier flood had reached, where the record cannot rank at all. In Sylhet it matched the record without improving on it. The record marks where water returns and the terrain ranks where it has not yet been seen, so a susceptibility map for a river basin with a radar flood history should at least report the record beside it, and where the record is informative the two can be combined. On the coast, where most of the ground Cyclone Remal flooded had not flooded in the earlier cyclones, the model trained on those cyclones did best. A study that reports accuracy without the past-flooding reference cannot show that its model knows more than the flood record already does, and the two are simple to compare wherever Sentinel-1 has observed earlier floods.</w:t>
+        <w:t xml:space="preserve">Susceptibility studies rarely ask whether a model anticipates a later flood better than the record of earlier ones. In both riverine regions it did not, and in Rangpur and Rajshahi the record kept a smaller lead when the ground that radar could misread every monsoon was set aside, while in Sylhet its lead lay on the margins of the haor’s seasonal water. Given that record as a feature, the model beat both in Rangpur and Rajshahi, gaining on ground no earlier flood had reached, where the record cannot rank at all. In Sylhet it matched the record without improving on it. The record marks where water returns and the terrain ranks where it has not yet been seen, so a susceptibility map for a river basin with a radar flood history should at least report the record beside it, and where the record is informative the two can be combined. On the coast, where most of the ground Cyclone Remal flooded had not flooded in the earlier cyclones, the model trained on those cyclones did best. A study that reports accuracy without the past-flooding reference cannot show that its model knows more than the flood record already does, and the two are simple to compare wherever Sentinel-1 has observed earlier floods.</w:t>
       </w:r>
     </w:p>
     <w:bookmarkEnd w:id="33"/>
@@ -1501,7 +1587,7 @@
         <w:pStyle w:val="FirstParagraph"/>
       </w:pPr>
       <w:r>
-        <w:t xml:space="preserve">The graph network rested on the reasoning that neighbouring assets flood together, yet on identical features and blocks it trailed the best tabular model in every region, measurably so in Rangpur and Rajshahi and on the coast, and matched it only within noise in Sylhet. A likely reason is that the features already carry the neighbourhood, since nearby assets share elevation and distances to the same roads, schools and shelters, the access distances rank alongside or ahead of elevation, and a tree can split on those values directly, although this was not tested. Kriging fared no better, and in Sylhet, where it smoothed the scores towards the regional average, it ranked observed flooding across the grid at 0.544 against 0.822 for the terrain surface. At this scale neither linking assets into a graph nor interpolating between them consistently improved spatial prediction, and studies proposing either should report the tabular baseline on the same blocks.</w:t>
+        <w:t xml:space="preserve">The graph network rested on the reasoning that neighbouring assets flood together, yet on identical features and blocks it trailed the best tabular model in every region, measurably so only in Rangpur and Rajshahi, and within noise on the coast and in Sylhet. A likely reason is that the features already carry the neighbourhood, since nearby assets share elevation and distances to the same roads, schools and shelters, the access distances rank alongside or ahead of elevation, and a tree can split on those values directly, although this was not tested. Kriging fared no better, and in Sylhet, where it smoothed the scores towards the regional average, it ranked observed flooding across the grid at 0.544 against 0.822 for the terrain surface. At this scale neither linking assets into a graph nor interpolating between them consistently improved spatial prediction, and studies proposing either should report the tabular baseline on the same blocks.</w:t>
       </w:r>
     </w:p>
     <w:bookmarkEnd w:id="34"/>
@@ -1573,7 +1659,7 @@
         <w:t xml:space="preserve">(Rahman et al., 2025)</w:t>
       </w:r>
       <w:r>
-        <w:t xml:space="preserve">. The radar labels carry error of their own, agreeing only moderately with an independent MODIS map and counting inundated paddy as flooding, although setting aside the ground most exposed to a repeated error left the record’s lead in Rangpur and Rajshahi intact (Section 5.4). Every score here therefore measures agreement with flooding mapped by radar rather than with flooding on the ground. The calibrated probabilities hold for a region as a whole rather than for any one area. The composite risk has not been checked against losses, and damage records for the 2022 and 2024 floods, where available, or depth-damage curves for infrastructure components such as those derived by expert elicitation</w:t>
+        <w:t xml:space="preserve">. The radar labels carry error of their own, agreeing only moderately with an independent MODIS map and counting inundated paddy as flooding, and setting aside the ground most exposed to a repeated error narrowed the record’s lead in Rangpur and Rajshahi to within noise without reversing it (Section 5.4). Every score here therefore measures agreement with flooding mapped by radar rather than with flooding on the ground. The calibrated probabilities hold for a region as a whole rather than for any one area. The composite risk has not been checked against losses, and damage records for the 2022 and 2024 floods, where available, or depth-damage curves for infrastructure components such as those derived by expert elicitation</w:t>
       </w:r>
       <w:r>
         <w:t xml:space="preserve"> </w:t>
@@ -1741,7 +1827,7 @@
       </w:r>
     </w:p>
     <w:bookmarkEnd w:id="43"/>
-    <w:bookmarkStart w:id="109" w:name="references"/>
+    <w:bookmarkStart w:id="111" w:name="references"/>
     <w:p>
       <w:pPr>
         <w:pStyle w:val="Heading1"/>
@@ -1750,7 +1836,7 @@
         <w:t xml:space="preserve">References</w:t>
       </w:r>
     </w:p>
-    <w:bookmarkStart w:id="108" w:name="refs"/>
+    <w:bookmarkStart w:id="110" w:name="refs"/>
     <w:bookmarkStart w:id="45" w:name="ref-adnan2023"/>
     <w:p>
       <w:pPr>
@@ -2379,22 +2465,13 @@
       </w:hyperlink>
     </w:p>
     <w:bookmarkEnd w:id="67"/>
-    <w:bookmarkStart w:id="69" w:name="ref-niculescu2005"/>
+    <w:bookmarkStart w:id="69" w:name="ref-nadeau2003"/>
     <w:p>
       <w:pPr>
         <w:pStyle w:val="Bibliography"/>
       </w:pPr>
       <w:r>
-        <w:t xml:space="preserve">Niculescu-Mizil, A., &amp; Caruana, R. (2005).</w:t>
-      </w:r>
-      <w:r>
-        <w:t xml:space="preserve"> </w:t>
-      </w:r>
-      <w:r>
-        <w:t xml:space="preserve">Predicting good probabilities with supervised learning</w:t>
-      </w:r>
-      <w:r>
-        <w:t xml:space="preserve">.</w:t>
+        <w:t xml:space="preserve">Nadeau, C., &amp; Bengio, Y. (2003). Inference for the generalization error.</w:t>
       </w:r>
       <w:r>
         <w:t xml:space="preserve"> </w:t>
@@ -2404,6 +2481,62 @@
           <w:i/>
           <w:iCs/>
         </w:rPr>
+        <w:t xml:space="preserve">Machine Learning</w:t>
+      </w:r>
+      <w:r>
+        <w:t xml:space="preserve">,</w:t>
+      </w:r>
+      <w:r>
+        <w:t xml:space="preserve"> </w:t>
+      </w:r>
+      <w:r>
+        <w:rPr>
+          <w:i/>
+          <w:iCs/>
+        </w:rPr>
+        <w:t xml:space="preserve">52</w:t>
+      </w:r>
+      <w:r>
+        <w:t xml:space="preserve">(3), 239–281.</w:t>
+      </w:r>
+      <w:r>
+        <w:t xml:space="preserve"> </w:t>
+      </w:r>
+      <w:hyperlink r:id="rId68">
+        <w:r>
+          <w:rPr>
+            <w:rStyle w:val="Hyperlink"/>
+          </w:rPr>
+          <w:t xml:space="preserve">https://doi.org/10.1023/A:1024068626366</w:t>
+        </w:r>
+      </w:hyperlink>
+    </w:p>
+    <w:bookmarkEnd w:id="69"/>
+    <w:bookmarkStart w:id="71" w:name="ref-niculescu2005"/>
+    <w:p>
+      <w:pPr>
+        <w:pStyle w:val="Bibliography"/>
+      </w:pPr>
+      <w:r>
+        <w:t xml:space="preserve">Niculescu-Mizil, A., &amp; Caruana, R. (2005).</w:t>
+      </w:r>
+      <w:r>
+        <w:t xml:space="preserve"> </w:t>
+      </w:r>
+      <w:r>
+        <w:t xml:space="preserve">Predicting good probabilities with supervised learning</w:t>
+      </w:r>
+      <w:r>
+        <w:t xml:space="preserve">.</w:t>
+      </w:r>
+      <w:r>
+        <w:t xml:space="preserve"> </w:t>
+      </w:r>
+      <w:r>
+        <w:rPr>
+          <w:i/>
+          <w:iCs/>
+        </w:rPr>
         <w:t xml:space="preserve">Proceedings of the 22nd International Conference on Machine Learning - ICML ’05</w:t>
       </w:r>
       <w:r>
@@ -2412,7 +2545,7 @@
       <w:r>
         <w:t xml:space="preserve"> </w:t>
       </w:r>
-      <w:hyperlink r:id="rId68">
+      <w:hyperlink r:id="rId70">
         <w:r>
           <w:rPr>
             <w:rStyle w:val="Hyperlink"/>
@@ -2421,8 +2554,8 @@
         </w:r>
       </w:hyperlink>
     </w:p>
-    <w:bookmarkEnd w:id="69"/>
-    <w:bookmarkStart w:id="71" w:name="ref-nobre2011"/>
+    <w:bookmarkEnd w:id="71"/>
+    <w:bookmarkStart w:id="73" w:name="ref-nobre2011"/>
     <w:p>
       <w:pPr>
         <w:pStyle w:val="Bibliography"/>
@@ -2468,7 +2601,7 @@
       <w:r>
         <w:t xml:space="preserve"> </w:t>
       </w:r>
-      <w:hyperlink r:id="rId70">
+      <w:hyperlink r:id="rId72">
         <w:r>
           <w:rPr>
             <w:rStyle w:val="Hyperlink"/>
@@ -2477,8 +2610,8 @@
         </w:r>
       </w:hyperlink>
     </w:p>
-    <w:bookmarkEnd w:id="71"/>
-    <w:bookmarkStart w:id="73" w:name="ref-pekel2016"/>
+    <w:bookmarkEnd w:id="73"/>
+    <w:bookmarkStart w:id="75" w:name="ref-pekel2016"/>
     <w:p>
       <w:pPr>
         <w:pStyle w:val="Bibliography"/>
@@ -2524,7 +2657,7 @@
       <w:r>
         <w:t xml:space="preserve"> </w:t>
       </w:r>
-      <w:hyperlink r:id="rId72">
+      <w:hyperlink r:id="rId74">
         <w:r>
           <w:rPr>
             <w:rStyle w:val="Hyperlink"/>
@@ -2533,8 +2666,8 @@
         </w:r>
       </w:hyperlink>
     </w:p>
-    <w:bookmarkEnd w:id="73"/>
-    <w:bookmarkStart w:id="75" w:name="ref-ploton2020"/>
+    <w:bookmarkEnd w:id="75"/>
+    <w:bookmarkStart w:id="77" w:name="ref-ploton2020"/>
     <w:p>
       <w:pPr>
         <w:pStyle w:val="Bibliography"/>
@@ -2580,7 +2713,7 @@
       <w:r>
         <w:t xml:space="preserve"> </w:t>
       </w:r>
-      <w:hyperlink r:id="rId74">
+      <w:hyperlink r:id="rId76">
         <w:r>
           <w:rPr>
             <w:rStyle w:val="Hyperlink"/>
@@ -2589,8 +2722,8 @@
         </w:r>
       </w:hyperlink>
     </w:p>
-    <w:bookmarkEnd w:id="75"/>
-    <w:bookmarkStart w:id="77" w:name="ref-rahmanm2025"/>
+    <w:bookmarkEnd w:id="77"/>
+    <w:bookmarkStart w:id="79" w:name="ref-rahmanm2025"/>
     <w:p>
       <w:pPr>
         <w:pStyle w:val="Bibliography"/>
@@ -2636,7 +2769,7 @@
       <w:r>
         <w:t xml:space="preserve"> </w:t>
       </w:r>
-      <w:hyperlink r:id="rId76">
+      <w:hyperlink r:id="rId78">
         <w:r>
           <w:rPr>
             <w:rStyle w:val="Hyperlink"/>
@@ -2645,8 +2778,8 @@
         </w:r>
       </w:hyperlink>
     </w:p>
-    <w:bookmarkEnd w:id="77"/>
-    <w:bookmarkStart w:id="79" w:name="ref-roberts2017"/>
+    <w:bookmarkEnd w:id="79"/>
+    <w:bookmarkStart w:id="81" w:name="ref-roberts2017"/>
     <w:p>
       <w:pPr>
         <w:pStyle w:val="Bibliography"/>
@@ -2692,7 +2825,7 @@
       <w:r>
         <w:t xml:space="preserve"> </w:t>
       </w:r>
-      <w:hyperlink r:id="rId78">
+      <w:hyperlink r:id="rId80">
         <w:r>
           <w:rPr>
             <w:rStyle w:val="Hyperlink"/>
@@ -2701,8 +2834,8 @@
         </w:r>
       </w:hyperlink>
     </w:p>
-    <w:bookmarkEnd w:id="79"/>
-    <w:bookmarkStart w:id="81" w:name="ref-rudra2023"/>
+    <w:bookmarkEnd w:id="81"/>
+    <w:bookmarkStart w:id="83" w:name="ref-rudra2023"/>
     <w:p>
       <w:pPr>
         <w:pStyle w:val="Bibliography"/>
@@ -2748,7 +2881,7 @@
       <w:r>
         <w:t xml:space="preserve"> </w:t>
       </w:r>
-      <w:hyperlink r:id="rId80">
+      <w:hyperlink r:id="rId82">
         <w:r>
           <w:rPr>
             <w:rStyle w:val="Hyperlink"/>
@@ -2757,8 +2890,8 @@
         </w:r>
       </w:hyperlink>
     </w:p>
-    <w:bookmarkEnd w:id="81"/>
-    <w:bookmarkStart w:id="83" w:name="ref-schotten2023"/>
+    <w:bookmarkEnd w:id="83"/>
+    <w:bookmarkStart w:id="85" w:name="ref-schotten2023"/>
     <w:p>
       <w:pPr>
         <w:pStyle w:val="Bibliography"/>
@@ -2804,7 +2937,7 @@
       <w:r>
         <w:t xml:space="preserve"> </w:t>
       </w:r>
-      <w:hyperlink r:id="rId82">
+      <w:hyperlink r:id="rId84">
         <w:r>
           <w:rPr>
             <w:rStyle w:val="Hyperlink"/>
@@ -2813,8 +2946,8 @@
         </w:r>
       </w:hyperlink>
     </w:p>
-    <w:bookmarkEnd w:id="83"/>
-    <w:bookmarkStart w:id="85" w:name="ref-sherpa2022"/>
+    <w:bookmarkEnd w:id="85"/>
+    <w:bookmarkStart w:id="87" w:name="ref-sherpa2022"/>
     <w:p>
       <w:pPr>
         <w:pStyle w:val="Bibliography"/>
@@ -2860,7 +2993,7 @@
       <w:r>
         <w:t xml:space="preserve"> </w:t>
       </w:r>
-      <w:hyperlink r:id="rId84">
+      <w:hyperlink r:id="rId86">
         <w:r>
           <w:rPr>
             <w:rStyle w:val="Hyperlink"/>
@@ -2869,8 +3002,8 @@
         </w:r>
       </w:hyperlink>
     </w:p>
-    <w:bookmarkEnd w:id="85"/>
-    <w:bookmarkStart w:id="87" w:name="ref-talukdar2020"/>
+    <w:bookmarkEnd w:id="87"/>
+    <w:bookmarkStart w:id="89" w:name="ref-talukdar2020"/>
     <w:p>
       <w:pPr>
         <w:pStyle w:val="Bibliography"/>
@@ -2916,7 +3049,7 @@
       <w:r>
         <w:t xml:space="preserve"> </w:t>
       </w:r>
-      <w:hyperlink r:id="rId86">
+      <w:hyperlink r:id="rId88">
         <w:r>
           <w:rPr>
             <w:rStyle w:val="Hyperlink"/>
@@ -2925,8 +3058,8 @@
         </w:r>
       </w:hyperlink>
     </w:p>
-    <w:bookmarkEnd w:id="87"/>
-    <w:bookmarkStart w:id="89" w:name="ref-tellman2021"/>
+    <w:bookmarkEnd w:id="89"/>
+    <w:bookmarkStart w:id="91" w:name="ref-tellman2021"/>
     <w:p>
       <w:pPr>
         <w:pStyle w:val="Bibliography"/>
@@ -2972,7 +3105,7 @@
       <w:r>
         <w:t xml:space="preserve"> </w:t>
       </w:r>
-      <w:hyperlink r:id="rId88">
+      <w:hyperlink r:id="rId90">
         <w:r>
           <w:rPr>
             <w:rStyle w:val="Hyperlink"/>
@@ -2981,8 +3114,8 @@
         </w:r>
       </w:hyperlink>
     </w:p>
-    <w:bookmarkEnd w:id="89"/>
-    <w:bookmarkStart w:id="91" w:name="ref-twele2016"/>
+    <w:bookmarkEnd w:id="91"/>
+    <w:bookmarkStart w:id="93" w:name="ref-twele2016"/>
     <w:p>
       <w:pPr>
         <w:pStyle w:val="Bibliography"/>
@@ -3028,7 +3161,7 @@
       <w:r>
         <w:t xml:space="preserve"> </w:t>
       </w:r>
-      <w:hyperlink r:id="rId90">
+      <w:hyperlink r:id="rId92">
         <w:r>
           <w:rPr>
             <w:rStyle w:val="Hyperlink"/>
@@ -3037,8 +3170,8 @@
         </w:r>
       </w:hyperlink>
     </w:p>
-    <w:bookmarkEnd w:id="91"/>
-    <w:bookmarkStart w:id="93" w:name="ref-uddin2019"/>
+    <w:bookmarkEnd w:id="93"/>
+    <w:bookmarkStart w:id="95" w:name="ref-uddin2019"/>
     <w:p>
       <w:pPr>
         <w:pStyle w:val="Bibliography"/>
@@ -3084,7 +3217,7 @@
       <w:r>
         <w:t xml:space="preserve"> </w:t>
       </w:r>
-      <w:hyperlink r:id="rId92">
+      <w:hyperlink r:id="rId94">
         <w:r>
           <w:rPr>
             <w:rStyle w:val="Hyperlink"/>
@@ -3093,8 +3226,8 @@
         </w:r>
       </w:hyperlink>
     </w:p>
-    <w:bookmarkEnd w:id="93"/>
-    <w:bookmarkStart w:id="95" w:name="ref-unspider"/>
+    <w:bookmarkEnd w:id="95"/>
+    <w:bookmarkStart w:id="97" w:name="ref-unspider"/>
     <w:p>
       <w:pPr>
         <w:pStyle w:val="Bibliography"/>
@@ -3118,7 +3251,7 @@
       <w:r>
         <w:t xml:space="preserve"> </w:t>
       </w:r>
-      <w:hyperlink r:id="rId94">
+      <w:hyperlink r:id="rId96">
         <w:r>
           <w:rPr>
             <w:rStyle w:val="Hyperlink"/>
@@ -3130,8 +3263,8 @@
         <w:t xml:space="preserve">.</w:t>
       </w:r>
     </w:p>
-    <w:bookmarkEnd w:id="95"/>
-    <w:bookmarkStart w:id="97" w:name="ref-wadoux2021"/>
+    <w:bookmarkEnd w:id="97"/>
+    <w:bookmarkStart w:id="99" w:name="ref-wadoux2021"/>
     <w:p>
       <w:pPr>
         <w:pStyle w:val="Bibliography"/>
@@ -3177,7 +3310,7 @@
       <w:r>
         <w:t xml:space="preserve"> </w:t>
       </w:r>
-      <w:hyperlink r:id="rId96">
+      <w:hyperlink r:id="rId98">
         <w:r>
           <w:rPr>
             <w:rStyle w:val="Hyperlink"/>
@@ -3186,8 +3319,8 @@
         </w:r>
       </w:hyperlink>
     </w:p>
-    <w:bookmarkEnd w:id="97"/>
-    <w:bookmarkStart w:id="99" w:name="ref-waleed2025"/>
+    <w:bookmarkEnd w:id="99"/>
+    <w:bookmarkStart w:id="101" w:name="ref-waleed2025"/>
     <w:p>
       <w:pPr>
         <w:pStyle w:val="Bibliography"/>
@@ -3233,7 +3366,7 @@
       <w:r>
         <w:t xml:space="preserve"> </w:t>
       </w:r>
-      <w:hyperlink r:id="rId98">
+      <w:hyperlink r:id="rId100">
         <w:r>
           <w:rPr>
             <w:rStyle w:val="Hyperlink"/>
@@ -3242,8 +3375,8 @@
         </w:r>
       </w:hyperlink>
     </w:p>
-    <w:bookmarkEnd w:id="99"/>
-    <w:bookmarkStart w:id="101" w:name="ref-wang2023"/>
+    <w:bookmarkEnd w:id="101"/>
+    <w:bookmarkStart w:id="103" w:name="ref-wang2023"/>
     <w:p>
       <w:pPr>
         <w:pStyle w:val="Bibliography"/>
@@ -3289,7 +3422,7 @@
       <w:r>
         <w:t xml:space="preserve"> </w:t>
       </w:r>
-      <w:hyperlink r:id="rId100">
+      <w:hyperlink r:id="rId102">
         <w:r>
           <w:rPr>
             <w:rStyle w:val="Hyperlink"/>
@@ -3298,8 +3431,8 @@
         </w:r>
       </w:hyperlink>
     </w:p>
-    <w:bookmarkEnd w:id="101"/>
-    <w:bookmarkStart w:id="103" w:name="ref-williams2025"/>
+    <w:bookmarkEnd w:id="103"/>
+    <w:bookmarkStart w:id="105" w:name="ref-williams2025"/>
     <w:p>
       <w:pPr>
         <w:pStyle w:val="Bibliography"/>
@@ -3345,7 +3478,7 @@
       <w:r>
         <w:t xml:space="preserve"> </w:t>
       </w:r>
-      <w:hyperlink r:id="rId102">
+      <w:hyperlink r:id="rId104">
         <w:r>
           <w:rPr>
             <w:rStyle w:val="Hyperlink"/>
@@ -3354,8 +3487,8 @@
         </w:r>
       </w:hyperlink>
     </w:p>
-    <w:bookmarkEnd w:id="103"/>
-    <w:bookmarkStart w:id="105" w:name="ref-zadrozny2002"/>
+    <w:bookmarkEnd w:id="105"/>
+    <w:bookmarkStart w:id="107" w:name="ref-zadrozny2002"/>
     <w:p>
       <w:pPr>
         <w:pStyle w:val="Bibliography"/>
@@ -3388,7 +3521,7 @@
       <w:r>
         <w:t xml:space="preserve"> </w:t>
       </w:r>
-      <w:hyperlink r:id="rId104">
+      <w:hyperlink r:id="rId106">
         <w:r>
           <w:rPr>
             <w:rStyle w:val="Hyperlink"/>
@@ -3397,8 +3530,8 @@
         </w:r>
       </w:hyperlink>
     </w:p>
-    <w:bookmarkEnd w:id="105"/>
-    <w:bookmarkStart w:id="107" w:name="ref-zzaman2021"/>
+    <w:bookmarkEnd w:id="107"/>
+    <w:bookmarkStart w:id="109" w:name="ref-zzaman2021"/>
     <w:p>
       <w:pPr>
         <w:pStyle w:val="Bibliography"/>
@@ -3444,7 +3577,7 @@
       <w:r>
         <w:t xml:space="preserve"> </w:t>
       </w:r>
-      <w:hyperlink r:id="rId106">
+      <w:hyperlink r:id="rId108">
         <w:r>
           <w:rPr>
             <w:rStyle w:val="Hyperlink"/>
@@ -3453,10 +3586,10 @@
         </w:r>
       </w:hyperlink>
     </w:p>
-    <w:bookmarkEnd w:id="107"/>
-    <w:bookmarkEnd w:id="108"/>
     <w:bookmarkEnd w:id="109"/>
-    <w:bookmarkStart w:id="117" w:name="tables"/>
+    <w:bookmarkEnd w:id="110"/>
+    <w:bookmarkEnd w:id="111"/>
+    <w:bookmarkStart w:id="119" w:name="tables"/>
     <w:p>
       <w:pPr>
         <w:pStyle w:val="Heading1"/>
@@ -3465,7 +3598,7 @@
         <w:t xml:space="preserve">Tables</w:t>
       </w:r>
     </w:p>
-    <w:bookmarkStart w:id="110" w:name="tab:litflood"/>
+    <w:bookmarkStart w:id="112" w:name="tab:litflood"/>
     <w:p>
       <w:pPr>
         <w:pStyle w:val="TableCaption"/>
@@ -4064,8 +4197,8 @@
         </w:tc>
       </w:tr>
     </w:tbl>
-    <w:bookmarkEnd w:id="110"/>
-    <w:bookmarkStart w:id="111" w:name="tab:regions"/>
+    <w:bookmarkEnd w:id="112"/>
+    <w:bookmarkStart w:id="113" w:name="tab:regions"/>
     <w:p>
       <w:pPr>
         <w:pStyle w:val="TableCaption"/>
@@ -4300,8 +4433,8 @@
         </w:tc>
       </w:tr>
     </w:tbl>
-    <w:bookmarkEnd w:id="111"/>
-    <w:bookmarkStart w:id="112" w:name="tab:data"/>
+    <w:bookmarkEnd w:id="113"/>
+    <w:bookmarkStart w:id="114" w:name="tab:data"/>
     <w:p>
       <w:pPr>
         <w:pStyle w:val="TableCaption"/>
@@ -4677,8 +4810,8 @@
         </w:tc>
       </w:tr>
     </w:tbl>
-    <w:bookmarkEnd w:id="112"/>
-    <w:bookmarkStart w:id="113" w:name="tab:events"/>
+    <w:bookmarkEnd w:id="114"/>
+    <w:bookmarkStart w:id="115" w:name="tab:events"/>
     <w:p>
       <w:pPr>
         <w:pStyle w:val="TableCaption"/>
@@ -5195,8 +5328,8 @@
         </w:tc>
       </w:tr>
     </w:tbl>
-    <w:bookmarkEnd w:id="113"/>
-    <w:bookmarkStart w:id="114" w:name="tab:validation"/>
+    <w:bookmarkEnd w:id="115"/>
+    <w:bookmarkStart w:id="116" w:name="tab:validation"/>
     <w:p>
       <w:pPr>
         <w:pStyle w:val="TableCaption"/>
@@ -5569,8 +5702,8 @@
         </w:tc>
       </w:tr>
     </w:tbl>
-    <w:bookmarkEnd w:id="114"/>
-    <w:bookmarkStart w:id="115" w:name="tab:temporal"/>
+    <w:bookmarkEnd w:id="116"/>
+    <w:bookmarkStart w:id="117" w:name="tab:temporal"/>
     <w:p>
       <w:pPr>
         <w:pStyle w:val="TableCaption"/>
@@ -6015,8 +6148,8 @@
         </w:tc>
       </w:tr>
     </w:tbl>
-    <w:bookmarkEnd w:id="115"/>
-    <w:bookmarkStart w:id="116" w:name="tab:benchmark"/>
+    <w:bookmarkEnd w:id="117"/>
+    <w:bookmarkStart w:id="118" w:name="tab:benchmark"/>
     <w:p>
       <w:pPr>
         <w:pStyle w:val="TableCaption"/>
@@ -6664,9 +6797,9 @@
         </w:tc>
       </w:tr>
     </w:tbl>
-    <w:bookmarkEnd w:id="116"/>
-    <w:bookmarkEnd w:id="117"/>
-    <w:bookmarkStart w:id="118" w:name="figure-legends"/>
+    <w:bookmarkEnd w:id="118"/>
+    <w:bookmarkEnd w:id="119"/>
+    <w:bookmarkStart w:id="120" w:name="figure-legends"/>
     <w:p>
       <w:pPr>
         <w:pStyle w:val="Heading1"/>
@@ -6815,7 +6948,7 @@
         <w:t xml:space="preserve">Loss in AUC on the held-out test blocks when each feature is shuffled across the test assets, as mean and standard deviation over 20 block assignments, for the default gradient-boosted model. The AUC in each title is the mean before shuffling.</w:t>
       </w:r>
     </w:p>
-    <w:bookmarkEnd w:id="118"/>
+    <w:bookmarkEnd w:id="120"/>
     <w:sectPr>
       <w:footnotePr>
         <w:numRestart w:val="eachSect"/>

</xml_diff>

<commit_message>
Flood paper: reframed around the robust riverine result
The record question now leads the introduction, abstract and discussion; the
abstract and conclusions state the firm Rangpur-Rajshahi result and treat
Sylhet (target-dependent) and the coast (open) as cases where the answer
depends on whether floods return to the same ground. Robustness checks are
gathered in one paragraph pointing to Table S1, inline p-values trimmed,
graph network and Kriging discussion halved, single flood year named in the
limits. 5,973 -> 5,704 words.
</commit_message>
<xml_diff>
--- a/docs/paper/submission/manuscript.docx
+++ b/docs/paper/submission/manuscript.docx
@@ -26,7 +26,7 @@
         <w:pStyle w:val="FirstParagraph"/>
       </w:pPr>
       <w:r>
-        <w:t xml:space="preserve">Flood susceptibility maps are judged by how well they rank the ground that floods, yet they are rarely compared with the simplest alternative, the record of where floods have already been. This study makes that comparison for infrastructure mapped in OpenStreetMap in three regions of Bangladesh, using flood extents mapped from Sentinel-1 radar for thirteen events as labels and reference, and scoring every model on 10 km blocks held out from training over 20 block assignments. Trained on floods up to 2022, a gradient-boosted model ranked the ground the 2024 floods reached at an AUC of 0.801 in Rangpur and Rajshahi and 0.797 in Sylhet, below the record of earlier flooding at 0.896 and 0.851, although in Sylhet the gap closed when the model learned the same target as the test. Given that record as a feature, the model beat both in Rangpur and Rajshahi, at 0.924, because terrain still ranks the ground no earlier flood reached, while in Sylhet it matched the record at 0.849. On the south-west coast, where most assets flooded by the 2024 cyclone stood on ground that had not flooded before, the model beat the record, at 0.807 against 0.668, although that lead fell within noise with wider blocks. Training on radar-observed extents rather than terrain-threshold labels raised the AUC by 0.101, 0.087 and 0.080 on held-out areas and by 0.069, 0.024 and 0.071 on the 2024 floods, the Sylhet gain within noise. A graph neural network linking neighbouring assets added nothing over tabular models, and elevation carried almost all of the terrain signal. The radar masks agreed only moderately with an independent MODIS flood map, so the scores measure agreement with flooding as radar sees it. Susceptibility studies with a radar flood history should report that record as a baseline.</w:t>
+        <w:t xml:space="preserve">Flood susceptibility maps are judged by how well they rank the ground that floods, yet they are rarely compared with the simplest alternative, the record of where floods have already been. This study makes that comparison for infrastructure mapped in OpenStreetMap in three regions of Bangladesh, with flood extents mapped from Sentinel-1 radar for thirteen events as labels and reference and every model scored on 10 km blocks held out from training. Trained on floods up to 2022, a gradient-boosted model ranked the ground the 2024 river floods reached in Rangpur and Rajshahi at an AUC of 0.801, below the record of earlier flooding at 0.896, and the record kept its lead with masks re-mapped from a single satellite, with two other training targets and with 40 km blocks. Given the record as a feature, the model beat both, at 0.924, by ranking the ground no earlier flood had reached. In the Sylhet haor the record’s lead, 0.851 against 0.797, closed when the model learned the same target as the test, and on the cyclone-struck coast, where most flooded assets stood on ground no earlier cyclone had reached, the model’s lead did not survive wider blocks. The record was therefore the stronger guide where floods returned to the same ground. Radar-observed extents also made better training labels than terrain thresholds, by 0.101, 0.087 and 0.080 in AUC on held-out areas, a graph neural network added nothing over tabular models, and elevation carried almost all of the terrain signal. The radar masks agreed only moderately with an independent MODIS map, so every score measures agreement with flooding as radar sees it. Susceptibility studies with a radar flood history should report that record as a baseline.</w:t>
       </w:r>
     </w:p>
     <w:p>
@@ -135,7 +135,7 @@
         <w:pStyle w:val="BodyText"/>
       </w:pPr>
       <w:r>
-        <w:t xml:space="preserve">This study asks three questions of flood susceptibility models for mapped infrastructure in three regions with contrasting regimes, riverine flooding in Rangpur and Rajshahi, flash flooding in the Sylhet haor basin and cyclone surge on the south-west coast. The first, and the most consequential for how published maps should be read, is whether radar-observed flood extents make better training labels than terrain thresholds for ground a model has not seen. The second is whether a model anticipates a later flood better than the record of earlier ones, and the third is whether a graph neural network outperforms ordinary tabular models given the same features and blocks. The flood hazard is then combined with exposure and vulnerability on a 500 m grid, and the maps, data and code are released openly.</w:t>
+        <w:t xml:space="preserve">This study asks three questions of flood susceptibility models for mapped infrastructure in three regions with contrasting regimes, riverine flooding in Rangpur and Rajshahi, flash flooding in the Sylhet haor basin and cyclone surge on the south-west coast. The first, and the most consequential for how published maps should be read, is whether a model anticipates a later flood better than the record of earlier ones. The second is whether radar-observed flood extents make better training labels than terrain thresholds for ground a model has not seen, and the third, more briefly, is whether a graph neural network outperforms ordinary tabular models given the same features and blocks. The flood hazard is then combined with exposure and vulnerability on a 500 m grid, and the maps, data and code are released openly.</w:t>
       </w:r>
     </w:p>
     <w:bookmarkEnd w:id="11"/>
@@ -1102,41 +1102,23 @@
         <w:pStyle w:val="BodyText"/>
       </w:pPr>
       <w:r>
-        <w:t xml:space="preserve">Trained only on earlier floods, the model ranks the 2024 flooding at 0.801 in Rangpur and Rajshahi, 0.797 in Sylhet and 0.807 on the coast, losing nothing measurable by leaving out 2024 in Rangpur and Rajshahi (</w:t>
-      </w:r>
-      <m:oMath>
-        <m:r>
-          <m:t>p</m:t>
-        </m:r>
-        <m:r>
-          <m:rPr>
-            <m:sty m:val="p"/>
-          </m:rPr>
-          <m:t>=</m:t>
-        </m:r>
-        <m:r>
-          <m:t>0.281</m:t>
-        </m:r>
-      </m:oMath>
-      <w:r>
-        <w:t xml:space="preserve">) or on the coast, where it lost 0.028 (</w:t>
-      </w:r>
-      <m:oMath>
-        <m:r>
-          <m:t>p</m:t>
-        </m:r>
-        <m:r>
-          <m:rPr>
-            <m:sty m:val="p"/>
-          </m:rPr>
-          <m:t>=</m:t>
-        </m:r>
-        <m:r>
-          <m:t>0.052</m:t>
-        </m:r>
-      </m:oMath>
-      <w:r>
-        <w:t xml:space="preserve">), and 0.053 in Sylhet (</w:t>
+        <w:t xml:space="preserve">Trained only on earlier floods, the model ranks the 2024 flooding at 0.801 in Rangpur and Rajshahi, 0.797 in Sylhet and 0.807 on the coast. In both riverine regions the record of earlier flooding ranks it better, at 0.896 and 0.851, with the model ahead on only 2 and 4 of 20 assignments, whereas on the coast the model leads, at 0.807 against 0.668. The regions differ in how often floods return to the same ground, since only 16.9 % and 22.3 % of the assets flooded in 2024 stood on ground no earlier event had reached, against 65.5 % on the coast, where each surge floods the stretch of coast where it lands. The 2024 floods in Rangpur and Rajshahi were also small, covering 4.9–8.3 % of the region against 19.9–24.8 % for each earlier flood, whereas in Sylhet they were as large as earlier ones.</w:t>
+      </w:r>
+    </w:p>
+    <w:p>
+      <w:pPr>
+        <w:pStyle w:val="BodyText"/>
+      </w:pPr>
+      <w:r>
+        <w:t xml:space="preserve">Seven checks test whether the comparison favours one side (Supporting Information, Section S5, Table S1), and in Rangpur and Rajshahi the record keeps its lead under all of them, if narrowly under two. Sentinel-1B failed in December 2021, so the earlier events were seen by two satellites and the 2024 ones by one, and since each mask takes the lowest backscatter in its window, more scenes can map more flooding. Re-mapped from Sentinel-1A alone, the earlier events shrank by up to 15.7 % and the record still led by 0.097. The published model learns a yes-or-no label from the earlier events while the record keeps their fraction, and retrained on flooding in any earlier event, which is how the 2024 floods are counted, or on the fraction itself, the model fell further behind, by 0.133 and 0.131. With 40 km blocks the lead grew to 0.126, and setting aside the ground that radar could mistake for water every monsoon, such as wet paddy, narrowed it to within noise without reversing it. In Sylhet the record’s lead closed, to 0.017 and 0.016, when the model learned the same target as the test, and outside the haor’s seasonal water the two were level, so the Sylhet result rests on the choice of target. On the coast the model’s lead fell within noise with 20 and 40 km blocks.</w:t>
+      </w:r>
+    </w:p>
+    <w:p>
+      <w:pPr>
+        <w:pStyle w:val="BodyText"/>
+      </w:pPr>
+      <w:r>
+        <w:t xml:space="preserve">The record can also enter the model as a feature, provided it comes from floods before the ones the model learns to predict, or the model would copy its own labels. The model is therefore trained to predict the last event year up to 2022 from its usual features and the share of the earlier events in which the ground flooded, and scored against the 2024 floods with that share taken over every event to 2022. In Rangpur and Rajshahi the combination beats both of its parts, at 0.924 against 0.896 for the record alone (</w:t>
       </w:r>
       <m:oMath>
         <m:r>
@@ -1153,144 +1135,6 @@
         </m:r>
       </m:oMath>
       <w:r>
-        <w:t xml:space="preserve">). In both riverine regions the record of earlier flooding ranks the 2024 flooding better, at 0.896 and 0.851, with the model ahead on only 2 and 4 of 20 assignments, whereas on the coast the model leads, at 0.807 against 0.668, a lead that does not survive wider blocks (Section 5.5). Riverine flooding returns to much the same ground, and only 16.9 % and 22.3 % of the assets flooded in 2024 stood on ground no earlier event had reached, against 65.5 % on the coast, where each surge floods the stretch of coast where it lands. The 2024 floods in Rangpur and Rajshahi were also small, covering 4.9–8.3 % of the region against 19.9–24.8 % for each earlier flood, whereas in Sylhet they were as large as earlier ones (20.4–31.2 % against 13.3–34.1 %).</w:t>
-      </w:r>
-    </w:p>
-    <w:p>
-      <w:pPr>
-        <w:pStyle w:val="BodyText"/>
-      </w:pPr>
-      <w:r>
-        <w:t xml:space="preserve">The record and the 2024 floods come from the same change detection, so ground that radar mistakes for water every monsoon, such as wet paddy, would favour the record. Without the ground flagged in every earlier event, and again without ground the JRC record has ever seen under water, the record’s lead in Rangpur and Rajshahi narrowed to 0.063 and 0.071, within noise (</w:t>
-      </w:r>
-      <m:oMath>
-        <m:r>
-          <m:t>p</m:t>
-        </m:r>
-        <m:r>
-          <m:rPr>
-            <m:sty m:val="p"/>
-          </m:rPr>
-          <m:t>=</m:t>
-        </m:r>
-        <m:r>
-          <m:t>0.130</m:t>
-        </m:r>
-      </m:oMath>
-      <w:r>
-        <w:t xml:space="preserve"> </w:t>
-      </w:r>
-      <w:r>
-        <w:t xml:space="preserve">and</w:t>
-      </w:r>
-      <w:r>
-        <w:t xml:space="preserve"> </w:t>
-      </w:r>
-      <m:oMath>
-        <m:r>
-          <m:t>p</m:t>
-        </m:r>
-        <m:r>
-          <m:rPr>
-            <m:sty m:val="p"/>
-          </m:rPr>
-          <m:t>=</m:t>
-        </m:r>
-        <m:r>
-          <m:t>0.146</m:t>
-        </m:r>
-      </m:oMath>
-      <w:r>
-        <w:t xml:space="preserve">) but not reversed, whereas in Sylhet outside recorded water the model and the record were level, at 0.799 and 0.794 (Supporting Information, Section S5). On the coast the model’s lead held.</w:t>
-      </w:r>
-    </w:p>
-    <w:p>
-      <w:pPr>
-        <w:pStyle w:val="BodyText"/>
-      </w:pPr>
-      <w:r>
-        <w:t xml:space="preserve">Sentinel-1B failed in December 2021, so the earlier events were seen by two satellites and the 2024 ones by one, and since each mask takes the lowest backscatter in its window, more scenes can map more flooding. Re-mapped from Sentinel-1A alone, the earlier Rangpur and Rajshahi events shrank by up to 15.7 %, yet the record still led by 0.097 (</w:t>
-      </w:r>
-      <m:oMath>
-        <m:r>
-          <m:t>p</m:t>
-        </m:r>
-        <m:r>
-          <m:rPr>
-            <m:sty m:val="p"/>
-          </m:rPr>
-          <m:t>=</m:t>
-        </m:r>
-        <m:r>
-          <m:t>0.005</m:t>
-        </m:r>
-      </m:oMath>
-      <w:r>
-        <w:t xml:space="preserve">), and in Sylhet Sentinel-1B had added no scenes. The model also learns a yes-or-no label from the earlier events while the record keeps their fraction, so it was retrained on flooding in any earlier event, which is how the 2024 floods are counted, and on the fraction itself. In Rangpur and Rajshahi the record’s lead grew, to 0.133 and 0.131, whereas in Sylhet it fell to 0.017 and 0.016 (</w:t>
-      </w:r>
-      <m:oMath>
-        <m:r>
-          <m:t>p</m:t>
-        </m:r>
-        <m:r>
-          <m:rPr>
-            <m:sty m:val="p"/>
-          </m:rPr>
-          <m:t>=</m:t>
-        </m:r>
-        <m:r>
-          <m:t>0.441</m:t>
-        </m:r>
-      </m:oMath>
-      <w:r>
-        <w:t xml:space="preserve"> </w:t>
-      </w:r>
-      <w:r>
-        <w:t xml:space="preserve">and</w:t>
-      </w:r>
-      <w:r>
-        <w:t xml:space="preserve"> </w:t>
-      </w:r>
-      <m:oMath>
-        <m:r>
-          <m:t>p</m:t>
-        </m:r>
-        <m:r>
-          <m:rPr>
-            <m:sty m:val="p"/>
-          </m:rPr>
-          <m:t>=</m:t>
-        </m:r>
-        <m:r>
-          <m:t>0.401</m:t>
-        </m:r>
-      </m:oMath>
-      <w:r>
-        <w:t xml:space="preserve">), so the Sylhet result rests on the choice of training target.</w:t>
-      </w:r>
-    </w:p>
-    <w:p>
-      <w:pPr>
-        <w:pStyle w:val="BodyText"/>
-      </w:pPr>
-      <w:r>
-        <w:t xml:space="preserve">The record can also enter the model as a feature, provided it comes from floods before the ones the model learns to predict, or the model would copy its own labels. The model is therefore trained to predict the last event year up to 2022 from its usual features and the share of the earlier events in which the ground flooded, and scored against the 2024 floods with that share taken over every event to 2022. In Rangpur and Rajshahi the combination beats both of its parts, at 0.924 against 0.896 for the record alone (</w:t>
-      </w:r>
-      <m:oMath>
-        <m:r>
-          <m:t>p</m:t>
-        </m:r>
-        <m:r>
-          <m:rPr>
-            <m:sty m:val="p"/>
-          </m:rPr>
-          <m:t>=</m:t>
-        </m:r>
-        <m:r>
-          <m:t>0.020</m:t>
-        </m:r>
-      </m:oMath>
-      <w:r>
         <w:t xml:space="preserve">) and 0.790 for the model without the feature. Its gain comes on the ground no earlier flood reached, 87.7 % of the test assets, where the record gives every asset a score of zero and the combined model still ranks the 2024 flooding at 0.729. In Sylhet the combination, at 0.849, cannot be told apart from either the model without the feature at 0.837 (</w:t>
       </w:r>
       <m:oMath>
@@ -1350,67 +1194,7 @@
         <w:pStyle w:val="BodyText"/>
       </w:pPr>
       <w:r>
-        <w:t xml:space="preserve">The 2024 floods also give the label comparison a test that favours neither label source. The observed labels still lead, at 0.801 against 0.732 in Rangpur and Rajshahi, 0.797 against 0.773 in Sylhet and 0.807 against 0.736 on the coast, ahead on 18, 15 and 18 of 20 assignments (</w:t>
-      </w:r>
-      <m:oMath>
-        <m:r>
-          <m:t>p</m:t>
-        </m:r>
-        <m:r>
-          <m:rPr>
-            <m:sty m:val="p"/>
-          </m:rPr>
-          <m:t>=</m:t>
-        </m:r>
-        <m:r>
-          <m:t>0.013</m:t>
-        </m:r>
-      </m:oMath>
-      <w:r>
-        <w:t xml:space="preserve">,</w:t>
-      </w:r>
-      <w:r>
-        <w:t xml:space="preserve"> </w:t>
-      </w:r>
-      <m:oMath>
-        <m:r>
-          <m:t>p</m:t>
-        </m:r>
-        <m:r>
-          <m:rPr>
-            <m:sty m:val="p"/>
-          </m:rPr>
-          <m:t>=</m:t>
-        </m:r>
-        <m:r>
-          <m:t>0.333</m:t>
-        </m:r>
-      </m:oMath>
-      <w:r>
-        <w:t xml:space="preserve"> </w:t>
-      </w:r>
-      <w:r>
-        <w:t xml:space="preserve">and</w:t>
-      </w:r>
-      <w:r>
-        <w:t xml:space="preserve"> </w:t>
-      </w:r>
-      <m:oMath>
-        <m:r>
-          <m:t>p</m:t>
-        </m:r>
-        <m:r>
-          <m:rPr>
-            <m:sty m:val="p"/>
-          </m:rPr>
-          <m:t>=</m:t>
-        </m:r>
-        <m:r>
-          <m:t>0.004</m:t>
-        </m:r>
-      </m:oMath>
-      <w:r>
-        <w:t xml:space="preserve">). The coastal gap of 0.071 stays close to its spatial 0.080, while the riverine gaps shrink, from 0.101 to 0.069 in Rangpur and Rajshahi and from 0.087 to 0.024 in Sylhet, where the remaining gap cannot be told apart from noise. Much of the Sylhet advantage in the spatial test therefore came from the shared definition rather than from the labels themselves.</w:t>
+        <w:t xml:space="preserve">The 2024 floods also give the label comparison a test that favours neither label source. The observed labels still lead, at 0.801 against 0.732 in Rangpur and Rajshahi, 0.797 against 0.773 in Sylhet and 0.807 against 0.736 on the coast, ahead on 18, 15 and 18 of 20 assignments. The coastal gap of 0.071 stays close to its spatial 0.080, while the riverine gaps shrink, from 0.101 to 0.069 in Rangpur and Rajshahi and from 0.087 to 0.024 in Sylhet, where the remaining gap cannot be told apart from noise. Much of the Sylhet advantage in the spatial test therefore came from the shared definition rather than from the labels themselves.</w:t>
       </w:r>
     </w:p>
     <w:bookmarkEnd w:id="28"/>
@@ -1437,87 +1221,7 @@
         <w:pStyle w:val="FirstParagraph"/>
       </w:pPr>
       <w:r>
-        <w:t xml:space="preserve">Wider blocks lower the held-out AUC of the default model only a little in the riverine regions, from 0.817 at 10 km to 0.791 at 40 km in Rangpur and Rajshahi and from 0.857 to 0.836 in Sylhet, and more on the coast, from 0.839 to 0.774, so the 10 km figures carry a small optimism, largest on the coast. The riverine finding grows rather than shrinks, with the record of earlier flooding leading the model at 40 km by 0.126 in Rangpur and Rajshahi and 0.073 in Sylhet (</w:t>
-      </w:r>
-      <m:oMath>
-        <m:r>
-          <m:t>p</m:t>
-        </m:r>
-        <m:r>
-          <m:rPr>
-            <m:sty m:val="p"/>
-          </m:rPr>
-          <m:t>=</m:t>
-        </m:r>
-        <m:r>
-          <m:t>0.004</m:t>
-        </m:r>
-      </m:oMath>
-      <w:r>
-        <w:t xml:space="preserve"> </w:t>
-      </w:r>
-      <w:r>
-        <w:t xml:space="preserve">and</w:t>
-      </w:r>
-      <w:r>
-        <w:t xml:space="preserve"> </w:t>
-      </w:r>
-      <m:oMath>
-        <m:r>
-          <m:t>p</m:t>
-        </m:r>
-        <m:r>
-          <m:rPr>
-            <m:sty m:val="p"/>
-          </m:rPr>
-          <m:t>=</m:t>
-        </m:r>
-        <m:r>
-          <m:t>0.017</m:t>
-        </m:r>
-      </m:oMath>
-      <w:r>
-        <w:t xml:space="preserve">), against 0.094 and 0.054 at 10 km (over 15 usable assignments in Sylhet). The coastal finding does not survive, since the model’s lead over the record falls from 0.138 to 0.079 at 20 km and 0.053 at 40 km, where it can no longer be told apart from noise (</w:t>
-      </w:r>
-      <m:oMath>
-        <m:r>
-          <m:t>p</m:t>
-        </m:r>
-        <m:r>
-          <m:rPr>
-            <m:sty m:val="p"/>
-          </m:rPr>
-          <m:t>=</m:t>
-        </m:r>
-        <m:r>
-          <m:t>0.182</m:t>
-        </m:r>
-      </m:oMath>
-      <w:r>
-        <w:t xml:space="preserve"> </w:t>
-      </w:r>
-      <w:r>
-        <w:t xml:space="preserve">and</w:t>
-      </w:r>
-      <w:r>
-        <w:t xml:space="preserve"> </w:t>
-      </w:r>
-      <m:oMath>
-        <m:r>
-          <m:t>p</m:t>
-        </m:r>
-        <m:r>
-          <m:rPr>
-            <m:sty m:val="p"/>
-          </m:rPr>
-          <m:t>=</m:t>
-        </m:r>
-        <m:r>
-          <m:t>0.423</m:t>
-        </m:r>
-      </m:oMath>
-      <w:r>
-        <w:t xml:space="preserve">).</w:t>
+        <w:t xml:space="preserve">Wider blocks lower the held-out AUC of the default model only a little in the riverine regions, from 0.817 at 10 km to 0.791 at 40 km in Rangpur and Rajshahi and from 0.857 to 0.836 in Sylhet, and more on the coast, from 0.839 to 0.774, so the 10 km figures carry a small optimism, largest on the coast. The comparison with the flood record under wider blocks is reported in Section 5.4.</w:t>
       </w:r>
     </w:p>
     <w:bookmarkEnd w:id="29"/>
@@ -1544,7 +1248,7 @@
         <w:pStyle w:val="FirstParagraph"/>
       </w:pPr>
       <w:r>
-        <w:t xml:space="preserve">A graph neural network, the design this system began with, is set against logistic regression, a random forest and gradient boosting on the same features, assets and blocks, with the wetness index alone as a model-free reference, over 20 assignments (Table 7, Fig. 6). The graph network trails the best ordinary model in every region but measurably only in Rangpur and Rajshahi, by 0.028 in AUC (</w:t>
+        <w:t xml:space="preserve">A graph neural network, the design this system began with, is set against logistic regression, a random forest and gradient boosting on the same features, assets and blocks, with the wetness index alone as a model-free reference, over 20 assignments (Table 7, Fig. 6). Gradient boosting scores best in every region, and the graph network trails it measurably only in Rangpur and Rajshahi, by 0.028 in AUC (</w:t>
       </w:r>
       <m:oMath>
         <m:r>
@@ -1561,41 +1265,7 @@
         </m:r>
       </m:oMath>
       <w:r>
-        <w:t xml:space="preserve">, ahead on 2 of 20 assignments), while its gaps of 0.022 on the coast (</w:t>
-      </w:r>
-      <m:oMath>
-        <m:r>
-          <m:t>p</m:t>
-        </m:r>
-        <m:r>
-          <m:rPr>
-            <m:sty m:val="p"/>
-          </m:rPr>
-          <m:t>=</m:t>
-        </m:r>
-        <m:r>
-          <m:t>0.243</m:t>
-        </m:r>
-      </m:oMath>
-      <w:r>
-        <w:t xml:space="preserve">, ahead on 6) and 0.003 in Sylhet (</w:t>
-      </w:r>
-      <m:oMath>
-        <m:r>
-          <m:t>p</m:t>
-        </m:r>
-        <m:r>
-          <m:rPr>
-            <m:sty m:val="p"/>
-          </m:rPr>
-          <m:t>=</m:t>
-        </m:r>
-        <m:r>
-          <m:t>0.832</m:t>
-        </m:r>
-      </m:oMath>
-      <w:r>
-        <w:t xml:space="preserve">, ahead on 7) are within noise. Gradient boosting scores best in every region, although in Sylhet logistic regression, the graph network and the random forest all come within 0.012 of it. The wetness index alone ranks close to chance, at 0.517, 0.535 and 0.577. Gradient boosting is therefore the default for every region, since choosing a model per region would fit the model to the split. Its AUC varies by 0.042 to 0.046 from one assignment to the next, so each single-assignment figure, including those in Table 5, is one draw from a distribution of that width.</w:t>
+        <w:t xml:space="preserve">), while the wetness index alone ranks close to chance, at 0.517, 0.535 and 0.577. Gradient boosting is therefore the default for every region, since choosing a model per region would fit the model to the split. Its AUC varies by 0.042 to 0.046 from one assignment to the next, so each single-assignment figure, including those in Table 5, is one draw from a distribution of that width.</w:t>
       </w:r>
     </w:p>
     <w:bookmarkEnd w:id="30"/>
@@ -1645,7 +1315,7 @@
         <w:t xml:space="preserve">Discussion</w:t>
       </w:r>
     </w:p>
-    <w:bookmarkStart w:id="33" w:name="Xb4a8fee8a51e2cac850759879c84117ad532b59"/>
+    <w:bookmarkStart w:id="33" w:name="what-the-flood-record-already-knows"/>
     <w:p>
       <w:pPr>
         <w:pStyle w:val="Heading2"/>
@@ -1660,6 +1330,33 @@
         <w:tab/>
       </w:r>
       <w:r>
+        <w:t xml:space="preserve">What the flood record already knows</w:t>
+      </w:r>
+    </w:p>
+    <w:p>
+      <w:pPr>
+        <w:pStyle w:val="FirstParagraph"/>
+      </w:pPr>
+      <w:r>
+        <w:t xml:space="preserve">Susceptibility studies rarely ask whether a model anticipates a later flood better than the record of earlier ones, and here the answer followed how often floods returned to the same ground. In Rangpur and Rajshahi, where most of the ground the 2024 floods reached had flooded before, the record led under every check applied. The model added to it only when given the record as a feature, gaining on ground no earlier flood had reached, where the record cannot rank at all. In the Sylhet haor the record’s lead depended on what the model was trained to predict and lay on the margins of the seasonal water. On the coast, where most of the ground Cyclone Remal flooded had not flooded in the earlier cyclones, the model’s lead did not survive wider blocks. Three regions cannot establish that pattern, but they show that the comparison has to be made region by region rather than assumed. The record marks where water returns and the terrain ranks where it has not yet been seen, so a susceptibility map for a river basin with a radar flood history should at least report the record beside it, and where the record is informative the two can be combined. A study that reports accuracy without that reference cannot show that its model knows more than the flood record already does, and the comparison is simple to make wherever Sentinel-1 has observed earlier floods.</w:t>
+      </w:r>
+    </w:p>
+    <w:bookmarkEnd w:id="33"/>
+    <w:bookmarkStart w:id="34" w:name="Xb4a8fee8a51e2cac850759879c84117ad532b59"/>
+    <w:p>
+      <w:pPr>
+        <w:pStyle w:val="Heading2"/>
+      </w:pPr>
+      <w:r>
+        <w:rPr>
+          <w:rStyle w:val="SectionNumber"/>
+        </w:rPr>
+        <w:t xml:space="preserve">6.2</w:t>
+      </w:r>
+      <w:r>
+        <w:tab/>
+      </w:r>
+      <w:r>
         <w:t xml:space="preserve">Labels decide what an accuracy figure means</w:t>
       </w:r>
     </w:p>
@@ -1668,7 +1365,7 @@
         <w:pStyle w:val="FirstParagraph"/>
       </w:pPr>
       <w:r>
-        <w:t xml:space="preserve">The label source bears most directly on published flood maps. Terrain-threshold labels cost the model 0.101, 0.087 and 0.080 in AUC on held-out blocks. Against later floods that neither label source had seen they still cost 0.069, 0.024 and 0.071, so in Rangpur and Rajshahi and on the coast the advantage of radar labels does not depend on the test sharing their definition, while in Sylhet most of it did. The indices those labels are built on, TWI and HAND, add almost nothing to the model once elevation is known, and a model scored against labels derived from its own inputs measures its recovery of the labelling rule rather than its skill at locating floods. The mean AUCs here, 0.817 and 0.857 in the riverine regions, sit at or below the best-model AUCs of 0.87 to 0.98 in Table 1. The comparison is only indicative, since those studies split their points at random while every figure here comes from 10 km blocks the model never saw, and wider blocks lower these figures a little further (Section 5.5). Blocking has its own critics</w:t>
+        <w:t xml:space="preserve">The label source decides what a published accuracy figure measures. Terrain-threshold labels cost the model 0.101, 0.087 and 0.080 in AUC on held-out blocks. Against later floods that neither label source had seen they still cost 0.069, 0.024 and 0.071, so in Rangpur and Rajshahi and on the coast the advantage of radar labels does not depend on the test sharing their definition, while in Sylhet most of it did. The indices those labels are built on, TWI and HAND, add almost nothing to the model once elevation is known, and a model scored against labels derived from its own inputs measures its recovery of the labelling rule rather than its skill at locating floods. The mean AUCs here, 0.817 and 0.857 in the riverine regions, sit at or below the best-model AUCs of 0.87 to 0.98 in Table 1. The comparison is only indicative, since those studies split their points at random while every figure here comes from 10 km blocks the model never saw, and wider blocks lower these figures a little further (Section 5.5). Blocking has its own critics</w:t>
       </w:r>
       <w:r>
         <w:t xml:space="preserve"> </w:t>
@@ -1680,8 +1377,8 @@
         <w:t xml:space="preserve">, and the blocked scores estimate performance on unseen areas of similar terrain rather than design-based map accuracy.</w:t>
       </w:r>
     </w:p>
-    <w:bookmarkEnd w:id="33"/>
-    <w:bookmarkStart w:id="34" w:name="what-the-flood-record-already-knows"/>
+    <w:bookmarkEnd w:id="34"/>
+    <w:bookmarkStart w:id="35" w:name="Xa0a4390a637e12f1989c7cc4b426b20e3374b13"/>
     <w:p>
       <w:pPr>
         <w:pStyle w:val="Heading2"/>
@@ -1690,13 +1387,13 @@
         <w:rPr>
           <w:rStyle w:val="SectionNumber"/>
         </w:rPr>
-        <w:t xml:space="preserve">6.2</w:t>
+        <w:t xml:space="preserve">6.3</w:t>
       </w:r>
       <w:r>
         <w:tab/>
       </w:r>
       <w:r>
-        <w:t xml:space="preserve">What the flood record already knows</w:t>
+        <w:t xml:space="preserve">What the graph and interpolation did not add</w:t>
       </w:r>
     </w:p>
     <w:p>
@@ -1704,34 +1401,7 @@
         <w:pStyle w:val="FirstParagraph"/>
       </w:pPr>
       <w:r>
-        <w:t xml:space="preserve">Susceptibility studies rarely ask whether a model anticipates a later flood better than the record of earlier ones. In Rangpur and Rajshahi it did not under any check applied here, whereas in Sylhet the record’s lead held for the published training target but disappeared when the model learned the same target as the test, and outside the haor’s seasonal water. Given that record as a feature, the model beat both in Rangpur and Rajshahi, gaining on ground no earlier flood had reached, where the record cannot rank at all. In Sylhet it matched the record without improving on it. The record marks where water returns and the terrain ranks where it has not yet been seen, so a susceptibility map for a river basin with a radar flood history should at least report the record beside it, and where the record is informative the two can be combined. The riverine lead also widened when the blocks grew to 40 km, so it does not depend on the choice of block size. On the coast, where most of the ground Cyclone Remal flooded had not flooded in the earlier cyclones, the model trained on those cyclones did best, but its lead fell within noise once the blocks widened, so the coastal comparison remains open. A study that reports accuracy without the past-flooding reference cannot show that its model knows more than the flood record already does, and the two are simple to compare wherever Sentinel-1 has observed earlier floods.</w:t>
-      </w:r>
-    </w:p>
-    <w:bookmarkEnd w:id="34"/>
-    <w:bookmarkStart w:id="35" w:name="what-the-graph-did-not-add"/>
-    <w:p>
-      <w:pPr>
-        <w:pStyle w:val="Heading2"/>
-      </w:pPr>
-      <w:r>
-        <w:rPr>
-          <w:rStyle w:val="SectionNumber"/>
-        </w:rPr>
-        <w:t xml:space="preserve">6.3</w:t>
-      </w:r>
-      <w:r>
-        <w:tab/>
-      </w:r>
-      <w:r>
-        <w:t xml:space="preserve">What the graph did not add</w:t>
-      </w:r>
-    </w:p>
-    <w:p>
-      <w:pPr>
-        <w:pStyle w:val="FirstParagraph"/>
-      </w:pPr>
-      <w:r>
-        <w:t xml:space="preserve">The graph network rested on the reasoning that neighbouring assets flood together, yet on identical features and blocks it trailed the best tabular model in every region, measurably so only in Rangpur and Rajshahi, and within noise on the coast and in Sylhet. A likely reason is that the features already carry the neighbourhood, since nearby assets share elevation and distances to the same roads, schools and shelters, the access distances rank alongside or ahead of elevation, and a tree can split on those values directly, although this was not tested. Kriging fared no better, and in Sylhet, where it smoothed the scores towards the regional average, it ranked observed flooding across the whole grid at 0.544 against 0.822 for the terrain surface. At this scale neither linking assets into a graph nor interpolating between them consistently improved spatial prediction, and studies proposing either should report the tabular baseline on the same blocks.</w:t>
+        <w:t xml:space="preserve">On identical features and blocks the graph network trailed the best tabular model in every region, measurably only in Rangpur and Rajshahi, probably because the features already carry the neighbourhood, since nearby assets share elevation and distances to the same services, although this was not tested. Kriging fared no better, and over the whole grid in Sylhet it ranked observed flooding at 0.544 against 0.822 for the terrain surface. Studies proposing either should report the tabular baseline on the same blocks.</w:t>
       </w:r>
     </w:p>
     <w:bookmarkEnd w:id="35"/>
@@ -1758,7 +1428,7 @@
         <w:pStyle w:val="FirstParagraph"/>
       </w:pPr>
       <w:r>
-        <w:t xml:space="preserve">The results bear on flood risk management in three ways. First, where Sentinel-1 has observed several floods, the record of where water has already stood is at least as good a guide to the next riverine flood as a terrain model alone, and in Rangpur and Rajshahi a better one, and it costs little to compute, so agencies such as the Bangladesh Water Development Board and the Flood Forecasting and Warning Centre could publish it as a planning layer beside any susceptibility map. The terrain model adds most where the record is silent, on ground no mapped flood has reached and possibly on a coast where each surge strikes new ground, although the coastal lead did not survive wider blocks. Second, a susceptibility map used to site shelters, embankments or schools should be judged on held-out areas and later floods rather than on random splits, since the accuracy a random split reports overstates how far the map can be trusted in places it has not seen. Third, the composite risk classes rank unions within a region and must be read with their gaps, because a union without mapped assets carries no score rather than a low one. The best tabular models tested here were almost indistinguishable in AUC, so better OpenStreetMap coverage of rural unions would probably improve the map more than a new model would. Infrastructure also fails in networks, and the disruption of services beyond a flooded asset, which asset-level exposure omits, needs network modelling of the kind developed for Accra</w:t>
+        <w:t xml:space="preserve">The results bear on flood risk management in three ways. First, where Sentinel-1 has observed several floods, the record of where water has already stood was at least as good a guide to the next riverine flood as a terrain model alone, and in Rangpur and Rajshahi a better one. It costs little to compute, so agencies such as the Bangladesh Water Development Board and the Flood Forecasting and Warning Centre could publish it as a planning layer beside any susceptibility map. The terrain model adds most where the record is silent, on ground no mapped flood has reached and possibly on a coast where each surge strikes new ground, although the coastal lead did not survive wider blocks. Second, a susceptibility map used to site shelters, embankments or schools should be judged on held-out areas and later floods rather than on random splits, since the accuracy a random split reports overstates how far the map can be trusted in places it has not seen. Third, the composite risk classes rank unions within a region and must be read with their gaps, because a union without mapped assets carries no score rather than a low one. The best tabular models tested here were almost indistinguishable in AUC, so better OpenStreetMap coverage of rural unions would probably improve the map more than a new model would. Infrastructure also fails in networks, and the disruption of services beyond a flooded asset, which asset-level exposure omits, needs network modelling of the kind developed for Accra</w:t>
       </w:r>
       <w:r>
         <w:t xml:space="preserve"> </w:t>
@@ -1803,7 +1473,7 @@
         <w:t xml:space="preserve">(Rahman et al., 2025)</w:t>
       </w:r>
       <w:r>
-        <w:t xml:space="preserve">. The radar labels carry error of their own, agreeing only moderately with an independent MODIS map and counting inundated paddy as flooding, and setting aside the ground most exposed to a repeated error narrowed the record’s lead in Rangpur and Rajshahi to within noise without reversing it (Section 5.4). Every score here therefore measures agreement with flooding mapped by radar rather than with flooding on the ground. The calibrated probabilities hold for a region as a whole rather than for any one area. The composite risk has not been checked against losses, and damage records for the 2022 and 2024 floods, where available, or depth-damage curves for infrastructure components such as those derived by expert elicitation</w:t>
+        <w:t xml:space="preserve">. The radar labels carry error of their own, agreeing only moderately with an independent MODIS map and counting inundated paddy as flooding. The temporal test rests on a single flood year, and in Rangpur and Rajshahi on small floods that stayed largely within earlier extents, so a larger flood reaching new ground might favour the model, as on the coast. Every score here therefore measures agreement with flooding mapped by radar rather than with flooding on the ground. The calibrated probabilities hold for a region as a whole rather than for any one area. The composite risk has not been checked against losses, and damage records for the 2022 and 2024 floods, where available, or depth-damage curves for infrastructure components such as those derived by expert elicitation</w:t>
       </w:r>
       <w:r>
         <w:t xml:space="preserve"> </w:t>
@@ -1840,7 +1510,7 @@
         <w:pStyle w:val="FirstParagraph"/>
       </w:pPr>
       <w:r>
-        <w:t xml:space="preserve">Radar-observed flood extents made better training labels than terrain thresholds, by 0.101, 0.087 and 0.080 in AUC on held-out ground and by 0.069, 0.024 and 0.071 against later floods, which bears on how any map trained and scored against terrain-derived labels should be read. In Rangpur and Rajshahi the record of earlier floods predicted the 2024 flooding better than the model under every check applied, and in Sylhet only for the published training target, and in Rangpur and Rajshahi a model given that record as a feature beat both, reaching 0.924, while in Sylhet it matched the record. Ordinary tabular models matched or beat a graph neural network, with elevation and the access distances carrying the signal. The terrain hazard surface ranked observed flooding on held-out ground at 0.656 and 0.763 in the riverine regions and only 0.610 on the coast. Every number in this paper is generated from the released pipeline outputs, so each can be checked and rebuilt.</w:t>
+        <w:t xml:space="preserve">In the riverine region where floods returned to the same ground, a terrain-based flood susceptibility model did not know more than the flood record. In Rangpur and Rajshahi the record of earlier floods predicted the 2024 flooding better than the model under every check applied, and a model given that record as a feature beat both, reaching 0.924, by ranking the ground no earlier flood had reached. In the Sylhet haor the comparison turned on the model’s training target, and on the cyclone-struck coast it remains open. Radar-observed flood extents made better training labels than terrain thresholds, by 0.101, 0.087 and 0.080 in AUC on held-out ground and by 0.069, 0.024 and 0.071 against later floods. Ordinary tabular models matched or beat a graph neural network, and the terrain hazard surface ranked observed flooding on held-out ground at 0.656 and 0.763 in the riverine regions and only 0.610 on the coast. Every number in this paper is generated from the released pipeline outputs, so each can be checked and rebuilt.</w:t>
       </w:r>
     </w:p>
     <w:bookmarkEnd w:id="39"/>

</xml_diff>

<commit_message>
Flood paper: novelty framed against the literature found in a database screen
- Temporal validation credited to the landslide literature (Chung and Fabbri
  2003; Guzzetti et al. 2006); the gap stated precisely: no flood
  susceptibility map has been scored against the record of earlier floods.
- Swarup and Nury (2026), a Sylhet AHP map tested on the June 2022 and 2024
  floods, added to Table 1 (from its abstract) and compared in the discussion.
- Records against models at hazard-map level (Hawker et al. 2020) and the
  Bangladesh flood-record products (Haghighi 2022; Thomas et al. 2023;
  Giezendanner et al. 2023) cited.
- Graph-network claim narrowed to proximity graphs of assets; flood GNNs on
  catchment or river connectivity (Wang et al. 2023; Liu et al. 2026; Sharma
  and Sharma 2026 preprint) cited as the untested alternative.
</commit_message>
<xml_diff>
--- a/docs/paper/submission/manuscript.docx
+++ b/docs/paper/submission/manuscript.docx
@@ -121,7 +121,7 @@
         <w:t xml:space="preserve"> </w:t>
       </w:r>
       <w:r>
-        <w:t xml:space="preserve">(Ma et al., 2025; Wang et al., 2023)</w:t>
+        <w:t xml:space="preserve">(Ma et al., 2025; X. Wang et al., 2023)</w:t>
       </w:r>
       <w:r>
         <w:t xml:space="preserve"> </w:t>
@@ -383,6 +383,63 @@
         <w:t xml:space="preserve">(Roberts et al., 2017)</w:t>
       </w:r>
       <w:r>
+        <w:t xml:space="preserve">. Splitting by time, training on past events and testing on later ones, has long been standard for landslides</w:t>
+      </w:r>
+      <w:r>
+        <w:t xml:space="preserve"> </w:t>
+      </w:r>
+      <w:r>
+        <w:t xml:space="preserve">(Chung &amp; Fabbri, 2003; Guzzetti et al., 2006)</w:t>
+      </w:r>
+      <w:r>
+        <w:t xml:space="preserve">, but among the Bangladesh flood studies only one map has been tested on later floods, a multi-criteria map of Sylhet scored against the floods of June 2022 and June 2024</w:t>
+      </w:r>
+      <w:r>
+        <w:t xml:space="preserve"> </w:t>
+      </w:r>
+      <w:r>
+        <w:t xml:space="preserve">(Swarup &amp; Nury, 2026)</w:t>
+      </w:r>
+      <w:r>
+        <w:t xml:space="preserve">, and none has been set against the record of earlier floods. Where records and models have been compared, it was as hazard maps, with satellite records showing less frequent flooding than global flood models predict</w:t>
+      </w:r>
+      <w:r>
+        <w:t xml:space="preserve"> </w:t>
+      </w:r>
+      <w:r>
+        <w:t xml:space="preserve">(Hawker et al., 2020)</w:t>
+      </w:r>
+      <w:r>
+        <w:t xml:space="preserve">. Such records already exist for Bangladesh, as a national Sentinel-1 flood-frequency map</w:t>
+      </w:r>
+      <w:r>
+        <w:t xml:space="preserve"> </w:t>
+      </w:r>
+      <w:r>
+        <w:t xml:space="preserve">(Haghighi, 2022)</w:t>
+      </w:r>
+      <w:r>
+        <w:t xml:space="preserve">, a weekly inundation series built for flood insurance</w:t>
+      </w:r>
+      <w:r>
+        <w:t xml:space="preserve"> </w:t>
+      </w:r>
+      <w:r>
+        <w:t xml:space="preserve">(Thomas et al., 2023)</w:t>
+      </w:r>
+      <w:r>
+        <w:t xml:space="preserve"> </w:t>
+      </w:r>
+      <w:r>
+        <w:t xml:space="preserve">and a two-decade reconstruction</w:t>
+      </w:r>
+      <w:r>
+        <w:t xml:space="preserve"> </w:t>
+      </w:r>
+      <w:r>
+        <w:t xml:space="preserve">(Giezendanner et al., 2023)</w:t>
+      </w:r>
+      <w:r>
         <w:t xml:space="preserve">. The effect can be large, since a forest-biomass model that explained more than half the variance under random validation showed almost no skill under spatial validation</w:t>
       </w:r>
       <w:r>
@@ -467,16 +524,49 @@
         <w:t xml:space="preserve">(Hamilton et al., 2017)</w:t>
       </w:r>
       <w:r>
-        <w:t xml:space="preserve">. In hazard mapping they have appeared mainly for landslides</w:t>
-      </w:r>
-      <w:r>
-        <w:t xml:space="preserve"> </w:t>
-      </w:r>
-      <w:r>
-        <w:t xml:space="preserve">(Ma et al., 2025; Wang et al., 2023)</w:t>
-      </w:r>
-      <w:r>
-        <w:t xml:space="preserve">, a review of 58 deep-learning flood studies found convolutional models usually the more accurate</w:t>
+        <w:t xml:space="preserve">. In hazard mapping they appeared first for landslides</w:t>
+      </w:r>
+      <w:r>
+        <w:t xml:space="preserve"> </w:t>
+      </w:r>
+      <w:r>
+        <w:t xml:space="preserve">(Ma et al., 2025; X. Wang et al., 2023)</w:t>
+      </w:r>
+      <w:r>
+        <w:t xml:space="preserve"> </w:t>
+      </w:r>
+      <w:r>
+        <w:t xml:space="preserve">and have since been applied to flood susceptibility on graphs of urban cells</w:t>
+      </w:r>
+      <w:r>
+        <w:t xml:space="preserve"> </w:t>
+      </w:r>
+      <w:r>
+        <w:t xml:space="preserve">(Z. Wang et al., 2023)</w:t>
+      </w:r>
+      <w:r>
+        <w:t xml:space="preserve"> </w:t>
+      </w:r>
+      <w:r>
+        <w:t xml:space="preserve">and of catchments linked by their topology</w:t>
+      </w:r>
+      <w:r>
+        <w:t xml:space="preserve"> </w:t>
+      </w:r>
+      <w:r>
+        <w:t xml:space="preserve">(Liu et al., 2026)</w:t>
+      </w:r>
+      <w:r>
+        <w:t xml:space="preserve">, and a preprint reported a gain of 0.097 in AUC over the best tabular model on sub-watersheds linked by river connectivity</w:t>
+      </w:r>
+      <w:r>
+        <w:t xml:space="preserve"> </w:t>
+      </w:r>
+      <w:r>
+        <w:t xml:space="preserve">(Sharma &amp; Sharma, 2026)</w:t>
+      </w:r>
+      <w:r>
+        <w:t xml:space="preserve">. A review of 58 deep-learning flood studies found convolutional models usually the more accurate</w:t>
       </w:r>
       <w:r>
         <w:t xml:space="preserve"> </w:t>
@@ -485,7 +575,7 @@
         <w:t xml:space="preserve">(Bentivoglio et al., 2022)</w:t>
       </w:r>
       <w:r>
-        <w:t xml:space="preserve">, and the searches made for this review found no graph model of the flood susceptibility of mapped infrastructure. Composite indices such as INFORM combine hazard, exposure and vulnerability by geometric mean</w:t>
+        <w:t xml:space="preserve">, and the searches made for this review found no graph model of the flood susceptibility of mapped infrastructure, nor one that links assets by proximity rather than by the flow of water. Composite indices such as INFORM combine hazard, exposure and vulnerability by geometric mean</w:t>
       </w:r>
       <w:r>
         <w:t xml:space="preserve"> </w:t>
@@ -1338,7 +1428,16 @@
         <w:pStyle w:val="FirstParagraph"/>
       </w:pPr>
       <w:r>
-        <w:t xml:space="preserve">Susceptibility studies rarely ask whether a model anticipates a later flood better than the record of earlier ones, and here the answer followed how often floods returned to the same ground. In Rangpur and Rajshahi, where most of the ground the 2024 floods reached had flooded before, the record led under every check applied. The model added to it only when given the record as a feature, gaining on ground no earlier flood had reached, where the record cannot rank at all. In the Sylhet haor the record’s lead depended on what the model was trained to predict and lay on the margins of the seasonal water. On the coast, where most of the ground Cyclone Remal flooded had not flooded in the earlier cyclones, the model’s lead did not survive wider blocks. Three regions cannot establish that pattern, but they show that the comparison has to be made region by region rather than assumed. The record marks where water returns and the terrain ranks where it has not yet been seen, so a susceptibility map for a river basin with a radar flood history should at least report the record beside it, and where the record is informative the two can be combined. A study that reports accuracy without that reference cannot show that its model knows more than the flood record already does, and the comparison is simple to make wherever Sentinel-1 has observed earlier floods.</w:t>
+        <w:t xml:space="preserve">Susceptibility studies rarely ask whether a model anticipates a later flood better than the record of earlier ones, and here the answer followed how often floods returned to the same ground. In Rangpur and Rajshahi, where most of the ground the 2024 floods reached had flooded before, the record led under every check applied. The model added to it only when given the record as a feature, gaining on ground no earlier flood had reached, where the record cannot rank at all. In the Sylhet haor the record’s lead depended on what the model was trained to predict and lay on the margins of the seasonal water. A published multi-criteria map scored on the same 2024 floods reached 0.794</w:t>
+      </w:r>
+      <w:r>
+        <w:t xml:space="preserve"> </w:t>
+      </w:r>
+      <w:r>
+        <w:t xml:space="preserve">(Swarup &amp; Nury, 2026)</w:t>
+      </w:r>
+      <w:r>
+        <w:t xml:space="preserve">, close to this model’s 0.797, while the record ranked them at 0.851, a comparison that is only indicative, since that map was scored over areas rather than assets. On the coast, where most of the ground Cyclone Remal flooded had not flooded in the earlier cyclones, the model’s lead did not survive wider blocks. Three regions cannot establish that pattern, but they show that the comparison has to be made region by region rather than assumed. The record marks where water returns and the terrain ranks where it has not yet been seen, so a susceptibility map for a river basin with a radar flood history should at least report the record beside it, and where the record is informative the two can be combined. A study that reports accuracy without that reference cannot show that its model knows more than the flood record already does, and the comparison is simple to make wherever Sentinel-1 has observed earlier floods.</w:t>
       </w:r>
     </w:p>
     <w:bookmarkEnd w:id="33"/>
@@ -1401,7 +1500,16 @@
         <w:pStyle w:val="FirstParagraph"/>
       </w:pPr>
       <w:r>
-        <w:t xml:space="preserve">On identical features and blocks the graph network trailed the best tabular model in every region, measurably only in Rangpur and Rajshahi, probably because the features already carry the neighbourhood, since nearby assets share elevation and distances to the same services, although this was not tested. Kriging fared no better, and over the whole grid in Sylhet it ranked observed flooding at 0.544 against 0.822 for the terrain surface. Studies proposing either should report the tabular baseline on the same blocks.</w:t>
+        <w:t xml:space="preserve">On identical features and blocks the graph network trailed the best tabular model in every region, measurably only in Rangpur and Rajshahi, probably because the features already carry the neighbourhood, since nearby assets share elevation and distances to the same services, although this was not tested. The graphs that reported gains elsewhere linked catchments or sub-watersheds along the flow of water</w:t>
+      </w:r>
+      <w:r>
+        <w:t xml:space="preserve"> </w:t>
+      </w:r>
+      <w:r>
+        <w:t xml:space="preserve">(Liu et al., 2026; Sharma &amp; Sharma, 2026)</w:t>
+      </w:r>
+      <w:r>
+        <w:t xml:space="preserve">, whereas this one linked each asset to its nearest neighbours, so the result bears on proximity graphs of assets, and whether a river-connected graph would help remains untested. Kriging fared no better, and over the whole grid in Sylhet it ranked observed flooding at 0.544 against 0.822 for the terrain surface. Studies proposing either should report the tabular baseline on the same blocks.</w:t>
       </w:r>
     </w:p>
     <w:bookmarkEnd w:id="35"/>
@@ -1641,7 +1749,7 @@
       </w:r>
     </w:p>
     <w:bookmarkEnd w:id="44"/>
-    <w:bookmarkStart w:id="114" w:name="references"/>
+    <w:bookmarkStart w:id="134" w:name="references"/>
     <w:p>
       <w:pPr>
         <w:pStyle w:val="Heading1"/>
@@ -1650,7 +1758,7 @@
         <w:t xml:space="preserve">References</w:t>
       </w:r>
     </w:p>
-    <w:bookmarkStart w:id="113" w:name="refs"/>
+    <w:bookmarkStart w:id="133" w:name="refs"/>
     <w:bookmarkStart w:id="46" w:name="ref-adnan2023"/>
     <w:p>
       <w:pPr>
@@ -1875,22 +1983,13 @@
       </w:hyperlink>
     </w:p>
     <w:bookmarkEnd w:id="52"/>
-    <w:bookmarkStart w:id="54" w:name="ref-dadhich2026"/>
+    <w:bookmarkStart w:id="54" w:name="ref-chung2003"/>
     <w:p>
       <w:pPr>
         <w:pStyle w:val="Bibliography"/>
       </w:pPr>
       <w:r>
-        <w:t xml:space="preserve">Dadhich, G., Babel, M., Miyazaki, H., Pal, I., Tripathi, N. K., &amp; Virdis, S. G. P. (2026).</w:t>
-      </w:r>
-      <w:r>
-        <w:t xml:space="preserve"> </w:t>
-      </w:r>
-      <w:r>
-        <w:t xml:space="preserve">Performance Evaluation of Automated Flood Inundation Mapping Techniques Using Multi-Temporal Sentinel-1 SAR Data</w:t>
-      </w:r>
-      <w:r>
-        <w:t xml:space="preserve">.</w:t>
+        <w:t xml:space="preserve">Chung, C.-J. F., &amp; Fabbri, A. G. (2003). Validation of spatial prediction models for landslide hazard mapping.</w:t>
       </w:r>
       <w:r>
         <w:t xml:space="preserve"> </w:t>
@@ -1900,7 +1999,7 @@
           <w:i/>
           <w:iCs/>
         </w:rPr>
-        <w:t xml:space="preserve">Journal of Flood Risk Management</w:t>
+        <w:t xml:space="preserve">Natural Hazards</w:t>
       </w:r>
       <w:r>
         <w:t xml:space="preserve">,</w:t>
@@ -1913,6 +2012,62 @@
           <w:i/>
           <w:iCs/>
         </w:rPr>
+        <w:t xml:space="preserve">30</w:t>
+      </w:r>
+      <w:r>
+        <w:t xml:space="preserve">, 451–472.</w:t>
+      </w:r>
+      <w:r>
+        <w:t xml:space="preserve"> </w:t>
+      </w:r>
+      <w:hyperlink r:id="rId53">
+        <w:r>
+          <w:rPr>
+            <w:rStyle w:val="Hyperlink"/>
+          </w:rPr>
+          <w:t xml:space="preserve">https://doi.org/10.1023/B:NHAZ.0000007172.62651.2b</w:t>
+        </w:r>
+      </w:hyperlink>
+    </w:p>
+    <w:bookmarkEnd w:id="54"/>
+    <w:bookmarkStart w:id="56" w:name="ref-dadhich2026"/>
+    <w:p>
+      <w:pPr>
+        <w:pStyle w:val="Bibliography"/>
+      </w:pPr>
+      <w:r>
+        <w:t xml:space="preserve">Dadhich, G., Babel, M., Miyazaki, H., Pal, I., Tripathi, N. K., &amp; Virdis, S. G. P. (2026).</w:t>
+      </w:r>
+      <w:r>
+        <w:t xml:space="preserve"> </w:t>
+      </w:r>
+      <w:r>
+        <w:t xml:space="preserve">Performance Evaluation of Automated Flood Inundation Mapping Techniques Using Multi-Temporal Sentinel-1 SAR Data</w:t>
+      </w:r>
+      <w:r>
+        <w:t xml:space="preserve">.</w:t>
+      </w:r>
+      <w:r>
+        <w:t xml:space="preserve"> </w:t>
+      </w:r>
+      <w:r>
+        <w:rPr>
+          <w:i/>
+          <w:iCs/>
+        </w:rPr>
+        <w:t xml:space="preserve">Journal of Flood Risk Management</w:t>
+      </w:r>
+      <w:r>
+        <w:t xml:space="preserve">,</w:t>
+      </w:r>
+      <w:r>
+        <w:t xml:space="preserve"> </w:t>
+      </w:r>
+      <w:r>
+        <w:rPr>
+          <w:i/>
+          <w:iCs/>
+        </w:rPr>
         <w:t xml:space="preserve">19</w:t>
       </w:r>
       <w:r>
@@ -1921,7 +2076,7 @@
       <w:r>
         <w:t xml:space="preserve"> </w:t>
       </w:r>
-      <w:hyperlink r:id="rId53">
+      <w:hyperlink r:id="rId55">
         <w:r>
           <w:rPr>
             <w:rStyle w:val="Hyperlink"/>
@@ -1930,8 +2085,8 @@
         </w:r>
       </w:hyperlink>
     </w:p>
-    <w:bookmarkEnd w:id="54"/>
-    <w:bookmarkStart w:id="56" w:name="ref-inform2017"/>
+    <w:bookmarkEnd w:id="56"/>
+    <w:bookmarkStart w:id="58" w:name="ref-inform2017"/>
     <w:p>
       <w:pPr>
         <w:pStyle w:val="Bibliography"/>
@@ -1955,7 +2110,7 @@
       <w:r>
         <w:t xml:space="preserve"> </w:t>
       </w:r>
-      <w:hyperlink r:id="rId55">
+      <w:hyperlink r:id="rId57">
         <w:r>
           <w:rPr>
             <w:rStyle w:val="Hyperlink"/>
@@ -1964,14 +2119,26 @@
         </w:r>
       </w:hyperlink>
     </w:p>
-    <w:bookmarkEnd w:id="56"/>
-    <w:bookmarkStart w:id="58" w:name="ref-hamilton2017"/>
+    <w:bookmarkEnd w:id="58"/>
+    <w:bookmarkStart w:id="60" w:name="ref-giezendanner2023"/>
     <w:p>
       <w:pPr>
         <w:pStyle w:val="Bibliography"/>
       </w:pPr>
       <w:r>
-        <w:t xml:space="preserve">Hamilton, W. L., Ying, R., &amp; Leskovec, J. (2017).</w:t>
+        <w:t xml:space="preserve">Giezendanner, J., Mukherjee, R., Purri, M., Thomas, M., Mauerman, M., Islam, A. K. M. S., &amp; Tellman, B. (2023). Inferring the past: A combined</w:t>
+      </w:r>
+      <w:r>
+        <w:t xml:space="preserve"> </w:t>
+      </w:r>
+      <w:r>
+        <w:t xml:space="preserve">CNN–LSTM</w:t>
+      </w:r>
+      <w:r>
+        <w:t xml:space="preserve"> </w:t>
+      </w:r>
+      <w:r>
+        <w:t xml:space="preserve">deep learning framework to fuse satellites for historical inundation mapping.</w:t>
       </w:r>
       <w:r>
         <w:t xml:space="preserve"> </w:t>
@@ -1981,6 +2148,146 @@
           <w:i/>
           <w:iCs/>
         </w:rPr>
+        <w:t xml:space="preserve">Proceedings of the IEEE/CVF Conference on Computer Vision and Pattern Recognition Workshops</w:t>
+      </w:r>
+      <w:r>
+        <w:t xml:space="preserve">, 2155–2165.</w:t>
+      </w:r>
+      <w:r>
+        <w:t xml:space="preserve"> </w:t>
+      </w:r>
+      <w:hyperlink r:id="rId59">
+        <w:r>
+          <w:rPr>
+            <w:rStyle w:val="Hyperlink"/>
+          </w:rPr>
+          <w:t xml:space="preserve">https://doi.org/10.1109/CVPRW59228.2023.00209</w:t>
+        </w:r>
+      </w:hyperlink>
+    </w:p>
+    <w:bookmarkEnd w:id="60"/>
+    <w:bookmarkStart w:id="62" w:name="ref-guzzetti2006"/>
+    <w:p>
+      <w:pPr>
+        <w:pStyle w:val="Bibliography"/>
+      </w:pPr>
+      <w:r>
+        <w:t xml:space="preserve">Guzzetti, F., Reichenbach, P., Ardizzone, F., Cardinali, M., &amp; Galli, M. (2006). Estimating the quality of landslide susceptibility models.</w:t>
+      </w:r>
+      <w:r>
+        <w:t xml:space="preserve"> </w:t>
+      </w:r>
+      <w:r>
+        <w:rPr>
+          <w:i/>
+          <w:iCs/>
+        </w:rPr>
+        <w:t xml:space="preserve">Geomorphology</w:t>
+      </w:r>
+      <w:r>
+        <w:t xml:space="preserve">,</w:t>
+      </w:r>
+      <w:r>
+        <w:t xml:space="preserve"> </w:t>
+      </w:r>
+      <w:r>
+        <w:rPr>
+          <w:i/>
+          <w:iCs/>
+        </w:rPr>
+        <w:t xml:space="preserve">81</w:t>
+      </w:r>
+      <w:r>
+        <w:t xml:space="preserve">, 166–184.</w:t>
+      </w:r>
+      <w:r>
+        <w:t xml:space="preserve"> </w:t>
+      </w:r>
+      <w:hyperlink r:id="rId61">
+        <w:r>
+          <w:rPr>
+            <w:rStyle w:val="Hyperlink"/>
+          </w:rPr>
+          <w:t xml:space="preserve">https://doi.org/10.1016/j.geomorph.2006.04.007</w:t>
+        </w:r>
+      </w:hyperlink>
+    </w:p>
+    <w:bookmarkEnd w:id="62"/>
+    <w:bookmarkStart w:id="64" w:name="ref-haghighi2022"/>
+    <w:p>
+      <w:pPr>
+        <w:pStyle w:val="Bibliography"/>
+      </w:pPr>
+      <w:r>
+        <w:t xml:space="preserve">Haghighi, M. H. (2022). Large-scale mapping of flood using</w:t>
+      </w:r>
+      <w:r>
+        <w:t xml:space="preserve"> </w:t>
+      </w:r>
+      <w:r>
+        <w:t xml:space="preserve">Sentinel-1</w:t>
+      </w:r>
+      <w:r>
+        <w:t xml:space="preserve"> </w:t>
+      </w:r>
+      <w:r>
+        <w:t xml:space="preserve">radar remote sensing.</w:t>
+      </w:r>
+      <w:r>
+        <w:t xml:space="preserve"> </w:t>
+      </w:r>
+      <w:r>
+        <w:rPr>
+          <w:i/>
+          <w:iCs/>
+        </w:rPr>
+        <w:t xml:space="preserve">The International Archives of the Photogrammetry, Remote Sensing and Spatial Information Sciences</w:t>
+      </w:r>
+      <w:r>
+        <w:t xml:space="preserve">,</w:t>
+      </w:r>
+      <w:r>
+        <w:t xml:space="preserve"> </w:t>
+      </w:r>
+      <w:r>
+        <w:rPr>
+          <w:i/>
+          <w:iCs/>
+        </w:rPr>
+        <w:t xml:space="preserve">XLIII-B3-2022</w:t>
+      </w:r>
+      <w:r>
+        <w:t xml:space="preserve">, 1097–1102.</w:t>
+      </w:r>
+      <w:r>
+        <w:t xml:space="preserve"> </w:t>
+      </w:r>
+      <w:hyperlink r:id="rId63">
+        <w:r>
+          <w:rPr>
+            <w:rStyle w:val="Hyperlink"/>
+          </w:rPr>
+          <w:t xml:space="preserve">https://doi.org/10.5194/isprs-archives-XLIII-B3-2022-1097-2022</w:t>
+        </w:r>
+      </w:hyperlink>
+    </w:p>
+    <w:bookmarkEnd w:id="64"/>
+    <w:bookmarkStart w:id="66" w:name="ref-hamilton2017"/>
+    <w:p>
+      <w:pPr>
+        <w:pStyle w:val="Bibliography"/>
+      </w:pPr>
+      <w:r>
+        <w:t xml:space="preserve">Hamilton, W. L., Ying, R., &amp; Leskovec, J. (2017).</w:t>
+      </w:r>
+      <w:r>
+        <w:t xml:space="preserve"> </w:t>
+      </w:r>
+      <w:r>
+        <w:rPr>
+          <w:i/>
+          <w:iCs/>
+        </w:rPr>
         <w:t xml:space="preserve">Inductive Representation Learning on Large Graphs</w:t>
       </w:r>
       <w:r>
@@ -1989,7 +2296,7 @@
       <w:r>
         <w:t xml:space="preserve"> </w:t>
       </w:r>
-      <w:hyperlink r:id="rId57">
+      <w:hyperlink r:id="rId65">
         <w:r>
           <w:rPr>
             <w:rStyle w:val="Hyperlink"/>
@@ -1998,14 +2305,14 @@
         </w:r>
       </w:hyperlink>
     </w:p>
-    <w:bookmarkEnd w:id="58"/>
-    <w:bookmarkStart w:id="60" w:name="ref-hawker2022"/>
+    <w:bookmarkEnd w:id="66"/>
+    <w:bookmarkStart w:id="68" w:name="ref-hawker2020"/>
     <w:p>
       <w:pPr>
         <w:pStyle w:val="Bibliography"/>
       </w:pPr>
       <w:r>
-        <w:t xml:space="preserve">Hawker, L., Uhe, P., Paulo, L., Sosa, J., Savage, J., Sampson, C., &amp; Neal, J. (2022). A 30 m global map of elevation with forests and buildings removed.</w:t>
+        <w:t xml:space="preserve">Hawker, L., Neal, J., Tellman, B., Liang, J., Schumann, G., Doyle, C., Sullivan, J. A., Savage, J., &amp; Tshimanga, R. (2020). Comparing earth observation and inundation models to map flood hazards.</w:t>
       </w:r>
       <w:r>
         <w:t xml:space="preserve"> </w:t>
@@ -2028,6 +2335,53 @@
           <w:i/>
           <w:iCs/>
         </w:rPr>
+        <w:t xml:space="preserve">15</w:t>
+      </w:r>
+      <w:r>
+        <w:t xml:space="preserve">, 124032.</w:t>
+      </w:r>
+      <w:r>
+        <w:t xml:space="preserve"> </w:t>
+      </w:r>
+      <w:hyperlink r:id="rId67">
+        <w:r>
+          <w:rPr>
+            <w:rStyle w:val="Hyperlink"/>
+          </w:rPr>
+          <w:t xml:space="preserve">https://doi.org/10.1088/1748-9326/abc216</w:t>
+        </w:r>
+      </w:hyperlink>
+    </w:p>
+    <w:bookmarkEnd w:id="68"/>
+    <w:bookmarkStart w:id="70" w:name="ref-hawker2022"/>
+    <w:p>
+      <w:pPr>
+        <w:pStyle w:val="Bibliography"/>
+      </w:pPr>
+      <w:r>
+        <w:t xml:space="preserve">Hawker, L., Uhe, P., Paulo, L., Sosa, J., Savage, J., Sampson, C., &amp; Neal, J. (2022). A 30 m global map of elevation with forests and buildings removed.</w:t>
+      </w:r>
+      <w:r>
+        <w:t xml:space="preserve"> </w:t>
+      </w:r>
+      <w:r>
+        <w:rPr>
+          <w:i/>
+          <w:iCs/>
+        </w:rPr>
+        <w:t xml:space="preserve">Environmental Research Letters</w:t>
+      </w:r>
+      <w:r>
+        <w:t xml:space="preserve">,</w:t>
+      </w:r>
+      <w:r>
+        <w:t xml:space="preserve"> </w:t>
+      </w:r>
+      <w:r>
+        <w:rPr>
+          <w:i/>
+          <w:iCs/>
+        </w:rPr>
         <w:t xml:space="preserve">17</w:t>
       </w:r>
       <w:r>
@@ -2036,7 +2390,7 @@
       <w:r>
         <w:t xml:space="preserve"> </w:t>
       </w:r>
-      <w:hyperlink r:id="rId59">
+      <w:hyperlink r:id="rId69">
         <w:r>
           <w:rPr>
             <w:rStyle w:val="Hyperlink"/>
@@ -2045,8 +2399,8 @@
         </w:r>
       </w:hyperlink>
     </w:p>
-    <w:bookmarkEnd w:id="60"/>
-    <w:bookmarkStart w:id="62" w:name="ref-herfort2023"/>
+    <w:bookmarkEnd w:id="70"/>
+    <w:bookmarkStart w:id="72" w:name="ref-herfort2023"/>
     <w:p>
       <w:pPr>
         <w:pStyle w:val="Bibliography"/>
@@ -2092,7 +2446,7 @@
       <w:r>
         <w:t xml:space="preserve"> </w:t>
       </w:r>
-      <w:hyperlink r:id="rId61">
+      <w:hyperlink r:id="rId71">
         <w:r>
           <w:rPr>
             <w:rStyle w:val="Hyperlink"/>
@@ -2101,8 +2455,8 @@
         </w:r>
       </w:hyperlink>
     </w:p>
-    <w:bookmarkEnd w:id="62"/>
-    <w:bookmarkStart w:id="64" w:name="ref-islam2021"/>
+    <w:bookmarkEnd w:id="72"/>
+    <w:bookmarkStart w:id="74" w:name="ref-islam2021"/>
     <w:p>
       <w:pPr>
         <w:pStyle w:val="Bibliography"/>
@@ -2148,7 +2502,7 @@
       <w:r>
         <w:t xml:space="preserve"> </w:t>
       </w:r>
-      <w:hyperlink r:id="rId63">
+      <w:hyperlink r:id="rId73">
         <w:r>
           <w:rPr>
             <w:rStyle w:val="Hyperlink"/>
@@ -2157,8 +2511,8 @@
         </w:r>
       </w:hyperlink>
     </w:p>
-    <w:bookmarkEnd w:id="64"/>
-    <w:bookmarkStart w:id="66" w:name="ref-islamr2024"/>
+    <w:bookmarkEnd w:id="74"/>
+    <w:bookmarkStart w:id="76" w:name="ref-islamr2024"/>
     <w:p>
       <w:pPr>
         <w:pStyle w:val="Bibliography"/>
@@ -2204,7 +2558,7 @@
       <w:r>
         <w:t xml:space="preserve"> </w:t>
       </w:r>
-      <w:hyperlink r:id="rId65">
+      <w:hyperlink r:id="rId75">
         <w:r>
           <w:rPr>
             <w:rStyle w:val="Hyperlink"/>
@@ -2213,8 +2567,8 @@
         </w:r>
       </w:hyperlink>
     </w:p>
-    <w:bookmarkEnd w:id="66"/>
-    <w:bookmarkStart w:id="68" w:name="ref-koks2019"/>
+    <w:bookmarkEnd w:id="76"/>
+    <w:bookmarkStart w:id="78" w:name="ref-koks2019"/>
     <w:p>
       <w:pPr>
         <w:pStyle w:val="Bibliography"/>
@@ -2260,7 +2614,7 @@
       <w:r>
         <w:t xml:space="preserve"> </w:t>
       </w:r>
-      <w:hyperlink r:id="rId67">
+      <w:hyperlink r:id="rId77">
         <w:r>
           <w:rPr>
             <w:rStyle w:val="Hyperlink"/>
@@ -2269,20 +2623,20 @@
         </w:r>
       </w:hyperlink>
     </w:p>
-    <w:bookmarkEnd w:id="68"/>
-    <w:bookmarkStart w:id="70" w:name="ref-ma2025"/>
+    <w:bookmarkEnd w:id="78"/>
+    <w:bookmarkStart w:id="80" w:name="ref-liu2026"/>
     <w:p>
       <w:pPr>
         <w:pStyle w:val="Bibliography"/>
       </w:pPr>
       <w:r>
-        <w:t xml:space="preserve">Ma, J., Han, Z., Liu, F., Wang, X., Hu, J., &amp; Zhang, P. (2025).</w:t>
-      </w:r>
-      <w:r>
-        <w:t xml:space="preserve"> </w:t>
-      </w:r>
-      <w:r>
-        <w:t xml:space="preserve">ConToGCN: A landslide susceptibility assessment model considering contour topographic features in slope units using graph convolution network</w:t>
+        <w:t xml:space="preserve">Liu, J., Zhao, G., Xiong, J., &amp; Kinouchi, T. (2026). A graph-based deep learning approach for daily flash flood susceptibility modeling in</w:t>
+      </w:r>
+      <w:r>
+        <w:t xml:space="preserve"> </w:t>
+      </w:r>
+      <w:r>
+        <w:t xml:space="preserve">China</w:t>
       </w:r>
       <w:r>
         <w:t xml:space="preserve">.</w:t>
@@ -2295,7 +2649,7 @@
           <w:i/>
           <w:iCs/>
         </w:rPr>
-        <w:t xml:space="preserve">CATENA</w:t>
+        <w:t xml:space="preserve">Water Resources Research</w:t>
       </w:r>
       <w:r>
         <w:t xml:space="preserve">,</w:t>
@@ -2308,6 +2662,62 @@
           <w:i/>
           <w:iCs/>
         </w:rPr>
+        <w:t xml:space="preserve">62</w:t>
+      </w:r>
+      <w:r>
+        <w:t xml:space="preserve">, e2025WR041360.</w:t>
+      </w:r>
+      <w:r>
+        <w:t xml:space="preserve"> </w:t>
+      </w:r>
+      <w:hyperlink r:id="rId79">
+        <w:r>
+          <w:rPr>
+            <w:rStyle w:val="Hyperlink"/>
+          </w:rPr>
+          <w:t xml:space="preserve">https://doi.org/10.1029/2025WR041360</w:t>
+        </w:r>
+      </w:hyperlink>
+    </w:p>
+    <w:bookmarkEnd w:id="80"/>
+    <w:bookmarkStart w:id="82" w:name="ref-ma2025"/>
+    <w:p>
+      <w:pPr>
+        <w:pStyle w:val="Bibliography"/>
+      </w:pPr>
+      <w:r>
+        <w:t xml:space="preserve">Ma, J., Han, Z., Liu, F., Wang, X., Hu, J., &amp; Zhang, P. (2025).</w:t>
+      </w:r>
+      <w:r>
+        <w:t xml:space="preserve"> </w:t>
+      </w:r>
+      <w:r>
+        <w:t xml:space="preserve">ConToGCN: A landslide susceptibility assessment model considering contour topographic features in slope units using graph convolution network</w:t>
+      </w:r>
+      <w:r>
+        <w:t xml:space="preserve">.</w:t>
+      </w:r>
+      <w:r>
+        <w:t xml:space="preserve"> </w:t>
+      </w:r>
+      <w:r>
+        <w:rPr>
+          <w:i/>
+          <w:iCs/>
+        </w:rPr>
+        <w:t xml:space="preserve">CATENA</w:t>
+      </w:r>
+      <w:r>
+        <w:t xml:space="preserve">,</w:t>
+      </w:r>
+      <w:r>
+        <w:t xml:space="preserve"> </w:t>
+      </w:r>
+      <w:r>
+        <w:rPr>
+          <w:i/>
+          <w:iCs/>
+        </w:rPr>
         <w:t xml:space="preserve">255</w:t>
       </w:r>
       <w:r>
@@ -2316,7 +2726,7 @@
       <w:r>
         <w:t xml:space="preserve"> </w:t>
       </w:r>
-      <w:hyperlink r:id="rId69">
+      <w:hyperlink r:id="rId81">
         <w:r>
           <w:rPr>
             <w:rStyle w:val="Hyperlink"/>
@@ -2325,8 +2735,8 @@
         </w:r>
       </w:hyperlink>
     </w:p>
-    <w:bookmarkEnd w:id="70"/>
-    <w:bookmarkStart w:id="72" w:name="ref-nadeau2003"/>
+    <w:bookmarkEnd w:id="82"/>
+    <w:bookmarkStart w:id="84" w:name="ref-nadeau2003"/>
     <w:p>
       <w:pPr>
         <w:pStyle w:val="Bibliography"/>
@@ -2363,7 +2773,7 @@
       <w:r>
         <w:t xml:space="preserve"> </w:t>
       </w:r>
-      <w:hyperlink r:id="rId71">
+      <w:hyperlink r:id="rId83">
         <w:r>
           <w:rPr>
             <w:rStyle w:val="Hyperlink"/>
@@ -2372,8 +2782,8 @@
         </w:r>
       </w:hyperlink>
     </w:p>
-    <w:bookmarkEnd w:id="72"/>
-    <w:bookmarkStart w:id="74" w:name="ref-niculescu2005"/>
+    <w:bookmarkEnd w:id="84"/>
+    <w:bookmarkStart w:id="86" w:name="ref-niculescu2005"/>
     <w:p>
       <w:pPr>
         <w:pStyle w:val="Bibliography"/>
@@ -2406,7 +2816,7 @@
       <w:r>
         <w:t xml:space="preserve"> </w:t>
       </w:r>
-      <w:hyperlink r:id="rId73">
+      <w:hyperlink r:id="rId85">
         <w:r>
           <w:rPr>
             <w:rStyle w:val="Hyperlink"/>
@@ -2415,8 +2825,8 @@
         </w:r>
       </w:hyperlink>
     </w:p>
-    <w:bookmarkEnd w:id="74"/>
-    <w:bookmarkStart w:id="76" w:name="ref-nobre2011"/>
+    <w:bookmarkEnd w:id="86"/>
+    <w:bookmarkStart w:id="88" w:name="ref-nobre2011"/>
     <w:p>
       <w:pPr>
         <w:pStyle w:val="Bibliography"/>
@@ -2462,7 +2872,7 @@
       <w:r>
         <w:t xml:space="preserve"> </w:t>
       </w:r>
-      <w:hyperlink r:id="rId75">
+      <w:hyperlink r:id="rId87">
         <w:r>
           <w:rPr>
             <w:rStyle w:val="Hyperlink"/>
@@ -2471,8 +2881,8 @@
         </w:r>
       </w:hyperlink>
     </w:p>
-    <w:bookmarkEnd w:id="76"/>
-    <w:bookmarkStart w:id="78" w:name="ref-pekel2016"/>
+    <w:bookmarkEnd w:id="88"/>
+    <w:bookmarkStart w:id="90" w:name="ref-pekel2016"/>
     <w:p>
       <w:pPr>
         <w:pStyle w:val="Bibliography"/>
@@ -2518,7 +2928,7 @@
       <w:r>
         <w:t xml:space="preserve"> </w:t>
       </w:r>
-      <w:hyperlink r:id="rId77">
+      <w:hyperlink r:id="rId89">
         <w:r>
           <w:rPr>
             <w:rStyle w:val="Hyperlink"/>
@@ -2527,8 +2937,8 @@
         </w:r>
       </w:hyperlink>
     </w:p>
-    <w:bookmarkEnd w:id="78"/>
-    <w:bookmarkStart w:id="80" w:name="ref-ploton2020"/>
+    <w:bookmarkEnd w:id="90"/>
+    <w:bookmarkStart w:id="92" w:name="ref-ploton2020"/>
     <w:p>
       <w:pPr>
         <w:pStyle w:val="Bibliography"/>
@@ -2574,7 +2984,7 @@
       <w:r>
         <w:t xml:space="preserve"> </w:t>
       </w:r>
-      <w:hyperlink r:id="rId79">
+      <w:hyperlink r:id="rId91">
         <w:r>
           <w:rPr>
             <w:rStyle w:val="Hyperlink"/>
@@ -2583,8 +2993,8 @@
         </w:r>
       </w:hyperlink>
     </w:p>
-    <w:bookmarkEnd w:id="80"/>
-    <w:bookmarkStart w:id="82" w:name="ref-rahmanm2025"/>
+    <w:bookmarkEnd w:id="92"/>
+    <w:bookmarkStart w:id="94" w:name="ref-rahmanm2025"/>
     <w:p>
       <w:pPr>
         <w:pStyle w:val="Bibliography"/>
@@ -2630,7 +3040,7 @@
       <w:r>
         <w:t xml:space="preserve"> </w:t>
       </w:r>
-      <w:hyperlink r:id="rId81">
+      <w:hyperlink r:id="rId93">
         <w:r>
           <w:rPr>
             <w:rStyle w:val="Hyperlink"/>
@@ -2639,8 +3049,8 @@
         </w:r>
       </w:hyperlink>
     </w:p>
-    <w:bookmarkEnd w:id="82"/>
-    <w:bookmarkStart w:id="84" w:name="ref-roberts2017"/>
+    <w:bookmarkEnd w:id="94"/>
+    <w:bookmarkStart w:id="96" w:name="ref-roberts2017"/>
     <w:p>
       <w:pPr>
         <w:pStyle w:val="Bibliography"/>
@@ -2686,7 +3096,7 @@
       <w:r>
         <w:t xml:space="preserve"> </w:t>
       </w:r>
-      <w:hyperlink r:id="rId83">
+      <w:hyperlink r:id="rId95">
         <w:r>
           <w:rPr>
             <w:rStyle w:val="Hyperlink"/>
@@ -2695,8 +3105,8 @@
         </w:r>
       </w:hyperlink>
     </w:p>
-    <w:bookmarkEnd w:id="84"/>
-    <w:bookmarkStart w:id="86" w:name="ref-rudra2023"/>
+    <w:bookmarkEnd w:id="96"/>
+    <w:bookmarkStart w:id="98" w:name="ref-rudra2023"/>
     <w:p>
       <w:pPr>
         <w:pStyle w:val="Bibliography"/>
@@ -2742,7 +3152,7 @@
       <w:r>
         <w:t xml:space="preserve"> </w:t>
       </w:r>
-      <w:hyperlink r:id="rId85">
+      <w:hyperlink r:id="rId97">
         <w:r>
           <w:rPr>
             <w:rStyle w:val="Hyperlink"/>
@@ -2751,8 +3161,8 @@
         </w:r>
       </w:hyperlink>
     </w:p>
-    <w:bookmarkEnd w:id="86"/>
-    <w:bookmarkStart w:id="88" w:name="ref-schotten2023"/>
+    <w:bookmarkEnd w:id="98"/>
+    <w:bookmarkStart w:id="100" w:name="ref-schotten2023"/>
     <w:p>
       <w:pPr>
         <w:pStyle w:val="Bibliography"/>
@@ -2798,7 +3208,7 @@
       <w:r>
         <w:t xml:space="preserve"> </w:t>
       </w:r>
-      <w:hyperlink r:id="rId87">
+      <w:hyperlink r:id="rId99">
         <w:r>
           <w:rPr>
             <w:rStyle w:val="Hyperlink"/>
@@ -2807,23 +3217,14 @@
         </w:r>
       </w:hyperlink>
     </w:p>
-    <w:bookmarkEnd w:id="88"/>
-    <w:bookmarkStart w:id="90" w:name="ref-sherpa2022"/>
+    <w:bookmarkEnd w:id="100"/>
+    <w:bookmarkStart w:id="102" w:name="ref-sharma2026"/>
     <w:p>
       <w:pPr>
         <w:pStyle w:val="Bibliography"/>
       </w:pPr>
       <w:r>
-        <w:t xml:space="preserve">Sherpa, S. F., &amp; Shirzaei, M. (2022).</w:t>
-      </w:r>
-      <w:r>
-        <w:t xml:space="preserve"> </w:t>
-      </w:r>
-      <w:r>
-        <w:t xml:space="preserve">Country-wide flood exposure analysis using Sentinel-1 synthetic aperture radar data: Case study of 2019 Iran flood</w:t>
-      </w:r>
-      <w:r>
-        <w:t xml:space="preserve">.</w:t>
+        <w:t xml:space="preserve">Sharma, P., &amp; Sharma, S. (2026).</w:t>
       </w:r>
       <w:r>
         <w:t xml:space="preserve"> </w:t>
@@ -2833,19 +3234,90 @@
           <w:i/>
           <w:iCs/>
         </w:rPr>
-        <w:t xml:space="preserve">Journal of Flood Risk Management</w:t>
-      </w:r>
-      <w:r>
-        <w:t xml:space="preserve">,</w:t>
-      </w:r>
-      <w:r>
-        <w:t xml:space="preserve"> </w:t>
+        <w:t xml:space="preserve">Flood risk follows valleys, not grids: Graph neural networks for flash flood susceptibility mapping in</w:t>
       </w:r>
       <w:r>
         <w:rPr>
           <w:i/>
           <w:iCs/>
         </w:rPr>
+        <w:t xml:space="preserve"> </w:t>
+      </w:r>
+      <w:r>
+        <w:rPr>
+          <w:i/>
+          <w:iCs/>
+        </w:rPr>
+        <w:t xml:space="preserve">Himachal Pradesh</w:t>
+      </w:r>
+      <w:r>
+        <w:rPr>
+          <w:i/>
+          <w:iCs/>
+        </w:rPr>
+        <w:t xml:space="preserve"> </w:t>
+      </w:r>
+      <w:r>
+        <w:rPr>
+          <w:i/>
+          <w:iCs/>
+        </w:rPr>
+        <w:t xml:space="preserve">with conformal uncertainty quantification</w:t>
+      </w:r>
+      <w:r>
+        <w:t xml:space="preserve">. arXiv preprint 2603.15681, not peer reviewed.</w:t>
+      </w:r>
+      <w:r>
+        <w:t xml:space="preserve"> </w:t>
+      </w:r>
+      <w:hyperlink r:id="rId101">
+        <w:r>
+          <w:rPr>
+            <w:rStyle w:val="Hyperlink"/>
+          </w:rPr>
+          <w:t xml:space="preserve">https://doi.org/10.48550/arXiv.2603.15681</w:t>
+        </w:r>
+      </w:hyperlink>
+    </w:p>
+    <w:bookmarkEnd w:id="102"/>
+    <w:bookmarkStart w:id="104" w:name="ref-sherpa2022"/>
+    <w:p>
+      <w:pPr>
+        <w:pStyle w:val="Bibliography"/>
+      </w:pPr>
+      <w:r>
+        <w:t xml:space="preserve">Sherpa, S. F., &amp; Shirzaei, M. (2022).</w:t>
+      </w:r>
+      <w:r>
+        <w:t xml:space="preserve"> </w:t>
+      </w:r>
+      <w:r>
+        <w:t xml:space="preserve">Country-wide flood exposure analysis using Sentinel-1 synthetic aperture radar data: Case study of 2019 Iran flood</w:t>
+      </w:r>
+      <w:r>
+        <w:t xml:space="preserve">.</w:t>
+      </w:r>
+      <w:r>
+        <w:t xml:space="preserve"> </w:t>
+      </w:r>
+      <w:r>
+        <w:rPr>
+          <w:i/>
+          <w:iCs/>
+        </w:rPr>
+        <w:t xml:space="preserve">Journal of Flood Risk Management</w:t>
+      </w:r>
+      <w:r>
+        <w:t xml:space="preserve">,</w:t>
+      </w:r>
+      <w:r>
+        <w:t xml:space="preserve"> </w:t>
+      </w:r>
+      <w:r>
+        <w:rPr>
+          <w:i/>
+          <w:iCs/>
+        </w:rPr>
         <w:t xml:space="preserve">15</w:t>
       </w:r>
       <w:r>
@@ -2854,7 +3326,7 @@
       <w:r>
         <w:t xml:space="preserve"> </w:t>
       </w:r>
-      <w:hyperlink r:id="rId89">
+      <w:hyperlink r:id="rId103">
         <w:r>
           <w:rPr>
             <w:rStyle w:val="Hyperlink"/>
@@ -2863,20 +3335,32 @@
         </w:r>
       </w:hyperlink>
     </w:p>
-    <w:bookmarkEnd w:id="90"/>
-    <w:bookmarkStart w:id="92" w:name="ref-talukdar2020"/>
+    <w:bookmarkEnd w:id="104"/>
+    <w:bookmarkStart w:id="106" w:name="ref-swarup2026"/>
     <w:p>
       <w:pPr>
         <w:pStyle w:val="Bibliography"/>
       </w:pPr>
       <w:r>
-        <w:t xml:space="preserve">Talukdar, S., Ghose, B., Shahfahad, Salam, R., Mahato, S., Pham, Q. B., Linh, N. T. T., Costache, R., &amp; Avand, M. (2020).</w:t>
-      </w:r>
-      <w:r>
-        <w:t xml:space="preserve"> </w:t>
-      </w:r>
-      <w:r>
-        <w:t xml:space="preserve">Flood susceptibility modeling in Teesta River basin, Bangladesh using novel ensembles of bagging algorithms</w:t>
+        <w:t xml:space="preserve">Swarup, S. D., &amp; Nury, A. H. (2026). Flood risk prioritization in data-scarce regions: A tri-dimensional</w:t>
+      </w:r>
+      <w:r>
+        <w:t xml:space="preserve"> </w:t>
+      </w:r>
+      <w:r>
+        <w:t xml:space="preserve">GIS-AHP</w:t>
+      </w:r>
+      <w:r>
+        <w:t xml:space="preserve"> </w:t>
+      </w:r>
+      <w:r>
+        <w:t xml:space="preserve">framework for northeastern</w:t>
+      </w:r>
+      <w:r>
+        <w:t xml:space="preserve"> </w:t>
+      </w:r>
+      <w:r>
+        <w:t xml:space="preserve">Bangladesh</w:t>
       </w:r>
       <w:r>
         <w:t xml:space="preserve">.</w:t>
@@ -2889,7 +3373,7 @@
           <w:i/>
           <w:iCs/>
         </w:rPr>
-        <w:t xml:space="preserve">Stochastic Environmental Research and Risk Assessment</w:t>
+        <w:t xml:space="preserve">Journal of Water and Climate Change</w:t>
       </w:r>
       <w:r>
         <w:t xml:space="preserve">,</w:t>
@@ -2902,6 +3386,62 @@
           <w:i/>
           <w:iCs/>
         </w:rPr>
+        <w:t xml:space="preserve">17</w:t>
+      </w:r>
+      <w:r>
+        <w:t xml:space="preserve">, 1229–1256.</w:t>
+      </w:r>
+      <w:r>
+        <w:t xml:space="preserve"> </w:t>
+      </w:r>
+      <w:hyperlink r:id="rId105">
+        <w:r>
+          <w:rPr>
+            <w:rStyle w:val="Hyperlink"/>
+          </w:rPr>
+          <w:t xml:space="preserve">https://doi.org/10.2166/wcc.2026.264</w:t>
+        </w:r>
+      </w:hyperlink>
+    </w:p>
+    <w:bookmarkEnd w:id="106"/>
+    <w:bookmarkStart w:id="108" w:name="ref-talukdar2020"/>
+    <w:p>
+      <w:pPr>
+        <w:pStyle w:val="Bibliography"/>
+      </w:pPr>
+      <w:r>
+        <w:t xml:space="preserve">Talukdar, S., Ghose, B., Shahfahad, Salam, R., Mahato, S., Pham, Q. B., Linh, N. T. T., Costache, R., &amp; Avand, M. (2020).</w:t>
+      </w:r>
+      <w:r>
+        <w:t xml:space="preserve"> </w:t>
+      </w:r>
+      <w:r>
+        <w:t xml:space="preserve">Flood susceptibility modeling in Teesta River basin, Bangladesh using novel ensembles of bagging algorithms</w:t>
+      </w:r>
+      <w:r>
+        <w:t xml:space="preserve">.</w:t>
+      </w:r>
+      <w:r>
+        <w:t xml:space="preserve"> </w:t>
+      </w:r>
+      <w:r>
+        <w:rPr>
+          <w:i/>
+          <w:iCs/>
+        </w:rPr>
+        <w:t xml:space="preserve">Stochastic Environmental Research and Risk Assessment</w:t>
+      </w:r>
+      <w:r>
+        <w:t xml:space="preserve">,</w:t>
+      </w:r>
+      <w:r>
+        <w:t xml:space="preserve"> </w:t>
+      </w:r>
+      <w:r>
+        <w:rPr>
+          <w:i/>
+          <w:iCs/>
+        </w:rPr>
         <w:t xml:space="preserve">34</w:t>
       </w:r>
       <w:r>
@@ -2910,7 +3450,7 @@
       <w:r>
         <w:t xml:space="preserve"> </w:t>
       </w:r>
-      <w:hyperlink r:id="rId91">
+      <w:hyperlink r:id="rId107">
         <w:r>
           <w:rPr>
             <w:rStyle w:val="Hyperlink"/>
@@ -2919,8 +3459,8 @@
         </w:r>
       </w:hyperlink>
     </w:p>
-    <w:bookmarkEnd w:id="92"/>
-    <w:bookmarkStart w:id="94" w:name="ref-tellman2021"/>
+    <w:bookmarkEnd w:id="108"/>
+    <w:bookmarkStart w:id="110" w:name="ref-tellman2021"/>
     <w:p>
       <w:pPr>
         <w:pStyle w:val="Bibliography"/>
@@ -2966,7 +3506,7 @@
       <w:r>
         <w:t xml:space="preserve"> </w:t>
       </w:r>
-      <w:hyperlink r:id="rId93">
+      <w:hyperlink r:id="rId109">
         <w:r>
           <w:rPr>
             <w:rStyle w:val="Hyperlink"/>
@@ -2975,23 +3515,14 @@
         </w:r>
       </w:hyperlink>
     </w:p>
-    <w:bookmarkEnd w:id="94"/>
-    <w:bookmarkStart w:id="96" w:name="ref-twele2016"/>
+    <w:bookmarkEnd w:id="110"/>
+    <w:bookmarkStart w:id="112" w:name="ref-thomas2023"/>
     <w:p>
       <w:pPr>
         <w:pStyle w:val="Bibliography"/>
       </w:pPr>
       <w:r>
-        <w:t xml:space="preserve">Twele, A., Cao, W., Plank, S., &amp; Martinis, S. (2016).</w:t>
-      </w:r>
-      <w:r>
-        <w:t xml:space="preserve"> </w:t>
-      </w:r>
-      <w:r>
-        <w:t xml:space="preserve">Sentinel-1-based flood mapping: a fully automated processing chain</w:t>
-      </w:r>
-      <w:r>
-        <w:t xml:space="preserve">.</w:t>
+        <w:t xml:space="preserve">Thomas, M., Tellman, E., Osgood, D., DeVries, B., Islam, A., Steckler, M., Goodman, M., &amp; Billah, M. (2023). A framework to assess remote sensing algorithms for satellite-based flood index insurance.</w:t>
       </w:r>
       <w:r>
         <w:t xml:space="preserve"> </w:t>
@@ -3001,7 +3532,7 @@
           <w:i/>
           <w:iCs/>
         </w:rPr>
-        <w:t xml:space="preserve">International Journal of Remote Sensing</w:t>
+        <w:t xml:space="preserve">IEEE Journal of Selected Topics in Applied Earth Observations and Remote Sensing</w:t>
       </w:r>
       <w:r>
         <w:t xml:space="preserve">,</w:t>
@@ -3014,6 +3545,62 @@
           <w:i/>
           <w:iCs/>
         </w:rPr>
+        <w:t xml:space="preserve">16</w:t>
+      </w:r>
+      <w:r>
+        <w:t xml:space="preserve">, 2589–2604.</w:t>
+      </w:r>
+      <w:r>
+        <w:t xml:space="preserve"> </w:t>
+      </w:r>
+      <w:hyperlink r:id="rId111">
+        <w:r>
+          <w:rPr>
+            <w:rStyle w:val="Hyperlink"/>
+          </w:rPr>
+          <w:t xml:space="preserve">https://doi.org/10.1109/JSTARS.2023.3244098</w:t>
+        </w:r>
+      </w:hyperlink>
+    </w:p>
+    <w:bookmarkEnd w:id="112"/>
+    <w:bookmarkStart w:id="114" w:name="ref-twele2016"/>
+    <w:p>
+      <w:pPr>
+        <w:pStyle w:val="Bibliography"/>
+      </w:pPr>
+      <w:r>
+        <w:t xml:space="preserve">Twele, A., Cao, W., Plank, S., &amp; Martinis, S. (2016).</w:t>
+      </w:r>
+      <w:r>
+        <w:t xml:space="preserve"> </w:t>
+      </w:r>
+      <w:r>
+        <w:t xml:space="preserve">Sentinel-1-based flood mapping: a fully automated processing chain</w:t>
+      </w:r>
+      <w:r>
+        <w:t xml:space="preserve">.</w:t>
+      </w:r>
+      <w:r>
+        <w:t xml:space="preserve"> </w:t>
+      </w:r>
+      <w:r>
+        <w:rPr>
+          <w:i/>
+          <w:iCs/>
+        </w:rPr>
+        <w:t xml:space="preserve">International Journal of Remote Sensing</w:t>
+      </w:r>
+      <w:r>
+        <w:t xml:space="preserve">,</w:t>
+      </w:r>
+      <w:r>
+        <w:t xml:space="preserve"> </w:t>
+      </w:r>
+      <w:r>
+        <w:rPr>
+          <w:i/>
+          <w:iCs/>
+        </w:rPr>
         <w:t xml:space="preserve">37</w:t>
       </w:r>
       <w:r>
@@ -3022,7 +3609,7 @@
       <w:r>
         <w:t xml:space="preserve"> </w:t>
       </w:r>
-      <w:hyperlink r:id="rId95">
+      <w:hyperlink r:id="rId113">
         <w:r>
           <w:rPr>
             <w:rStyle w:val="Hyperlink"/>
@@ -3031,8 +3618,8 @@
         </w:r>
       </w:hyperlink>
     </w:p>
-    <w:bookmarkEnd w:id="96"/>
-    <w:bookmarkStart w:id="98" w:name="ref-uddin2019"/>
+    <w:bookmarkEnd w:id="114"/>
+    <w:bookmarkStart w:id="116" w:name="ref-uddin2019"/>
     <w:p>
       <w:pPr>
         <w:pStyle w:val="Bibliography"/>
@@ -3078,7 +3665,7 @@
       <w:r>
         <w:t xml:space="preserve"> </w:t>
       </w:r>
-      <w:hyperlink r:id="rId97">
+      <w:hyperlink r:id="rId115">
         <w:r>
           <w:rPr>
             <w:rStyle w:val="Hyperlink"/>
@@ -3087,8 +3674,8 @@
         </w:r>
       </w:hyperlink>
     </w:p>
-    <w:bookmarkEnd w:id="98"/>
-    <w:bookmarkStart w:id="100" w:name="ref-unspider"/>
+    <w:bookmarkEnd w:id="116"/>
+    <w:bookmarkStart w:id="118" w:name="ref-unspider"/>
     <w:p>
       <w:pPr>
         <w:pStyle w:val="Bibliography"/>
@@ -3112,7 +3699,7 @@
       <w:r>
         <w:t xml:space="preserve"> </w:t>
       </w:r>
-      <w:hyperlink r:id="rId99">
+      <w:hyperlink r:id="rId117">
         <w:r>
           <w:rPr>
             <w:rStyle w:val="Hyperlink"/>
@@ -3124,8 +3711,8 @@
         <w:t xml:space="preserve">.</w:t>
       </w:r>
     </w:p>
-    <w:bookmarkEnd w:id="100"/>
-    <w:bookmarkStart w:id="102" w:name="ref-wadoux2021"/>
+    <w:bookmarkEnd w:id="118"/>
+    <w:bookmarkStart w:id="120" w:name="ref-wadoux2021"/>
     <w:p>
       <w:pPr>
         <w:pStyle w:val="Bibliography"/>
@@ -3171,7 +3758,7 @@
       <w:r>
         <w:t xml:space="preserve"> </w:t>
       </w:r>
-      <w:hyperlink r:id="rId101">
+      <w:hyperlink r:id="rId119">
         <w:r>
           <w:rPr>
             <w:rStyle w:val="Hyperlink"/>
@@ -3180,8 +3767,8 @@
         </w:r>
       </w:hyperlink>
     </w:p>
-    <w:bookmarkEnd w:id="102"/>
-    <w:bookmarkStart w:id="104" w:name="ref-waleed2025"/>
+    <w:bookmarkEnd w:id="120"/>
+    <w:bookmarkStart w:id="122" w:name="ref-waleed2025"/>
     <w:p>
       <w:pPr>
         <w:pStyle w:val="Bibliography"/>
@@ -3227,7 +3814,7 @@
       <w:r>
         <w:t xml:space="preserve"> </w:t>
       </w:r>
-      <w:hyperlink r:id="rId103">
+      <w:hyperlink r:id="rId121">
         <w:r>
           <w:rPr>
             <w:rStyle w:val="Hyperlink"/>
@@ -3236,8 +3823,8 @@
         </w:r>
       </w:hyperlink>
     </w:p>
-    <w:bookmarkEnd w:id="104"/>
-    <w:bookmarkStart w:id="106" w:name="ref-wang2023"/>
+    <w:bookmarkEnd w:id="122"/>
+    <w:bookmarkStart w:id="124" w:name="ref-wang2023"/>
     <w:p>
       <w:pPr>
         <w:pStyle w:val="Bibliography"/>
@@ -3283,7 +3870,7 @@
       <w:r>
         <w:t xml:space="preserve"> </w:t>
       </w:r>
-      <w:hyperlink r:id="rId105">
+      <w:hyperlink r:id="rId123">
         <w:r>
           <w:rPr>
             <w:rStyle w:val="Hyperlink"/>
@@ -3292,23 +3879,14 @@
         </w:r>
       </w:hyperlink>
     </w:p>
-    <w:bookmarkEnd w:id="106"/>
-    <w:bookmarkStart w:id="108" w:name="ref-williams2025"/>
+    <w:bookmarkEnd w:id="124"/>
+    <w:bookmarkStart w:id="126" w:name="ref-wanggat2023"/>
     <w:p>
       <w:pPr>
         <w:pStyle w:val="Bibliography"/>
       </w:pPr>
       <w:r>
-        <w:t xml:space="preserve">Williams, J. H., Vu, H. N., Paulik, R., Zorn, C., &amp; Wotherspoon, L. (2025).</w:t>
-      </w:r>
-      <w:r>
-        <w:t xml:space="preserve"> </w:t>
-      </w:r>
-      <w:r>
-        <w:t xml:space="preserve">Expert-Derived Flood Damage Curves for Critical Infrastructure Network Components</w:t>
-      </w:r>
-      <w:r>
-        <w:t xml:space="preserve">.</w:t>
+        <w:t xml:space="preserve">Wang, Z., Lyu, H., &amp; Zhang, C. (2023). Pluvial flood susceptibility mapping for data-scarce urban areas using graph attention network and basic flood conditioning factors.</w:t>
       </w:r>
       <w:r>
         <w:t xml:space="preserve"> </w:t>
@@ -3318,7 +3896,7 @@
           <w:i/>
           <w:iCs/>
         </w:rPr>
-        <w:t xml:space="preserve">Journal of Flood Risk Management</w:t>
+        <w:t xml:space="preserve">Geocarto International</w:t>
       </w:r>
       <w:r>
         <w:t xml:space="preserve">,</w:t>
@@ -3331,6 +3909,62 @@
           <w:i/>
           <w:iCs/>
         </w:rPr>
+        <w:t xml:space="preserve">38</w:t>
+      </w:r>
+      <w:r>
+        <w:t xml:space="preserve">, 2275692.</w:t>
+      </w:r>
+      <w:r>
+        <w:t xml:space="preserve"> </w:t>
+      </w:r>
+      <w:hyperlink r:id="rId125">
+        <w:r>
+          <w:rPr>
+            <w:rStyle w:val="Hyperlink"/>
+          </w:rPr>
+          <w:t xml:space="preserve">https://doi.org/10.1080/10106049.2023.2275692</w:t>
+        </w:r>
+      </w:hyperlink>
+    </w:p>
+    <w:bookmarkEnd w:id="126"/>
+    <w:bookmarkStart w:id="128" w:name="ref-williams2025"/>
+    <w:p>
+      <w:pPr>
+        <w:pStyle w:val="Bibliography"/>
+      </w:pPr>
+      <w:r>
+        <w:t xml:space="preserve">Williams, J. H., Vu, H. N., Paulik, R., Zorn, C., &amp; Wotherspoon, L. (2025).</w:t>
+      </w:r>
+      <w:r>
+        <w:t xml:space="preserve"> </w:t>
+      </w:r>
+      <w:r>
+        <w:t xml:space="preserve">Expert-Derived Flood Damage Curves for Critical Infrastructure Network Components</w:t>
+      </w:r>
+      <w:r>
+        <w:t xml:space="preserve">.</w:t>
+      </w:r>
+      <w:r>
+        <w:t xml:space="preserve"> </w:t>
+      </w:r>
+      <w:r>
+        <w:rPr>
+          <w:i/>
+          <w:iCs/>
+        </w:rPr>
+        <w:t xml:space="preserve">Journal of Flood Risk Management</w:t>
+      </w:r>
+      <w:r>
+        <w:t xml:space="preserve">,</w:t>
+      </w:r>
+      <w:r>
+        <w:t xml:space="preserve"> </w:t>
+      </w:r>
+      <w:r>
+        <w:rPr>
+          <w:i/>
+          <w:iCs/>
+        </w:rPr>
         <w:t xml:space="preserve">18</w:t>
       </w:r>
       <w:r>
@@ -3339,7 +3973,7 @@
       <w:r>
         <w:t xml:space="preserve"> </w:t>
       </w:r>
-      <w:hyperlink r:id="rId107">
+      <w:hyperlink r:id="rId127">
         <w:r>
           <w:rPr>
             <w:rStyle w:val="Hyperlink"/>
@@ -3348,8 +3982,8 @@
         </w:r>
       </w:hyperlink>
     </w:p>
-    <w:bookmarkEnd w:id="108"/>
-    <w:bookmarkStart w:id="110" w:name="ref-zadrozny2002"/>
+    <w:bookmarkEnd w:id="128"/>
+    <w:bookmarkStart w:id="130" w:name="ref-zadrozny2002"/>
     <w:p>
       <w:pPr>
         <w:pStyle w:val="Bibliography"/>
@@ -3382,7 +4016,7 @@
       <w:r>
         <w:t xml:space="preserve"> </w:t>
       </w:r>
-      <w:hyperlink r:id="rId109">
+      <w:hyperlink r:id="rId129">
         <w:r>
           <w:rPr>
             <w:rStyle w:val="Hyperlink"/>
@@ -3391,8 +4025,8 @@
         </w:r>
       </w:hyperlink>
     </w:p>
-    <w:bookmarkEnd w:id="110"/>
-    <w:bookmarkStart w:id="112" w:name="ref-zzaman2021"/>
+    <w:bookmarkEnd w:id="130"/>
+    <w:bookmarkStart w:id="132" w:name="ref-zzaman2021"/>
     <w:p>
       <w:pPr>
         <w:pStyle w:val="Bibliography"/>
@@ -3438,7 +4072,7 @@
       <w:r>
         <w:t xml:space="preserve"> </w:t>
       </w:r>
-      <w:hyperlink r:id="rId111">
+      <w:hyperlink r:id="rId131">
         <w:r>
           <w:rPr>
             <w:rStyle w:val="Hyperlink"/>
@@ -3447,10 +4081,10 @@
         </w:r>
       </w:hyperlink>
     </w:p>
-    <w:bookmarkEnd w:id="112"/>
-    <w:bookmarkEnd w:id="113"/>
-    <w:bookmarkEnd w:id="114"/>
-    <w:bookmarkStart w:id="122" w:name="tables"/>
+    <w:bookmarkEnd w:id="132"/>
+    <w:bookmarkEnd w:id="133"/>
+    <w:bookmarkEnd w:id="134"/>
+    <w:bookmarkStart w:id="142" w:name="tables"/>
     <w:p>
       <w:pPr>
         <w:pStyle w:val="Heading1"/>
@@ -3459,13 +4093,22 @@
         <w:t xml:space="preserve">Tables</w:t>
       </w:r>
     </w:p>
-    <w:bookmarkStart w:id="115" w:name="tab:litflood"/>
+    <w:bookmarkStart w:id="135" w:name="tab:litflood"/>
     <w:p>
       <w:pPr>
         <w:pStyle w:val="TableCaption"/>
       </w:pPr>
       <w:r>
-        <w:t xml:space="preserve">Table 1. Flood susceptibility studies in Bangladesh compared with this system. Every study was read in full, and where a figure is given for training and validation separately the validation figure is shown. This system’s figures are means over 20 assignments of spatially held-out blocks, scored against observed floods, so the columns are not directly comparable, for the reasons given in the text.</w:t>
+        <w:t xml:space="preserve">Table 1. Flood susceptibility studies in Bangladesh compared with this system. Every study was read in full except</w:t>
+      </w:r>
+      <w:r>
+        <w:t xml:space="preserve"> </w:t>
+      </w:r>
+      <w:r>
+        <w:t xml:space="preserve">Swarup &amp; Nury (2026)</w:t>
+      </w:r>
+      <w:r>
+        <w:t xml:space="preserve">, whose entries come from its abstract, and where a figure is given for training and validation separately the validation figure is shown. This system’s figures are means over 20 assignments of spatially held-out blocks, scored against observed floods, so the columns are not directly comparable, for the reasons given in the text.</w:t>
       </w:r>
     </w:p>
     <w:tbl>
@@ -3473,7 +4116,7 @@
         <w:tblStyle w:val="Table"/>
         <w:tblW w:type="auto" w:w="0"/>
         <w:tblLook w:firstRow="1" w:lastRow="0" w:firstColumn="0" w:lastColumn="0" w:noHBand="0" w:noVBand="0" w:val="0020"/>
-        <w:tblCaption w:val="Table 1. Flood susceptibility studies in Bangladesh compared with this system. Every study was read in full, and where a figure is given for training and validation separately the validation figure is shown. This system’s figures are means over 20 assignments of spatially held-out blocks, scored against observed floods, so the columns are not directly comparable, for the reasons given in the text."/>
+        <w:tblCaption w:val="Table 1. Flood susceptibility studies in Bangladesh compared with this system. Every study was read in full except Swarup &amp; Nury (2026), whose entries come from its abstract, and where a figure is given for training and validation separately the validation figure is shown. This system’s figures are means over 20 assignments of spatially held-out blocks, scored against observed floods, so the columns are not directly comparable, for the reasons given in the text."/>
       </w:tblPr>
       <w:tblGrid>
         <w:gridCol w:w="1584"/>
@@ -3804,6 +4447,68 @@
               <w:jc w:val="left"/>
             </w:pPr>
             <w:r>
+              <w:t xml:space="preserve">Swarup &amp; Nury (2026)</w:t>
+            </w:r>
+          </w:p>
+        </w:tc>
+        <w:tc>
+          <w:tcPr/>
+          <w:p>
+            <w:pPr>
+              <w:pStyle w:val="Compact"/>
+              <w:jc w:val="left"/>
+            </w:pPr>
+            <w:r>
+              <w:t xml:space="preserve">Sylhet division</w:t>
+            </w:r>
+          </w:p>
+        </w:tc>
+        <w:tc>
+          <w:tcPr/>
+          <w:p>
+            <w:pPr>
+              <w:pStyle w:val="Compact"/>
+              <w:jc w:val="left"/>
+            </w:pPr>
+            <w:r>
+              <w:t xml:space="preserve">AHP, 19 indicators</w:t>
+            </w:r>
+          </w:p>
+        </w:tc>
+        <w:tc>
+          <w:tcPr/>
+          <w:p>
+            <w:pPr>
+              <w:pStyle w:val="Compact"/>
+              <w:jc w:val="left"/>
+            </w:pPr>
+            <w:r>
+              <w:t xml:space="preserve">independent flood inventories of June 2022 and June 2024, no training data</w:t>
+            </w:r>
+          </w:p>
+        </w:tc>
+        <w:tc>
+          <w:tcPr/>
+          <w:p>
+            <w:pPr>
+              <w:pStyle w:val="Compact"/>
+              <w:jc w:val="left"/>
+            </w:pPr>
+            <w:r>
+              <w:t xml:space="preserve">AUC 0.836 (2022), 0.794 (2024)</w:t>
+            </w:r>
+          </w:p>
+        </w:tc>
+      </w:tr>
+      <w:tr>
+        <w:tc>
+          <w:tcPr/>
+          <w:p>
+            <w:pPr>
+              <w:pStyle w:val="Compact"/>
+              <w:jc w:val="left"/>
+            </w:pPr>
+            <w:r>
               <w:t xml:space="preserve">Adnan et al. (2023)</w:t>
             </w:r>
           </w:p>
@@ -4058,8 +4763,8 @@
         </w:tc>
       </w:tr>
     </w:tbl>
-    <w:bookmarkEnd w:id="115"/>
-    <w:bookmarkStart w:id="116" w:name="tab:regions"/>
+    <w:bookmarkEnd w:id="135"/>
+    <w:bookmarkStart w:id="136" w:name="tab:regions"/>
     <w:p>
       <w:pPr>
         <w:pStyle w:val="TableCaption"/>
@@ -4294,8 +4999,8 @@
         </w:tc>
       </w:tr>
     </w:tbl>
-    <w:bookmarkEnd w:id="116"/>
-    <w:bookmarkStart w:id="117" w:name="tab:data"/>
+    <w:bookmarkEnd w:id="136"/>
+    <w:bookmarkStart w:id="137" w:name="tab:data"/>
     <w:p>
       <w:pPr>
         <w:pStyle w:val="TableCaption"/>
@@ -4671,8 +5376,8 @@
         </w:tc>
       </w:tr>
     </w:tbl>
-    <w:bookmarkEnd w:id="117"/>
-    <w:bookmarkStart w:id="118" w:name="tab:events"/>
+    <w:bookmarkEnd w:id="137"/>
+    <w:bookmarkStart w:id="138" w:name="tab:events"/>
     <w:p>
       <w:pPr>
         <w:pStyle w:val="TableCaption"/>
@@ -5189,8 +5894,8 @@
         </w:tc>
       </w:tr>
     </w:tbl>
-    <w:bookmarkEnd w:id="118"/>
-    <w:bookmarkStart w:id="119" w:name="tab:validation"/>
+    <w:bookmarkEnd w:id="138"/>
+    <w:bookmarkStart w:id="139" w:name="tab:validation"/>
     <w:p>
       <w:pPr>
         <w:pStyle w:val="TableCaption"/>
@@ -5563,8 +6268,8 @@
         </w:tc>
       </w:tr>
     </w:tbl>
-    <w:bookmarkEnd w:id="119"/>
-    <w:bookmarkStart w:id="120" w:name="tab:temporal"/>
+    <w:bookmarkEnd w:id="139"/>
+    <w:bookmarkStart w:id="140" w:name="tab:temporal"/>
     <w:p>
       <w:pPr>
         <w:pStyle w:val="TableCaption"/>
@@ -6009,8 +6714,8 @@
         </w:tc>
       </w:tr>
     </w:tbl>
-    <w:bookmarkEnd w:id="120"/>
-    <w:bookmarkStart w:id="121" w:name="tab:benchmark"/>
+    <w:bookmarkEnd w:id="140"/>
+    <w:bookmarkStart w:id="141" w:name="tab:benchmark"/>
     <w:p>
       <w:pPr>
         <w:pStyle w:val="TableCaption"/>
@@ -6658,9 +7363,9 @@
         </w:tc>
       </w:tr>
     </w:tbl>
-    <w:bookmarkEnd w:id="121"/>
-    <w:bookmarkEnd w:id="122"/>
-    <w:bookmarkStart w:id="123" w:name="figure-legends"/>
+    <w:bookmarkEnd w:id="141"/>
+    <w:bookmarkEnd w:id="142"/>
+    <w:bookmarkStart w:id="143" w:name="figure-legends"/>
     <w:p>
       <w:pPr>
         <w:pStyle w:val="Heading1"/>
@@ -6809,7 +7514,7 @@
         <w:t xml:space="preserve">Loss in AUC on the held-out test blocks when each feature is shuffled across the test assets, as mean and standard deviation over 20 block assignments, for the default gradient-boosted model. The AUC in each title is the mean before shuffling.</w:t>
       </w:r>
     </w:p>
-    <w:bookmarkEnd w:id="123"/>
+    <w:bookmarkEnd w:id="143"/>
     <w:sectPr>
       <w:footnotePr>
         <w:numRestart w:val="eachSect"/>

</xml_diff>

<commit_message>
Flood paper and SI: announcing sentences merged into the sentences they introduce
</commit_message>
<xml_diff>
--- a/docs/paper/submission/manuscript.docx
+++ b/docs/paper/submission/manuscript.docx
@@ -97,7 +97,7 @@
         <w:pStyle w:val="BodyText"/>
       </w:pPr>
       <w:r>
-        <w:t xml:space="preserve">Both choices can now be made differently. Sentinel-1 radar sees through monsoon cloud and has been processed into flood maps with overall accuracies above 94 %</w:t>
+        <w:t xml:space="preserve">Both choices can now be made differently, because Sentinel-1 radar sees through monsoon cloud and has been processed into flood maps with overall accuracies above 94 %</w:t>
       </w:r>
       <w:r>
         <w:t xml:space="preserve"> </w:t>
@@ -288,7 +288,7 @@
         <w:pStyle w:val="FirstParagraph"/>
       </w:pPr>
       <w:r>
-        <w:t xml:space="preserve">Radar offers training labels that cover every pixel. Sentinel-1 flood maps have reached overall accuracies of 94.0–96.1 %</w:t>
+        <w:t xml:space="preserve">Radar offers training labels that cover every pixel, and Sentinel-1 flood maps have reached overall accuracies of 94.0–96.1 %</w:t>
       </w:r>
       <w:r>
         <w:t xml:space="preserve"> </w:t>
@@ -309,7 +309,7 @@
         <w:t xml:space="preserve">(Uddin et al., 2019)</w:t>
       </w:r>
       <w:r>
-        <w:t xml:space="preserve">, and daily MODIS imagery has mapped 913 large floods worldwide</w:t>
+        <w:t xml:space="preserve">. Daily MODIS imagery has mapped 913 large floods worldwide</w:t>
       </w:r>
       <w:r>
         <w:t xml:space="preserve"> </w:t>
@@ -633,7 +633,7 @@
         <w:pStyle w:val="FirstParagraph"/>
       </w:pPr>
       <w:r>
-        <w:t xml:space="preserve">Three regions with contrasting flood regimes are studied, riverine flooding in Rangpur and Rajshahi, flash flooding in the Sylhet haor basin and cyclone surge on the south-west coast (Fig. 1a, Table 2), and they share one set of model settings so that results stay comparable. The regions differ in how water arrives. Rangpur and Rajshahi, in the north-west, lie on the floodplains of the Teesta and the Brahmaputra–Jamuna, where monsoon rivers rise above their danger levels and stay there for days to weeks, and all five mapped floods fell between late June and October (Table 4). The Sylhet region holds the haor basin, a low bowl of seasonal wetlands fed by rivers from the hills to the north and east, where flash floods rise quickly and can arrive before the monsoon, as in April 2017, when they struck before the rice harvest. The south-west coast is a delta of tidal channels and polders, embanked islands of farmland, where flooding follows the landfall of a cyclone and the overtopping or breach of embankments rather than the stage of a river. The regions hold 23,016, 13,374 and 29,545 mapped assets, across parts of 21, 10 and 16 districts. Every dataset the pipeline ingests is openly licensed (Table 3). Administrative boundaries come from geoBoundaries, which unlike GADM may be redistributed and carries the union level for Bangladesh. OpenStreetMap coverage is uneven, so an area with few mapped assets shows low exposure whether or not much stands there, and WorldPop’s constrained product carries population only where buildings were detected in imagery.</w:t>
+        <w:t xml:space="preserve">Three regions with contrasting flood regimes are studied, riverine flooding in Rangpur and Rajshahi, flash flooding in the Sylhet haor basin and cyclone surge on the south-west coast (Fig. 1a, Table 2), and they share one set of model settings so that results stay comparable. Rangpur and Rajshahi, in the north-west, lie on the floodplains of the Teesta and the Brahmaputra–Jamuna, where monsoon rivers rise above their danger levels and stay there for days to weeks, and all five mapped floods fell between late June and October (Table 4). The Sylhet region holds the haor basin, a low bowl of seasonal wetlands fed by rivers from the hills to the north and east, where flash floods rise quickly and can arrive before the monsoon, as in April 2017, when they struck before the rice harvest. The south-west coast is a delta of tidal channels and polders, embanked islands of farmland, where flooding follows the landfall of a cyclone and the overtopping or breach of embankments rather than the stage of a river. The regions hold 23,016, 13,374 and 29,545 mapped assets, across parts of 21, 10 and 16 districts. Every dataset the pipeline ingests is openly licensed (Table 3). Administrative boundaries come from geoBoundaries, which unlike GADM may be redistributed and carries the union level for Bangladesh. OpenStreetMap coverage is uneven, so an area with few mapped assets shows low exposure whether or not much stands there, and WorldPop’s constrained product carries population only where buildings were detected in imagery.</w:t>
       </w:r>
     </w:p>
     <w:bookmarkEnd w:id="16"/>
@@ -908,7 +908,7 @@
         <w:pStyle w:val="FirstParagraph"/>
       </w:pPr>
       <w:r>
-        <w:t xml:space="preserve">Two hazard surfaces cover the grid. The first interpolates the asset scores by ordinary Kriging, which can add little between assets where the scores lack spatial structure, and the fitted variograms leave 0.307 of the sill unexplained at zero distance in Rangpur and Rajshahi and 0.742 in Sylhet. The second, the default, is a class-weighted logistic regression on each cell’s own elevation, slope, TWI, HAND and flow accumulation, trained at the assets on the observed labels and blocks and evaluated at every 30 m cell. It leaves out the access distances, which describe exposure rather than the likelihood of flooding, and so follows individual channels and levees where the Kriged surface varies over tens of kilometres (Supporting Information, Fig. S1).</w:t>
+        <w:t xml:space="preserve">Of the two hazard surfaces that cover the grid, the first interpolates the asset scores by ordinary Kriging, which can add little between assets where the scores lack spatial structure. Its fitted variograms leave 0.307 of the sill unexplained at zero distance in Rangpur and Rajshahi and 0.742 in Sylhet. The second, the default, is a class-weighted logistic regression on each cell’s own elevation, slope, TWI, HAND and flow accumulation, trained at the assets on the observed labels and blocks and evaluated at every 30 m cell. It leaves out the access distances, which describe exposure rather than the likelihood of flooding, and so follows individual channels and levees where the Kriged surface varies over tens of kilometres (Supporting Information, Fig. S1).</w:t>
       </w:r>
     </w:p>
     <w:bookmarkEnd w:id="21"/>
@@ -1464,7 +1464,7 @@
         <w:pStyle w:val="FirstParagraph"/>
       </w:pPr>
       <w:r>
-        <w:t xml:space="preserve">The label source decides what a published accuracy figure measures. Terrain-threshold labels cost the model 0.101, 0.087 and 0.080 in AUC on held-out blocks. Against later floods that neither label source had seen they still cost 0.069, 0.024 and 0.071, so in Rangpur and Rajshahi and on the coast the advantage of radar labels does not depend on the test sharing their definition, while in Sylhet most of it did. The indices those labels are built on, TWI and HAND, add almost nothing to the model once elevation is known, and a model scored against labels derived from its own inputs measures its recovery of the labelling rule rather than its skill at locating floods. The mean AUCs here, 0.817 and 0.857 in the riverine regions, sit at or below the best-model AUCs of 0.87 to 0.98 in Table 1. The comparison is only indicative, since those studies split their points at random while every figure here comes from 10 km blocks the model never saw, and wider blocks lower these figures a little further (Section 5.5). Blocking has its own critics</w:t>
+        <w:t xml:space="preserve">The label source decides what a published accuracy figure measures, since terrain-threshold labels cost the model 0.101, 0.087 and 0.080 in AUC on held-out blocks. Against later floods that neither label source had seen they still cost 0.069, 0.024 and 0.071, so in Rangpur and Rajshahi and on the coast the advantage of radar labels does not depend on the test sharing their definition, while in Sylhet most of it did. The indices those labels are built on, TWI and HAND, add almost nothing to the model once elevation is known, and a model scored against labels derived from its own inputs measures its recovery of the labelling rule rather than its skill at locating floods. The mean AUCs here, 0.817 and 0.857 in the riverine regions, sit at or below the best-model AUCs of 0.87 to 0.98 in Table 1. The comparison is only indicative, since those studies split their points at random while every figure here comes from 10 km blocks the model never saw, and wider blocks lower these figures a little further (Section 5.5). Blocking has its own critics</w:t>
       </w:r>
       <w:r>
         <w:t xml:space="preserve"> </w:t>
@@ -1536,7 +1536,7 @@
         <w:pStyle w:val="FirstParagraph"/>
       </w:pPr>
       <w:r>
-        <w:t xml:space="preserve">The results bear on flood risk management in three ways. First, where Sentinel-1 has observed several floods, the record of where water has already stood was at least as good a guide to the next riverine flood as a terrain model alone, and in Rangpur and Rajshahi a better one. It costs little to compute, so agencies such as the Bangladesh Water Development Board and the Flood Forecasting and Warning Centre could publish it as a planning layer beside any susceptibility map. The terrain model adds most where the record is silent, on ground no mapped flood has reached and possibly on a coast where each surge strikes new ground, although the coastal lead did not survive wider blocks. Second, a susceptibility map used to site shelters, embankments or schools should be judged on held-out areas and later floods rather than on random splits, since the accuracy a random split reports overstates how far the map can be trusted in places it has not seen. Third, the composite risk classes rank unions within a region and must be read with their gaps, because a union without mapped assets carries no score rather than a low one. The best tabular models tested here were almost indistinguishable in AUC, so better OpenStreetMap coverage of rural unions would probably improve the map more than a new model would. Infrastructure also fails in networks, and the disruption of services beyond a flooded asset, which asset-level exposure omits, needs network modelling of the kind developed for Accra</w:t>
+        <w:t xml:space="preserve">First, where Sentinel-1 has observed several floods, the record of where water has already stood was at least as good a guide to the next riverine flood as a terrain model alone, and in Rangpur and Rajshahi a better one. It costs little to compute, so agencies such as the Bangladesh Water Development Board and the Flood Forecasting and Warning Centre could publish it as a planning layer beside any susceptibility map. The terrain model adds most where the record is silent, on ground no mapped flood has reached and possibly on a coast where each surge strikes new ground, although the coastal lead did not survive wider blocks. Second, a susceptibility map used to site shelters, embankments or schools should be judged on held-out areas and later floods rather than on random splits, since the accuracy a random split reports overstates how far the map can be trusted in places it has not seen. Third, the composite risk classes rank unions within a region and must be read with their gaps, because a union without mapped assets carries no score rather than a low one. The best tabular models tested here were almost indistinguishable in AUC, so better OpenStreetMap coverage of rural unions would probably improve the map more than a new model would. Infrastructure also fails in networks, and the disruption of services beyond a flooded asset, which asset-level exposure omits, needs network modelling of the kind developed for Accra</w:t>
       </w:r>
       <w:r>
         <w:t xml:space="preserve"> </w:t>
@@ -1572,7 +1572,7 @@
         <w:pStyle w:val="FirstParagraph"/>
       </w:pPr>
       <w:r>
-        <w:t xml:space="preserve">The coast is the clearest limit. Both hazard surfaces are weak there, the terrain surface reaching 0.610 on held-out ground, because surge flooding follows embankments, tidal channels and landfall position, which the pipeline does not yet ingest, so the coastal composite is not a map of surge exposure. Exposure depends on OpenStreetMap, whose rural completeness is unmeasured, and composite risk is defined only where assets are mapped, 12.5 % of grid cells in Rangpur and Rajshahi, while vulnerability omits income, housing and age structure, dimensions that a household survey in flood-prone Sunamganj found to matter</w:t>
+        <w:t xml:space="preserve">The coast is the clearest limit, since both hazard surfaces are weak there, the terrain surface reaching 0.610 on held-out ground, because surge flooding follows embankments, tidal channels and landfall position, which the pipeline does not yet ingest. The coastal composite is therefore not a map of surge exposure. Exposure depends on OpenStreetMap, whose rural completeness is unmeasured, and composite risk is defined only where assets are mapped, 12.5 % of grid cells in Rangpur and Rajshahi, while vulnerability omits income, housing and age structure, dimensions that a household survey in flood-prone Sunamganj found to matter</w:t>
       </w:r>
       <w:r>
         <w:t xml:space="preserve"> </w:t>

</xml_diff>

<commit_message>
JFRM package: double spacing, line and page numbers in the Word manuscript
Checked against JFRM's author guidelines (Internet Archive copy, 2025): no
abstract limit for Original Papers, up to 8 keywords, running title under 40
characters, acknowledgments with funding on the title page, APA references,
tables and the figure-legend list in the main file, figures and SI as
separate files, colour-blind-safe figures. The package already met all of
them; line numbers are added for reviewers.
</commit_message>
<xml_diff>
--- a/docs/paper/submission/manuscript.docx
+++ b/docs/paper/submission/manuscript.docx
@@ -7516,9 +7516,11 @@
     </w:p>
     <w:bookmarkEnd w:id="143"/>
     <w:sectPr>
+      <w:footerReference w:type="default" r:id="rId9"/>
       <w:footnotePr>
         <w:numRestart w:val="eachSect"/>
       </w:footnotePr>
+      <w:lnNumType w:countBy="1" w:restart="continuous"/>
     </w:sectPr>
   </w:body>
 </w:document>
@@ -7526,6 +7528,23 @@
 
 <file path=word/comments.xml><?xml version="1.0" encoding="utf-8"?>
 <w:comments xmlns:w="http://schemas.openxmlformats.org/wordprocessingml/2006/main" xmlns:m="http://schemas.openxmlformats.org/officeDocument/2006/math" xmlns:r="http://schemas.openxmlformats.org/officeDocument/2006/relationships" xmlns:o="urn:schemas-microsoft-com:office:office" xmlns:v="urn:schemas-microsoft-com:vml" xmlns:w10="urn:schemas-microsoft-com:office:word" xmlns:a="http://schemas.openxmlformats.org/drawingml/2006/main" xmlns:pic="http://schemas.openxmlformats.org/drawingml/2006/picture" xmlns:wp="http://schemas.openxmlformats.org/drawingml/2006/wordprocessingDrawing"/>
+</file>
+
+<file path=word/footer1.xml><?xml version="1.0" encoding="utf-8"?>
+<w:ftr xmlns:m="http://schemas.openxmlformats.org/officeDocument/2006/math" xmlns:mc="http://schemas.openxmlformats.org/markup-compatibility/2006" xmlns:mo="http://schemas.microsoft.com/office/mac/office/2008/main" xmlns:mv="urn:schemas-microsoft-com:mac:vml" xmlns:o="urn:schemas-microsoft-com:office:office" xmlns:r="http://schemas.openxmlformats.org/officeDocument/2006/relationships" xmlns:v="urn:schemas-microsoft-com:vml" xmlns:w10="urn:schemas-microsoft-com:office:word" xmlns:w14="http://schemas.microsoft.com/office/word/2010/wordml" xmlns:w="http://schemas.openxmlformats.org/wordprocessingml/2006/main" xmlns:wne="http://schemas.microsoft.com/office/word/2006/wordml" xmlns:wp14="http://schemas.microsoft.com/office/word/2010/wordprocessingDrawing" xmlns:wp="http://schemas.openxmlformats.org/drawingml/2006/wordprocessingDrawing" xmlns:wpc="http://schemas.microsoft.com/office/word/2010/wordprocessingCanvas" xmlns:wpg="http://schemas.microsoft.com/office/word/2010/wordprocessingGroup" xmlns:wpi="http://schemas.microsoft.com/office/word/2010/wordprocessingInk" xmlns:wps="http://schemas.microsoft.com/office/word/2010/wordprocessingShape" mc:Ignorable="w14 wp14">
+  <w:p>
+    <w:pPr>
+      <w:pStyle w:val="Footer"/>
+      <w:jc w:val="center"/>
+      <w:suppressLineNumbers/>
+    </w:pPr>
+    <w:r>
+      <w:fldChar w:fldCharType="begin"/>
+      <w:instrText xml:space="preserve">PAGE</w:instrText>
+      <w:fldChar w:fldCharType="end"/>
+    </w:r>
+  </w:p>
+</w:ftr>
 </file>
 
 <file path=word/footnotes.xml><?xml version="1.0" encoding="utf-8"?>
@@ -7652,6 +7671,9 @@
   <w:style w:default="1" w:styleId="Normal" w:type="paragraph">
     <w:name w:val="Normal"/>
     <w:qFormat/>
+    <w:pPr>
+      <w:spacing w:line="480" w:lineRule="auto"/>
+    </w:pPr>
   </w:style>
   <w:style w:styleId="BodyText" w:type="paragraph">
     <w:name w:val="Body Text"/>
@@ -7659,7 +7681,7 @@
     <w:link w:val="BodyTextChar"/>
     <w:qFormat/>
     <w:pPr>
-      <w:spacing w:after="180" w:before="180"/>
+      <w:spacing w:after="180" w:before="180" w:line="480" w:lineRule="auto"/>
     </w:pPr>
   </w:style>
   <w:style w:customStyle="1" w:styleId="FirstParagraph" w:type="paragraph">
@@ -7667,13 +7689,16 @@
     <w:basedOn w:val="BodyText"/>
     <w:next w:val="BodyText"/>
     <w:qFormat/>
+    <w:pPr>
+      <w:spacing w:line="480" w:lineRule="auto"/>
+    </w:pPr>
   </w:style>
   <w:style w:customStyle="1" w:styleId="Compact" w:type="paragraph">
     <w:name w:val="Compact"/>
     <w:basedOn w:val="BodyText"/>
     <w:qFormat/>
     <w:pPr>
-      <w:spacing w:after="36" w:before="36"/>
+      <w:spacing w:after="36" w:before="36" w:line="480" w:lineRule="auto"/>
     </w:pPr>
   </w:style>
   <w:style w:styleId="Title" w:type="paragraph">
@@ -7806,7 +7831,9 @@
     <w:basedOn w:val="Normal"/>
     <w:next w:val="Bibliography"/>
     <w:qFormat/>
-    <w:pPr/>
+    <w:pPr>
+      <w:spacing w:line="480" w:lineRule="auto"/>
+    </w:pPr>
     <w:rPr/>
   </w:style>
   <w:style w:styleId="Heading1" w:type="paragraph">

</xml_diff>

<commit_message>
Flood paper: cite the blocked, calibrated Feni 2024 study; Swarup and Nury row checked against full text
</commit_message>
<xml_diff>
--- a/docs/paper/submission/manuscript.docx
+++ b/docs/paper/submission/manuscript.docx
@@ -201,7 +201,16 @@
         <w:t xml:space="preserve">(Adnan et al., 2023)</w:t>
       </w:r>
       <w:r>
-        <w:t xml:space="preserve">, but every study whose split could be read divided its points at random, and none holds out whole areas. The inventories also differ in kind, from points identified by field survey and local residents</w:t>
+        <w:t xml:space="preserve">, but every study whose split could be read divided its points at random except one, which held out five regions within the 2024 Feni flash flood and found that random splits raised AUC by 0.06–0.09</w:t>
+      </w:r>
+      <w:r>
+        <w:t xml:space="preserve"> </w:t>
+      </w:r>
+      <w:r>
+        <w:t xml:space="preserve">(Diptho et al., 2026)</w:t>
+      </w:r>
+      <w:r>
+        <w:t xml:space="preserve">. The inventories also differ in kind, from points identified by field survey and local residents</w:t>
       </w:r>
       <w:r>
         <w:t xml:space="preserve"> </w:t>
@@ -231,7 +240,7 @@
         <w:t xml:space="preserve"> </w:t>
       </w:r>
       <w:r>
-        <w:t xml:space="preserve">(Adnan et al., 2023; R. Islam &amp; Chowdhury, 2024)</w:t>
+        <w:t xml:space="preserve">(Adnan et al., 2023; Diptho et al., 2026; R. Islam &amp; Chowdhury, 2024)</w:t>
       </w:r>
       <w:r>
         <w:t xml:space="preserve">, so the same accuracy figure can measure agreement with quite different things. Two studies compared the maps their models produced, and those comparisons are the more instructive. On the south-west coast four models each classified roughly 60 % of the land as flood-prone, yet their pixel-wise correlations ranged from 0.62 to 0.91</w:t>
@@ -479,7 +488,19 @@
         <w:t xml:space="preserve">(Niculescu-Mizil &amp; Caruana, 2005; Zadrozny &amp; Elkan, 2002)</w:t>
       </w:r>
       <w:r>
-        <w:t xml:space="preserve">, and none of the Bangladesh studies read in full reports calibrated probabilities.</w:t>
+        <w:t xml:space="preserve">, and among the Bangladesh studies only</w:t>
+      </w:r>
+      <w:r>
+        <w:t xml:space="preserve"> </w:t>
+      </w:r>
+      <w:r>
+        <w:t xml:space="preserve">Diptho et al. (2026)</w:t>
+      </w:r>
+      <w:r>
+        <w:t xml:space="preserve"> </w:t>
+      </w:r>
+      <w:r>
+        <w:t xml:space="preserve">calibrated its scores, within a single flood event.</w:t>
       </w:r>
     </w:p>
     <w:bookmarkEnd w:id="13"/>
@@ -1464,7 +1485,7 @@
         <w:pStyle w:val="FirstParagraph"/>
       </w:pPr>
       <w:r>
-        <w:t xml:space="preserve">The label source decides what a published accuracy figure measures, since terrain-threshold labels cost the model 0.101, 0.087 and 0.080 in AUC on held-out blocks. Against later floods that neither label source had seen they still cost 0.069, 0.024 and 0.071, so in Rangpur and Rajshahi and on the coast the advantage of radar labels does not depend on the test sharing their definition, while in Sylhet most of it did. The indices those labels are built on, TWI and HAND, add almost nothing to the model once elevation is known, and a model scored against labels derived from its own inputs measures its recovery of the labelling rule rather than its skill at locating floods. The mean AUCs here, 0.817 and 0.857 in the riverine regions, sit at or below the best-model AUCs of 0.87 to 0.98 in Table 1. The comparison is only indicative, since those studies split their points at random while every figure here comes from 10 km blocks the model never saw, and wider blocks lower these figures a little further (Section 5.5). Blocking has its own critics</w:t>
+        <w:t xml:space="preserve">The label source decides what a published accuracy figure measures, since terrain-threshold labels cost the model 0.101, 0.087 and 0.080 in AUC on held-out blocks. Against later floods that neither label source had seen they still cost 0.069, 0.024 and 0.071, so in Rangpur and Rajshahi and on the coast the advantage of radar labels does not depend on the test sharing their definition, while in Sylhet most of it did. The indices those labels are built on, TWI and HAND, add almost nothing to the model once elevation is known, and a model scored against labels derived from its own inputs measures its recovery of the labelling rule rather than its skill at locating floods. The mean AUCs here, 0.817 and 0.857 in the riverine regions, sit at or below the best-model AUCs of 0.87 to 0.98 in Table 1. The comparison is only indicative, since all but one of those studies split their points at random while every figure here comes from 10 km blocks the model never saw, and wider blocks lower these figures a little further (Section 5.5). Blocking has its own critics</w:t>
       </w:r>
       <w:r>
         <w:t xml:space="preserve"> </w:t>
@@ -1749,7 +1770,7 @@
       </w:r>
     </w:p>
     <w:bookmarkEnd w:id="44"/>
-    <w:bookmarkStart w:id="134" w:name="references"/>
+    <w:bookmarkStart w:id="136" w:name="references"/>
     <w:p>
       <w:pPr>
         <w:pStyle w:val="Heading1"/>
@@ -1758,7 +1779,7 @@
         <w:t xml:space="preserve">References</w:t>
       </w:r>
     </w:p>
-    <w:bookmarkStart w:id="133" w:name="refs"/>
+    <w:bookmarkStart w:id="135" w:name="refs"/>
     <w:bookmarkStart w:id="46" w:name="ref-adnan2023"/>
     <w:p>
       <w:pPr>
@@ -2086,13 +2107,25 @@
       </w:hyperlink>
     </w:p>
     <w:bookmarkEnd w:id="56"/>
-    <w:bookmarkStart w:id="58" w:name="ref-inform2017"/>
+    <w:bookmarkStart w:id="58" w:name="ref-diptho2026"/>
     <w:p>
       <w:pPr>
         <w:pStyle w:val="Bibliography"/>
       </w:pPr>
       <w:r>
-        <w:t xml:space="preserve">European Commission Joint Research Centre. (2017).</w:t>
+        <w:t xml:space="preserve">Diptho, R. A., Ghosh, P., &amp; Chowdhury, S. H. (2026). Physically consistent and spatially conformalized machine learning for trustworthy flood susceptibility mapping of the 2024</w:t>
+      </w:r>
+      <w:r>
+        <w:t xml:space="preserve"> </w:t>
+      </w:r>
+      <w:r>
+        <w:t xml:space="preserve">Feni</w:t>
+      </w:r>
+      <w:r>
+        <w:t xml:space="preserve"> </w:t>
+      </w:r>
+      <w:r>
+        <w:t xml:space="preserve">flash flood.</w:t>
       </w:r>
       <w:r>
         <w:t xml:space="preserve"> </w:t>
@@ -2102,6 +2135,53 @@
           <w:i/>
           <w:iCs/>
         </w:rPr>
+        <w:t xml:space="preserve">Discover Geoscience</w:t>
+      </w:r>
+      <w:r>
+        <w:t xml:space="preserve">,</w:t>
+      </w:r>
+      <w:r>
+        <w:t xml:space="preserve"> </w:t>
+      </w:r>
+      <w:r>
+        <w:rPr>
+          <w:i/>
+          <w:iCs/>
+        </w:rPr>
+        <w:t xml:space="preserve">4</w:t>
+      </w:r>
+      <w:r>
+        <w:t xml:space="preserve">, 390.</w:t>
+      </w:r>
+      <w:r>
+        <w:t xml:space="preserve"> </w:t>
+      </w:r>
+      <w:hyperlink r:id="rId57">
+        <w:r>
+          <w:rPr>
+            <w:rStyle w:val="Hyperlink"/>
+          </w:rPr>
+          <w:t xml:space="preserve">https://doi.org/10.1007/s44288-026-00759-0</w:t>
+        </w:r>
+      </w:hyperlink>
+    </w:p>
+    <w:bookmarkEnd w:id="58"/>
+    <w:bookmarkStart w:id="60" w:name="ref-inform2017"/>
+    <w:p>
+      <w:pPr>
+        <w:pStyle w:val="Bibliography"/>
+      </w:pPr>
+      <w:r>
+        <w:t xml:space="preserve">European Commission Joint Research Centre. (2017).</w:t>
+      </w:r>
+      <w:r>
+        <w:t xml:space="preserve"> </w:t>
+      </w:r>
+      <w:r>
+        <w:rPr>
+          <w:i/>
+          <w:iCs/>
+        </w:rPr>
         <w:t xml:space="preserve">Index for Risk Management – INFORM: Concept and Methodology, Version 2017</w:t>
       </w:r>
       <w:r>
@@ -2110,7 +2190,7 @@
       <w:r>
         <w:t xml:space="preserve"> </w:t>
       </w:r>
-      <w:hyperlink r:id="rId57">
+      <w:hyperlink r:id="rId59">
         <w:r>
           <w:rPr>
             <w:rStyle w:val="Hyperlink"/>
@@ -2119,8 +2199,8 @@
         </w:r>
       </w:hyperlink>
     </w:p>
-    <w:bookmarkEnd w:id="58"/>
-    <w:bookmarkStart w:id="60" w:name="ref-giezendanner2023"/>
+    <w:bookmarkEnd w:id="60"/>
+    <w:bookmarkStart w:id="62" w:name="ref-giezendanner2023"/>
     <w:p>
       <w:pPr>
         <w:pStyle w:val="Bibliography"/>
@@ -2156,7 +2236,7 @@
       <w:r>
         <w:t xml:space="preserve"> </w:t>
       </w:r>
-      <w:hyperlink r:id="rId59">
+      <w:hyperlink r:id="rId61">
         <w:r>
           <w:rPr>
             <w:rStyle w:val="Hyperlink"/>
@@ -2165,8 +2245,8 @@
         </w:r>
       </w:hyperlink>
     </w:p>
-    <w:bookmarkEnd w:id="60"/>
-    <w:bookmarkStart w:id="62" w:name="ref-guzzetti2006"/>
+    <w:bookmarkEnd w:id="62"/>
+    <w:bookmarkStart w:id="64" w:name="ref-guzzetti2006"/>
     <w:p>
       <w:pPr>
         <w:pStyle w:val="Bibliography"/>
@@ -2203,7 +2283,7 @@
       <w:r>
         <w:t xml:space="preserve"> </w:t>
       </w:r>
-      <w:hyperlink r:id="rId61">
+      <w:hyperlink r:id="rId63">
         <w:r>
           <w:rPr>
             <w:rStyle w:val="Hyperlink"/>
@@ -2212,8 +2292,8 @@
         </w:r>
       </w:hyperlink>
     </w:p>
-    <w:bookmarkEnd w:id="62"/>
-    <w:bookmarkStart w:id="64" w:name="ref-haghighi2022"/>
+    <w:bookmarkEnd w:id="64"/>
+    <w:bookmarkStart w:id="66" w:name="ref-haghighi2022"/>
     <w:p>
       <w:pPr>
         <w:pStyle w:val="Bibliography"/>
@@ -2262,7 +2342,7 @@
       <w:r>
         <w:t xml:space="preserve"> </w:t>
       </w:r>
-      <w:hyperlink r:id="rId63">
+      <w:hyperlink r:id="rId65">
         <w:r>
           <w:rPr>
             <w:rStyle w:val="Hyperlink"/>
@@ -2271,8 +2351,8 @@
         </w:r>
       </w:hyperlink>
     </w:p>
-    <w:bookmarkEnd w:id="64"/>
-    <w:bookmarkStart w:id="66" w:name="ref-hamilton2017"/>
+    <w:bookmarkEnd w:id="66"/>
+    <w:bookmarkStart w:id="68" w:name="ref-hamilton2017"/>
     <w:p>
       <w:pPr>
         <w:pStyle w:val="Bibliography"/>
@@ -2296,7 +2376,7 @@
       <w:r>
         <w:t xml:space="preserve"> </w:t>
       </w:r>
-      <w:hyperlink r:id="rId65">
+      <w:hyperlink r:id="rId67">
         <w:r>
           <w:rPr>
             <w:rStyle w:val="Hyperlink"/>
@@ -2305,8 +2385,8 @@
         </w:r>
       </w:hyperlink>
     </w:p>
-    <w:bookmarkEnd w:id="66"/>
-    <w:bookmarkStart w:id="68" w:name="ref-hawker2020"/>
+    <w:bookmarkEnd w:id="68"/>
+    <w:bookmarkStart w:id="70" w:name="ref-hawker2020"/>
     <w:p>
       <w:pPr>
         <w:pStyle w:val="Bibliography"/>
@@ -2343,7 +2423,7 @@
       <w:r>
         <w:t xml:space="preserve"> </w:t>
       </w:r>
-      <w:hyperlink r:id="rId67">
+      <w:hyperlink r:id="rId69">
         <w:r>
           <w:rPr>
             <w:rStyle w:val="Hyperlink"/>
@@ -2352,8 +2432,8 @@
         </w:r>
       </w:hyperlink>
     </w:p>
-    <w:bookmarkEnd w:id="68"/>
-    <w:bookmarkStart w:id="70" w:name="ref-hawker2022"/>
+    <w:bookmarkEnd w:id="70"/>
+    <w:bookmarkStart w:id="72" w:name="ref-hawker2022"/>
     <w:p>
       <w:pPr>
         <w:pStyle w:val="Bibliography"/>
@@ -2390,7 +2470,7 @@
       <w:r>
         <w:t xml:space="preserve"> </w:t>
       </w:r>
-      <w:hyperlink r:id="rId69">
+      <w:hyperlink r:id="rId71">
         <w:r>
           <w:rPr>
             <w:rStyle w:val="Hyperlink"/>
@@ -2399,8 +2479,8 @@
         </w:r>
       </w:hyperlink>
     </w:p>
-    <w:bookmarkEnd w:id="70"/>
-    <w:bookmarkStart w:id="72" w:name="ref-herfort2023"/>
+    <w:bookmarkEnd w:id="72"/>
+    <w:bookmarkStart w:id="74" w:name="ref-herfort2023"/>
     <w:p>
       <w:pPr>
         <w:pStyle w:val="Bibliography"/>
@@ -2446,7 +2526,7 @@
       <w:r>
         <w:t xml:space="preserve"> </w:t>
       </w:r>
-      <w:hyperlink r:id="rId71">
+      <w:hyperlink r:id="rId73">
         <w:r>
           <w:rPr>
             <w:rStyle w:val="Hyperlink"/>
@@ -2455,8 +2535,8 @@
         </w:r>
       </w:hyperlink>
     </w:p>
-    <w:bookmarkEnd w:id="72"/>
-    <w:bookmarkStart w:id="74" w:name="ref-islam2021"/>
+    <w:bookmarkEnd w:id="74"/>
+    <w:bookmarkStart w:id="76" w:name="ref-islam2021"/>
     <w:p>
       <w:pPr>
         <w:pStyle w:val="Bibliography"/>
@@ -2502,7 +2582,7 @@
       <w:r>
         <w:t xml:space="preserve"> </w:t>
       </w:r>
-      <w:hyperlink r:id="rId73">
+      <w:hyperlink r:id="rId75">
         <w:r>
           <w:rPr>
             <w:rStyle w:val="Hyperlink"/>
@@ -2511,8 +2591,8 @@
         </w:r>
       </w:hyperlink>
     </w:p>
-    <w:bookmarkEnd w:id="74"/>
-    <w:bookmarkStart w:id="76" w:name="ref-islamr2024"/>
+    <w:bookmarkEnd w:id="76"/>
+    <w:bookmarkStart w:id="78" w:name="ref-islamr2024"/>
     <w:p>
       <w:pPr>
         <w:pStyle w:val="Bibliography"/>
@@ -2558,7 +2638,7 @@
       <w:r>
         <w:t xml:space="preserve"> </w:t>
       </w:r>
-      <w:hyperlink r:id="rId75">
+      <w:hyperlink r:id="rId77">
         <w:r>
           <w:rPr>
             <w:rStyle w:val="Hyperlink"/>
@@ -2567,8 +2647,8 @@
         </w:r>
       </w:hyperlink>
     </w:p>
-    <w:bookmarkEnd w:id="76"/>
-    <w:bookmarkStart w:id="78" w:name="ref-koks2019"/>
+    <w:bookmarkEnd w:id="78"/>
+    <w:bookmarkStart w:id="80" w:name="ref-koks2019"/>
     <w:p>
       <w:pPr>
         <w:pStyle w:val="Bibliography"/>
@@ -2614,7 +2694,7 @@
       <w:r>
         <w:t xml:space="preserve"> </w:t>
       </w:r>
-      <w:hyperlink r:id="rId77">
+      <w:hyperlink r:id="rId79">
         <w:r>
           <w:rPr>
             <w:rStyle w:val="Hyperlink"/>
@@ -2623,8 +2703,8 @@
         </w:r>
       </w:hyperlink>
     </w:p>
-    <w:bookmarkEnd w:id="78"/>
-    <w:bookmarkStart w:id="80" w:name="ref-liu2026"/>
+    <w:bookmarkEnd w:id="80"/>
+    <w:bookmarkStart w:id="82" w:name="ref-liu2026"/>
     <w:p>
       <w:pPr>
         <w:pStyle w:val="Bibliography"/>
@@ -2670,7 +2750,7 @@
       <w:r>
         <w:t xml:space="preserve"> </w:t>
       </w:r>
-      <w:hyperlink r:id="rId79">
+      <w:hyperlink r:id="rId81">
         <w:r>
           <w:rPr>
             <w:rStyle w:val="Hyperlink"/>
@@ -2679,8 +2759,8 @@
         </w:r>
       </w:hyperlink>
     </w:p>
-    <w:bookmarkEnd w:id="80"/>
-    <w:bookmarkStart w:id="82" w:name="ref-ma2025"/>
+    <w:bookmarkEnd w:id="82"/>
+    <w:bookmarkStart w:id="84" w:name="ref-ma2025"/>
     <w:p>
       <w:pPr>
         <w:pStyle w:val="Bibliography"/>
@@ -2726,7 +2806,7 @@
       <w:r>
         <w:t xml:space="preserve"> </w:t>
       </w:r>
-      <w:hyperlink r:id="rId81">
+      <w:hyperlink r:id="rId83">
         <w:r>
           <w:rPr>
             <w:rStyle w:val="Hyperlink"/>
@@ -2735,8 +2815,8 @@
         </w:r>
       </w:hyperlink>
     </w:p>
-    <w:bookmarkEnd w:id="82"/>
-    <w:bookmarkStart w:id="84" w:name="ref-nadeau2003"/>
+    <w:bookmarkEnd w:id="84"/>
+    <w:bookmarkStart w:id="86" w:name="ref-nadeau2003"/>
     <w:p>
       <w:pPr>
         <w:pStyle w:val="Bibliography"/>
@@ -2773,7 +2853,7 @@
       <w:r>
         <w:t xml:space="preserve"> </w:t>
       </w:r>
-      <w:hyperlink r:id="rId83">
+      <w:hyperlink r:id="rId85">
         <w:r>
           <w:rPr>
             <w:rStyle w:val="Hyperlink"/>
@@ -2782,8 +2862,8 @@
         </w:r>
       </w:hyperlink>
     </w:p>
-    <w:bookmarkEnd w:id="84"/>
-    <w:bookmarkStart w:id="86" w:name="ref-niculescu2005"/>
+    <w:bookmarkEnd w:id="86"/>
+    <w:bookmarkStart w:id="88" w:name="ref-niculescu2005"/>
     <w:p>
       <w:pPr>
         <w:pStyle w:val="Bibliography"/>
@@ -2816,7 +2896,7 @@
       <w:r>
         <w:t xml:space="preserve"> </w:t>
       </w:r>
-      <w:hyperlink r:id="rId85">
+      <w:hyperlink r:id="rId87">
         <w:r>
           <w:rPr>
             <w:rStyle w:val="Hyperlink"/>
@@ -2825,8 +2905,8 @@
         </w:r>
       </w:hyperlink>
     </w:p>
-    <w:bookmarkEnd w:id="86"/>
-    <w:bookmarkStart w:id="88" w:name="ref-nobre2011"/>
+    <w:bookmarkEnd w:id="88"/>
+    <w:bookmarkStart w:id="90" w:name="ref-nobre2011"/>
     <w:p>
       <w:pPr>
         <w:pStyle w:val="Bibliography"/>
@@ -2872,7 +2952,7 @@
       <w:r>
         <w:t xml:space="preserve"> </w:t>
       </w:r>
-      <w:hyperlink r:id="rId87">
+      <w:hyperlink r:id="rId89">
         <w:r>
           <w:rPr>
             <w:rStyle w:val="Hyperlink"/>
@@ -2881,8 +2961,8 @@
         </w:r>
       </w:hyperlink>
     </w:p>
-    <w:bookmarkEnd w:id="88"/>
-    <w:bookmarkStart w:id="90" w:name="ref-pekel2016"/>
+    <w:bookmarkEnd w:id="90"/>
+    <w:bookmarkStart w:id="92" w:name="ref-pekel2016"/>
     <w:p>
       <w:pPr>
         <w:pStyle w:val="Bibliography"/>
@@ -2928,7 +3008,7 @@
       <w:r>
         <w:t xml:space="preserve"> </w:t>
       </w:r>
-      <w:hyperlink r:id="rId89">
+      <w:hyperlink r:id="rId91">
         <w:r>
           <w:rPr>
             <w:rStyle w:val="Hyperlink"/>
@@ -2937,8 +3017,8 @@
         </w:r>
       </w:hyperlink>
     </w:p>
-    <w:bookmarkEnd w:id="90"/>
-    <w:bookmarkStart w:id="92" w:name="ref-ploton2020"/>
+    <w:bookmarkEnd w:id="92"/>
+    <w:bookmarkStart w:id="94" w:name="ref-ploton2020"/>
     <w:p>
       <w:pPr>
         <w:pStyle w:val="Bibliography"/>
@@ -2984,7 +3064,7 @@
       <w:r>
         <w:t xml:space="preserve"> </w:t>
       </w:r>
-      <w:hyperlink r:id="rId91">
+      <w:hyperlink r:id="rId93">
         <w:r>
           <w:rPr>
             <w:rStyle w:val="Hyperlink"/>
@@ -2993,8 +3073,8 @@
         </w:r>
       </w:hyperlink>
     </w:p>
-    <w:bookmarkEnd w:id="92"/>
-    <w:bookmarkStart w:id="94" w:name="ref-rahmanm2025"/>
+    <w:bookmarkEnd w:id="94"/>
+    <w:bookmarkStart w:id="96" w:name="ref-rahmanm2025"/>
     <w:p>
       <w:pPr>
         <w:pStyle w:val="Bibliography"/>
@@ -3040,7 +3120,7 @@
       <w:r>
         <w:t xml:space="preserve"> </w:t>
       </w:r>
-      <w:hyperlink r:id="rId93">
+      <w:hyperlink r:id="rId95">
         <w:r>
           <w:rPr>
             <w:rStyle w:val="Hyperlink"/>
@@ -3049,8 +3129,8 @@
         </w:r>
       </w:hyperlink>
     </w:p>
-    <w:bookmarkEnd w:id="94"/>
-    <w:bookmarkStart w:id="96" w:name="ref-roberts2017"/>
+    <w:bookmarkEnd w:id="96"/>
+    <w:bookmarkStart w:id="98" w:name="ref-roberts2017"/>
     <w:p>
       <w:pPr>
         <w:pStyle w:val="Bibliography"/>
@@ -3096,7 +3176,7 @@
       <w:r>
         <w:t xml:space="preserve"> </w:t>
       </w:r>
-      <w:hyperlink r:id="rId95">
+      <w:hyperlink r:id="rId97">
         <w:r>
           <w:rPr>
             <w:rStyle w:val="Hyperlink"/>
@@ -3105,8 +3185,8 @@
         </w:r>
       </w:hyperlink>
     </w:p>
-    <w:bookmarkEnd w:id="96"/>
-    <w:bookmarkStart w:id="98" w:name="ref-rudra2023"/>
+    <w:bookmarkEnd w:id="98"/>
+    <w:bookmarkStart w:id="100" w:name="ref-rudra2023"/>
     <w:p>
       <w:pPr>
         <w:pStyle w:val="Bibliography"/>
@@ -3152,7 +3232,7 @@
       <w:r>
         <w:t xml:space="preserve"> </w:t>
       </w:r>
-      <w:hyperlink r:id="rId97">
+      <w:hyperlink r:id="rId99">
         <w:r>
           <w:rPr>
             <w:rStyle w:val="Hyperlink"/>
@@ -3161,8 +3241,8 @@
         </w:r>
       </w:hyperlink>
     </w:p>
-    <w:bookmarkEnd w:id="98"/>
-    <w:bookmarkStart w:id="100" w:name="ref-schotten2023"/>
+    <w:bookmarkEnd w:id="100"/>
+    <w:bookmarkStart w:id="102" w:name="ref-schotten2023"/>
     <w:p>
       <w:pPr>
         <w:pStyle w:val="Bibliography"/>
@@ -3208,7 +3288,7 @@
       <w:r>
         <w:t xml:space="preserve"> </w:t>
       </w:r>
-      <w:hyperlink r:id="rId99">
+      <w:hyperlink r:id="rId101">
         <w:r>
           <w:rPr>
             <w:rStyle w:val="Hyperlink"/>
@@ -3217,8 +3297,8 @@
         </w:r>
       </w:hyperlink>
     </w:p>
-    <w:bookmarkEnd w:id="100"/>
-    <w:bookmarkStart w:id="102" w:name="ref-sharma2026"/>
+    <w:bookmarkEnd w:id="102"/>
+    <w:bookmarkStart w:id="104" w:name="ref-sharma2026"/>
     <w:p>
       <w:pPr>
         <w:pStyle w:val="Bibliography"/>
@@ -3270,7 +3350,7 @@
       <w:r>
         <w:t xml:space="preserve"> </w:t>
       </w:r>
-      <w:hyperlink r:id="rId101">
+      <w:hyperlink r:id="rId103">
         <w:r>
           <w:rPr>
             <w:rStyle w:val="Hyperlink"/>
@@ -3279,8 +3359,8 @@
         </w:r>
       </w:hyperlink>
     </w:p>
-    <w:bookmarkEnd w:id="102"/>
-    <w:bookmarkStart w:id="104" w:name="ref-sherpa2022"/>
+    <w:bookmarkEnd w:id="104"/>
+    <w:bookmarkStart w:id="106" w:name="ref-sherpa2022"/>
     <w:p>
       <w:pPr>
         <w:pStyle w:val="Bibliography"/>
@@ -3326,7 +3406,7 @@
       <w:r>
         <w:t xml:space="preserve"> </w:t>
       </w:r>
-      <w:hyperlink r:id="rId103">
+      <w:hyperlink r:id="rId105">
         <w:r>
           <w:rPr>
             <w:rStyle w:val="Hyperlink"/>
@@ -3335,8 +3415,8 @@
         </w:r>
       </w:hyperlink>
     </w:p>
-    <w:bookmarkEnd w:id="104"/>
-    <w:bookmarkStart w:id="106" w:name="ref-swarup2026"/>
+    <w:bookmarkEnd w:id="106"/>
+    <w:bookmarkStart w:id="108" w:name="ref-swarup2026"/>
     <w:p>
       <w:pPr>
         <w:pStyle w:val="Bibliography"/>
@@ -3394,7 +3474,7 @@
       <w:r>
         <w:t xml:space="preserve"> </w:t>
       </w:r>
-      <w:hyperlink r:id="rId105">
+      <w:hyperlink r:id="rId107">
         <w:r>
           <w:rPr>
             <w:rStyle w:val="Hyperlink"/>
@@ -3403,8 +3483,8 @@
         </w:r>
       </w:hyperlink>
     </w:p>
-    <w:bookmarkEnd w:id="106"/>
-    <w:bookmarkStart w:id="108" w:name="ref-talukdar2020"/>
+    <w:bookmarkEnd w:id="108"/>
+    <w:bookmarkStart w:id="110" w:name="ref-talukdar2020"/>
     <w:p>
       <w:pPr>
         <w:pStyle w:val="Bibliography"/>
@@ -3450,7 +3530,7 @@
       <w:r>
         <w:t xml:space="preserve"> </w:t>
       </w:r>
-      <w:hyperlink r:id="rId107">
+      <w:hyperlink r:id="rId109">
         <w:r>
           <w:rPr>
             <w:rStyle w:val="Hyperlink"/>
@@ -3459,8 +3539,8 @@
         </w:r>
       </w:hyperlink>
     </w:p>
-    <w:bookmarkEnd w:id="108"/>
-    <w:bookmarkStart w:id="110" w:name="ref-tellman2021"/>
+    <w:bookmarkEnd w:id="110"/>
+    <w:bookmarkStart w:id="112" w:name="ref-tellman2021"/>
     <w:p>
       <w:pPr>
         <w:pStyle w:val="Bibliography"/>
@@ -3506,7 +3586,7 @@
       <w:r>
         <w:t xml:space="preserve"> </w:t>
       </w:r>
-      <w:hyperlink r:id="rId109">
+      <w:hyperlink r:id="rId111">
         <w:r>
           <w:rPr>
             <w:rStyle w:val="Hyperlink"/>
@@ -3515,8 +3595,8 @@
         </w:r>
       </w:hyperlink>
     </w:p>
-    <w:bookmarkEnd w:id="110"/>
-    <w:bookmarkStart w:id="112" w:name="ref-thomas2023"/>
+    <w:bookmarkEnd w:id="112"/>
+    <w:bookmarkStart w:id="114" w:name="ref-thomas2023"/>
     <w:p>
       <w:pPr>
         <w:pStyle w:val="Bibliography"/>
@@ -3553,7 +3633,7 @@
       <w:r>
         <w:t xml:space="preserve"> </w:t>
       </w:r>
-      <w:hyperlink r:id="rId111">
+      <w:hyperlink r:id="rId113">
         <w:r>
           <w:rPr>
             <w:rStyle w:val="Hyperlink"/>
@@ -3562,8 +3642,8 @@
         </w:r>
       </w:hyperlink>
     </w:p>
-    <w:bookmarkEnd w:id="112"/>
-    <w:bookmarkStart w:id="114" w:name="ref-twele2016"/>
+    <w:bookmarkEnd w:id="114"/>
+    <w:bookmarkStart w:id="116" w:name="ref-twele2016"/>
     <w:p>
       <w:pPr>
         <w:pStyle w:val="Bibliography"/>
@@ -3609,7 +3689,7 @@
       <w:r>
         <w:t xml:space="preserve"> </w:t>
       </w:r>
-      <w:hyperlink r:id="rId113">
+      <w:hyperlink r:id="rId115">
         <w:r>
           <w:rPr>
             <w:rStyle w:val="Hyperlink"/>
@@ -3618,8 +3698,8 @@
         </w:r>
       </w:hyperlink>
     </w:p>
-    <w:bookmarkEnd w:id="114"/>
-    <w:bookmarkStart w:id="116" w:name="ref-uddin2019"/>
+    <w:bookmarkEnd w:id="116"/>
+    <w:bookmarkStart w:id="118" w:name="ref-uddin2019"/>
     <w:p>
       <w:pPr>
         <w:pStyle w:val="Bibliography"/>
@@ -3665,7 +3745,7 @@
       <w:r>
         <w:t xml:space="preserve"> </w:t>
       </w:r>
-      <w:hyperlink r:id="rId115">
+      <w:hyperlink r:id="rId117">
         <w:r>
           <w:rPr>
             <w:rStyle w:val="Hyperlink"/>
@@ -3674,8 +3754,8 @@
         </w:r>
       </w:hyperlink>
     </w:p>
-    <w:bookmarkEnd w:id="116"/>
-    <w:bookmarkStart w:id="118" w:name="ref-unspider"/>
+    <w:bookmarkEnd w:id="118"/>
+    <w:bookmarkStart w:id="120" w:name="ref-unspider"/>
     <w:p>
       <w:pPr>
         <w:pStyle w:val="Bibliography"/>
@@ -3699,7 +3779,7 @@
       <w:r>
         <w:t xml:space="preserve"> </w:t>
       </w:r>
-      <w:hyperlink r:id="rId117">
+      <w:hyperlink r:id="rId119">
         <w:r>
           <w:rPr>
             <w:rStyle w:val="Hyperlink"/>
@@ -3711,8 +3791,8 @@
         <w:t xml:space="preserve">.</w:t>
       </w:r>
     </w:p>
-    <w:bookmarkEnd w:id="118"/>
-    <w:bookmarkStart w:id="120" w:name="ref-wadoux2021"/>
+    <w:bookmarkEnd w:id="120"/>
+    <w:bookmarkStart w:id="122" w:name="ref-wadoux2021"/>
     <w:p>
       <w:pPr>
         <w:pStyle w:val="Bibliography"/>
@@ -3758,7 +3838,7 @@
       <w:r>
         <w:t xml:space="preserve"> </w:t>
       </w:r>
-      <w:hyperlink r:id="rId119">
+      <w:hyperlink r:id="rId121">
         <w:r>
           <w:rPr>
             <w:rStyle w:val="Hyperlink"/>
@@ -3767,8 +3847,8 @@
         </w:r>
       </w:hyperlink>
     </w:p>
-    <w:bookmarkEnd w:id="120"/>
-    <w:bookmarkStart w:id="122" w:name="ref-waleed2025"/>
+    <w:bookmarkEnd w:id="122"/>
+    <w:bookmarkStart w:id="124" w:name="ref-waleed2025"/>
     <w:p>
       <w:pPr>
         <w:pStyle w:val="Bibliography"/>
@@ -3814,7 +3894,7 @@
       <w:r>
         <w:t xml:space="preserve"> </w:t>
       </w:r>
-      <w:hyperlink r:id="rId121">
+      <w:hyperlink r:id="rId123">
         <w:r>
           <w:rPr>
             <w:rStyle w:val="Hyperlink"/>
@@ -3823,8 +3903,8 @@
         </w:r>
       </w:hyperlink>
     </w:p>
-    <w:bookmarkEnd w:id="122"/>
-    <w:bookmarkStart w:id="124" w:name="ref-wang2023"/>
+    <w:bookmarkEnd w:id="124"/>
+    <w:bookmarkStart w:id="126" w:name="ref-wang2023"/>
     <w:p>
       <w:pPr>
         <w:pStyle w:val="Bibliography"/>
@@ -3870,7 +3950,7 @@
       <w:r>
         <w:t xml:space="preserve"> </w:t>
       </w:r>
-      <w:hyperlink r:id="rId123">
+      <w:hyperlink r:id="rId125">
         <w:r>
           <w:rPr>
             <w:rStyle w:val="Hyperlink"/>
@@ -3879,8 +3959,8 @@
         </w:r>
       </w:hyperlink>
     </w:p>
-    <w:bookmarkEnd w:id="124"/>
-    <w:bookmarkStart w:id="126" w:name="ref-wanggat2023"/>
+    <w:bookmarkEnd w:id="126"/>
+    <w:bookmarkStart w:id="128" w:name="ref-wanggat2023"/>
     <w:p>
       <w:pPr>
         <w:pStyle w:val="Bibliography"/>
@@ -3917,7 +3997,7 @@
       <w:r>
         <w:t xml:space="preserve"> </w:t>
       </w:r>
-      <w:hyperlink r:id="rId125">
+      <w:hyperlink r:id="rId127">
         <w:r>
           <w:rPr>
             <w:rStyle w:val="Hyperlink"/>
@@ -3926,8 +4006,8 @@
         </w:r>
       </w:hyperlink>
     </w:p>
-    <w:bookmarkEnd w:id="126"/>
-    <w:bookmarkStart w:id="128" w:name="ref-williams2025"/>
+    <w:bookmarkEnd w:id="128"/>
+    <w:bookmarkStart w:id="130" w:name="ref-williams2025"/>
     <w:p>
       <w:pPr>
         <w:pStyle w:val="Bibliography"/>
@@ -3973,7 +4053,7 @@
       <w:r>
         <w:t xml:space="preserve"> </w:t>
       </w:r>
-      <w:hyperlink r:id="rId127">
+      <w:hyperlink r:id="rId129">
         <w:r>
           <w:rPr>
             <w:rStyle w:val="Hyperlink"/>
@@ -3982,8 +4062,8 @@
         </w:r>
       </w:hyperlink>
     </w:p>
-    <w:bookmarkEnd w:id="128"/>
-    <w:bookmarkStart w:id="130" w:name="ref-zadrozny2002"/>
+    <w:bookmarkEnd w:id="130"/>
+    <w:bookmarkStart w:id="132" w:name="ref-zadrozny2002"/>
     <w:p>
       <w:pPr>
         <w:pStyle w:val="Bibliography"/>
@@ -4016,7 +4096,7 @@
       <w:r>
         <w:t xml:space="preserve"> </w:t>
       </w:r>
-      <w:hyperlink r:id="rId129">
+      <w:hyperlink r:id="rId131">
         <w:r>
           <w:rPr>
             <w:rStyle w:val="Hyperlink"/>
@@ -4025,8 +4105,8 @@
         </w:r>
       </w:hyperlink>
     </w:p>
-    <w:bookmarkEnd w:id="130"/>
-    <w:bookmarkStart w:id="132" w:name="ref-zzaman2021"/>
+    <w:bookmarkEnd w:id="132"/>
+    <w:bookmarkStart w:id="134" w:name="ref-zzaman2021"/>
     <w:p>
       <w:pPr>
         <w:pStyle w:val="Bibliography"/>
@@ -4072,7 +4152,7 @@
       <w:r>
         <w:t xml:space="preserve"> </w:t>
       </w:r>
-      <w:hyperlink r:id="rId131">
+      <w:hyperlink r:id="rId133">
         <w:r>
           <w:rPr>
             <w:rStyle w:val="Hyperlink"/>
@@ -4081,10 +4161,10 @@
         </w:r>
       </w:hyperlink>
     </w:p>
-    <w:bookmarkEnd w:id="132"/>
-    <w:bookmarkEnd w:id="133"/>
     <w:bookmarkEnd w:id="134"/>
-    <w:bookmarkStart w:id="142" w:name="tables"/>
+    <w:bookmarkEnd w:id="135"/>
+    <w:bookmarkEnd w:id="136"/>
+    <w:bookmarkStart w:id="144" w:name="tables"/>
     <w:p>
       <w:pPr>
         <w:pStyle w:val="Heading1"/>
@@ -4093,22 +4173,13 @@
         <w:t xml:space="preserve">Tables</w:t>
       </w:r>
     </w:p>
-    <w:bookmarkStart w:id="135" w:name="tab:litflood"/>
+    <w:bookmarkStart w:id="137" w:name="tab:litflood"/>
     <w:p>
       <w:pPr>
         <w:pStyle w:val="TableCaption"/>
       </w:pPr>
       <w:r>
-        <w:t xml:space="preserve">Table 1. Flood susceptibility studies in Bangladesh compared with this system. Every study was read in full except</w:t>
-      </w:r>
-      <w:r>
-        <w:t xml:space="preserve"> </w:t>
-      </w:r>
-      <w:r>
-        <w:t xml:space="preserve">Swarup &amp; Nury (2026)</w:t>
-      </w:r>
-      <w:r>
-        <w:t xml:space="preserve">, whose entries come from its abstract, and where a figure is given for training and validation separately the validation figure is shown. This system’s figures are means over 20 assignments of spatially held-out blocks, scored against observed floods, so the columns are not directly comparable, for the reasons given in the text.</w:t>
+        <w:t xml:space="preserve">Table 1. Flood susceptibility studies in Bangladesh compared with this system. Every study was read in full, and where a figure is given for training and validation separately the validation figure is shown. This system’s figures are means over 20 assignments of spatially held-out blocks, scored against observed floods, so the columns are not directly comparable, for the reasons given in the text.</w:t>
       </w:r>
     </w:p>
     <w:tbl>
@@ -4116,7 +4187,7 @@
         <w:tblStyle w:val="Table"/>
         <w:tblW w:type="auto" w:w="0"/>
         <w:tblLook w:firstRow="1" w:lastRow="0" w:firstColumn="0" w:lastColumn="0" w:noHBand="0" w:noVBand="0" w:val="0020"/>
-        <w:tblCaption w:val="Table 1. Flood susceptibility studies in Bangladesh compared with this system. Every study was read in full except Swarup &amp; Nury (2026), whose entries come from its abstract, and where a figure is given for training and validation separately the validation figure is shown. This system’s figures are means over 20 assignments of spatially held-out blocks, scored against observed floods, so the columns are not directly comparable, for the reasons given in the text."/>
+        <w:tblCaption w:val="Table 1. Flood susceptibility studies in Bangladesh compared with this system. Every study was read in full, and where a figure is given for training and validation separately the validation figure is shown. This system’s figures are means over 20 assignments of spatially held-out blocks, scored against observed floods, so the columns are not directly comparable, for the reasons given in the text."/>
       </w:tblPr>
       <w:tblGrid>
         <w:gridCol w:w="1584"/>
@@ -4509,6 +4580,68 @@
               <w:jc w:val="left"/>
             </w:pPr>
             <w:r>
+              <w:t xml:space="preserve">Diptho et al. (2026)</w:t>
+            </w:r>
+          </w:p>
+        </w:tc>
+        <w:tc>
+          <w:tcPr/>
+          <w:p>
+            <w:pPr>
+              <w:pStyle w:val="Compact"/>
+              <w:jc w:val="left"/>
+            </w:pPr>
+            <w:r>
+              <w:t xml:space="preserve">Feni basin</w:t>
+            </w:r>
+          </w:p>
+        </w:tc>
+        <w:tc>
+          <w:tcPr/>
+          <w:p>
+            <w:pPr>
+              <w:pStyle w:val="Compact"/>
+              <w:jc w:val="left"/>
+            </w:pPr>
+            <w:r>
+              <w:t xml:space="preserve">LightGBM, XGBoost, RF</w:t>
+            </w:r>
+          </w:p>
+        </w:tc>
+        <w:tc>
+          <w:tcPr/>
+          <w:p>
+            <w:pPr>
+              <w:pStyle w:val="Compact"/>
+              <w:jc w:val="left"/>
+            </w:pPr>
+            <w:r>
+              <w:t xml:space="preserve">1,510 flooded and dry pixels from the observed August 2024 inundation, five spatial blocks</w:t>
+            </w:r>
+          </w:p>
+        </w:tc>
+        <w:tc>
+          <w:tcPr/>
+          <w:p>
+            <w:pPr>
+              <w:pStyle w:val="Compact"/>
+              <w:jc w:val="left"/>
+            </w:pPr>
+            <w:r>
+              <w:t xml:space="preserve">spatial AUC 0.938 (LightGBM)</w:t>
+            </w:r>
+          </w:p>
+        </w:tc>
+      </w:tr>
+      <w:tr>
+        <w:tc>
+          <w:tcPr/>
+          <w:p>
+            <w:pPr>
+              <w:pStyle w:val="Compact"/>
+              <w:jc w:val="left"/>
+            </w:pPr>
+            <w:r>
               <w:t xml:space="preserve">Adnan et al. (2023)</w:t>
             </w:r>
           </w:p>
@@ -4763,8 +4896,8 @@
         </w:tc>
       </w:tr>
     </w:tbl>
-    <w:bookmarkEnd w:id="135"/>
-    <w:bookmarkStart w:id="136" w:name="tab:regions"/>
+    <w:bookmarkEnd w:id="137"/>
+    <w:bookmarkStart w:id="138" w:name="tab:regions"/>
     <w:p>
       <w:pPr>
         <w:pStyle w:val="TableCaption"/>
@@ -4999,8 +5132,8 @@
         </w:tc>
       </w:tr>
     </w:tbl>
-    <w:bookmarkEnd w:id="136"/>
-    <w:bookmarkStart w:id="137" w:name="tab:data"/>
+    <w:bookmarkEnd w:id="138"/>
+    <w:bookmarkStart w:id="139" w:name="tab:data"/>
     <w:p>
       <w:pPr>
         <w:pStyle w:val="TableCaption"/>
@@ -5376,8 +5509,8 @@
         </w:tc>
       </w:tr>
     </w:tbl>
-    <w:bookmarkEnd w:id="137"/>
-    <w:bookmarkStart w:id="138" w:name="tab:events"/>
+    <w:bookmarkEnd w:id="139"/>
+    <w:bookmarkStart w:id="140" w:name="tab:events"/>
     <w:p>
       <w:pPr>
         <w:pStyle w:val="TableCaption"/>
@@ -5894,8 +6027,8 @@
         </w:tc>
       </w:tr>
     </w:tbl>
-    <w:bookmarkEnd w:id="138"/>
-    <w:bookmarkStart w:id="139" w:name="tab:validation"/>
+    <w:bookmarkEnd w:id="140"/>
+    <w:bookmarkStart w:id="141" w:name="tab:validation"/>
     <w:p>
       <w:pPr>
         <w:pStyle w:val="TableCaption"/>
@@ -6268,8 +6401,8 @@
         </w:tc>
       </w:tr>
     </w:tbl>
-    <w:bookmarkEnd w:id="139"/>
-    <w:bookmarkStart w:id="140" w:name="tab:temporal"/>
+    <w:bookmarkEnd w:id="141"/>
+    <w:bookmarkStart w:id="142" w:name="tab:temporal"/>
     <w:p>
       <w:pPr>
         <w:pStyle w:val="TableCaption"/>
@@ -6714,8 +6847,8 @@
         </w:tc>
       </w:tr>
     </w:tbl>
-    <w:bookmarkEnd w:id="140"/>
-    <w:bookmarkStart w:id="141" w:name="tab:benchmark"/>
+    <w:bookmarkEnd w:id="142"/>
+    <w:bookmarkStart w:id="143" w:name="tab:benchmark"/>
     <w:p>
       <w:pPr>
         <w:pStyle w:val="TableCaption"/>
@@ -7363,9 +7496,9 @@
         </w:tc>
       </w:tr>
     </w:tbl>
-    <w:bookmarkEnd w:id="141"/>
-    <w:bookmarkEnd w:id="142"/>
-    <w:bookmarkStart w:id="143" w:name="figure-legends"/>
+    <w:bookmarkEnd w:id="143"/>
+    <w:bookmarkEnd w:id="144"/>
+    <w:bookmarkStart w:id="145" w:name="figure-legends"/>
     <w:p>
       <w:pPr>
         <w:pStyle w:val="Heading1"/>
@@ -7514,7 +7647,7 @@
         <w:t xml:space="preserve">Loss in AUC on the held-out test blocks when each feature is shuffled across the test assets, as mean and standard deviation over 20 block assignments, for the default gradient-boosted model. The AUC in each title is the mean before shuffling.</w:t>
       </w:r>
     </w:p>
-    <w:bookmarkEnd w:id="143"/>
+    <w:bookmarkEnd w:id="145"/>
     <w:sectPr>
       <w:footerReference w:type="default" r:id="rId9"/>
       <w:footnotePr>

</xml_diff>

<commit_message>
Flood paper: record length, skill over the record and planning lists (SI S6, Table S2)
</commit_message>
<xml_diff>
--- a/docs/paper/submission/manuscript.docx
+++ b/docs/paper/submission/manuscript.docx
@@ -26,7 +26,7 @@
         <w:pStyle w:val="FirstParagraph"/>
       </w:pPr>
       <w:r>
-        <w:t xml:space="preserve">Flood susceptibility maps are judged by how well they rank the ground that floods, yet they are rarely compared with the simplest alternative, the record of where floods have already been. This study makes that comparison for infrastructure mapped in OpenStreetMap in three regions of Bangladesh, with flood extents mapped from Sentinel-1 radar for thirteen events as labels and reference and every model scored on 10 km blocks held out from training. Trained on floods up to 2022, a gradient-boosted model ranked the ground the 2024 river floods reached in Rangpur and Rajshahi at an AUC of 0.801, below the record of earlier flooding at 0.896, and the record kept its lead with masks re-mapped from a single satellite, with two other training targets and with 40 km blocks. Given the record as a feature, the model beat both, at 0.924, by ranking the ground no earlier flood had reached. In the Sylhet haor the record’s lead, 0.851 against 0.797, closed when the model learned the same target as the test, and on the cyclone-struck coast, where most flooded assets stood on ground no earlier cyclone had reached, the model’s lead did not survive wider blocks. The record was therefore the stronger guide where floods returned to the same ground. Radar-observed extents also made better training labels than terrain thresholds, by 0.101, 0.087 and 0.080 in AUC on held-out areas, a graph neural network added nothing over tabular models, and elevation carried almost all of the terrain signal. The radar masks agreed only moderately with an independent MODIS map, so every score measures agreement with flooding as radar sees it. Susceptibility studies with a radar flood history should report that record as a baseline.</w:t>
+        <w:t xml:space="preserve">Flood susceptibility maps are judged by how well they rank the ground that floods, yet they are rarely compared with the simplest alternative, the record of where floods have already been. This study makes that comparison for infrastructure mapped in OpenStreetMap in three regions of Bangladesh, with flood extents mapped from Sentinel-1 radar for thirteen events as labels and reference and every model scored on 10 km blocks held out from training. Trained on floods up to 2022, a gradient-boosted model ranked the ground the 2024 river floods reached in Rangpur and Rajshahi at an AUC of 0.801, below the record of earlier flooding at 0.896, and the record kept its lead with masks re-mapped from a single satellite, with two other training targets and with 40 km blocks, and led even when built from a single earlier flood. Given the record as a feature, the model beat both, at 0.924, by ranking the ground no earlier flood had reached. In the Sylhet haor the record’s lead, 0.851 against 0.797, closed when the model learned the same target as the test, and on the cyclone-struck coast, where most flooded assets stood on ground no earlier cyclone had reached, the model’s lead did not survive wider blocks. The record was therefore the stronger guide where floods returned to the same ground. Radar-observed extents also made better training labels than terrain thresholds, by 0.101, 0.087 and 0.080 in AUC on held-out areas, a graph neural network added nothing over tabular models, and elevation carried almost all of the terrain signal. The radar masks agreed only moderately with an independent MODIS map, so every score measures agreement with flooding as radar sees it. Susceptibility studies with a radar flood history should report that record as a baseline.</w:t>
       </w:r>
     </w:p>
     <w:p>
@@ -261,7 +261,7 @@
         <w:t xml:space="preserve">(R. Islam &amp; Chowdhury, 2024)</w:t>
       </w:r>
       <w:r>
-        <w:t xml:space="preserve">. Models that score equally well can therefore disagree about where flooding will happen, which is the property a map exists to convey. Multi-criteria hazard maps built from similar terrain factors, including TWI and HAND, reached validation scores of 0.77–0.79 in the Sangu basin and placed 39 % of roads and 25 % of education buildings in the highest hazard class</w:t>
+        <w:t xml:space="preserve">. Models that score equally well can therefore disagree about where flooding will happen, which is the property a map exists to convey. A multi-criteria hazard map of the Sangu basin placed 39 % of roads and 25 % of education buildings in its highest hazard class</w:t>
       </w:r>
       <w:r>
         <w:t xml:space="preserve"> </w:t>
@@ -270,7 +270,7 @@
         <w:t xml:space="preserve">(Zzaman et al., 2021)</w:t>
       </w:r>
       <w:r>
-        <w:t xml:space="preserve">, which shows why the exposure of infrastructure matters to planners.</w:t>
+        <w:t xml:space="preserve">, which shows why infrastructure exposure matters to planners.</w:t>
       </w:r>
     </w:p>
     <w:bookmarkEnd w:id="12"/>
@@ -447,15 +447,6 @@
       </w:r>
       <w:r>
         <w:t xml:space="preserve">(Giezendanner et al., 2023)</w:t>
-      </w:r>
-      <w:r>
-        <w:t xml:space="preserve">. The effect can be large, since a forest-biomass model that explained more than half the variance under random validation showed almost no skill under spatial validation</w:t>
-      </w:r>
-      <w:r>
-        <w:t xml:space="preserve"> </w:t>
-      </w:r>
-      <w:r>
-        <w:t xml:space="preserve">(Ploton et al., 2020)</w:t>
       </w:r>
       <w:r>
         <w:t xml:space="preserve">. Blocking can force a model to extrapolate</w:t>
@@ -1305,6 +1296,14 @@
         <w:pStyle w:val="BodyText"/>
       </w:pPr>
       <w:r>
+        <w:t xml:space="preserve">Rebuilt from a single earlier flood, the record already ranked the 2024 flooding in Rangpur and Rajshahi above the model, at 0.812 against 0.768, whereas in Sylhet it needed both earlier floods and on the coast it trailed at every length (Supporting Information, Section S6, Table S2). As skill over the record, the share of its remaining ranking error that a model removes, the model scored -0.905 in Rangpur and Rajshahi, -0.364 in Sylhet and 0.416 on the coast, and 0.276 in Rangpur and Rajshahi given the record as a feature. A list of every asset an earlier flood reached held 93.2 % of the assets the 2024 floods reached in Rangpur and Rajshahi against 68.5 % for an equally long list from the model. On the coast, where the model ranked better overall, the record’s list of 2.5 % of assets still held 37.1 % against 9.5 %, marking the most exposed ground more precisely even where it ranked the rest worse.</w:t>
+      </w:r>
+    </w:p>
+    <w:p>
+      <w:pPr>
+        <w:pStyle w:val="BodyText"/>
+      </w:pPr>
+      <w:r>
         <w:t xml:space="preserve">The 2024 floods also give the label comparison a test that favours neither label source. The observed labels still lead, at 0.801 against 0.732 in Rangpur and Rajshahi, 0.797 against 0.773 in Sylhet and 0.807 against 0.736 on the coast, ahead on 18, 15 and 18 of 20 assignments. The coastal gap of 0.071 stays close to its spatial 0.080, while the riverine gaps shrink, from 0.101 to 0.069 in Rangpur and Rajshahi and from 0.087 to 0.024 in Sylhet, where the remaining gap cannot be told apart from noise. Much of the Sylhet advantage in the spatial test therefore came from the shared definition rather than from the labels themselves.</w:t>
       </w:r>
     </w:p>
@@ -1332,7 +1331,7 @@
         <w:pStyle w:val="FirstParagraph"/>
       </w:pPr>
       <w:r>
-        <w:t xml:space="preserve">Wider blocks lower the held-out AUC of the default model only a little in the riverine regions, from 0.817 at 10 km to 0.791 at 40 km in Rangpur and Rajshahi and from 0.857 to 0.836 in Sylhet, and more on the coast, from 0.839 to 0.774, so the 10 km figures carry a small optimism, largest on the coast. The comparison with the flood record under wider blocks is reported in Section 5.4.</w:t>
+        <w:t xml:space="preserve">Wider blocks lower the held-out AUC of the default model only a little in the riverine regions, from 0.817 at 10 km to 0.791 at 40 km in Rangpur and Rajshahi and from 0.857 to 0.836 in Sylhet, and more on the coast, from 0.839 to 0.774, so the 10 km figures carry a small optimism, largest on the coast.</w:t>
       </w:r>
     </w:p>
     <w:bookmarkEnd w:id="29"/>
@@ -1458,7 +1457,7 @@
         <w:t xml:space="preserve">(Swarup &amp; Nury, 2026)</w:t>
       </w:r>
       <w:r>
-        <w:t xml:space="preserve">, close to this model’s 0.797, while the record ranked them at 0.851, a comparison that is only indicative, since that map was scored over areas rather than assets. On the coast, where most of the ground Cyclone Remal flooded had not flooded in the earlier cyclones, the model’s lead did not survive wider blocks. Three regions cannot establish that pattern, but they show that the comparison has to be made region by region rather than assumed. The record marks where water returns and the terrain ranks where it has not yet been seen, so a susceptibility map for a river basin with a radar flood history should at least report the record beside it, and where the record is informative the two can be combined. A study that reports accuracy without that reference cannot show that its model knows more than the flood record already does, and the comparison is simple to make wherever Sentinel-1 has observed earlier floods.</w:t>
+        <w:t xml:space="preserve">, close to this model’s 0.797, while the record ranked them at 0.851, a comparison that is only indicative, since that map was scored over areas rather than assets. On the coast, where most of the ground Cyclone Remal flooded had not flooded in the earlier cyclones, the model’s lead did not survive wider blocks. Three regions cannot establish that pattern, but they show that the comparison has to be made region by region rather than assumed. The record marks where water returns and the terrain ranks where it has not yet been seen, so a susceptibility map for a river basin with a radar flood history should at least report the record beside it, and where the record is informative the two can be combined. A study that reports accuracy without that reference cannot show that its model knows more than the flood record already does.</w:t>
       </w:r>
     </w:p>
     <w:bookmarkEnd w:id="33"/>
@@ -1485,7 +1484,7 @@
         <w:pStyle w:val="FirstParagraph"/>
       </w:pPr>
       <w:r>
-        <w:t xml:space="preserve">The label source decides what a published accuracy figure measures, since terrain-threshold labels cost the model 0.101, 0.087 and 0.080 in AUC on held-out blocks. Against later floods that neither label source had seen they still cost 0.069, 0.024 and 0.071, so in Rangpur and Rajshahi and on the coast the advantage of radar labels does not depend on the test sharing their definition, while in Sylhet most of it did. The indices those labels are built on, TWI and HAND, add almost nothing to the model once elevation is known, and a model scored against labels derived from its own inputs measures its recovery of the labelling rule rather than its skill at locating floods. The mean AUCs here, 0.817 and 0.857 in the riverine regions, sit at or below the best-model AUCs of 0.87 to 0.98 in Table 1. The comparison is only indicative, since all but one of those studies split their points at random while every figure here comes from 10 km blocks the model never saw, and wider blocks lower these figures a little further (Section 5.5). Blocking has its own critics</w:t>
+        <w:t xml:space="preserve">The label source decides what a published accuracy figure measures, since terrain-threshold labels cost the model 0.101, 0.087 and 0.080 in AUC on held-out blocks. The indices those labels are built on, TWI and HAND, add almost nothing to the model once elevation is known, and a model scored against labels derived from its own inputs measures its recovery of the labelling rule rather than its skill at locating floods. The mean AUCs here, 0.817 and 0.857 in the riverine regions, sit at or below the best-model AUCs of 0.87 to 0.98 in Table 1. The comparison is only indicative, since all but one of those studies split their points at random while every figure here comes from 10 km blocks the model never saw. Blocking has its own critics</w:t>
       </w:r>
       <w:r>
         <w:t xml:space="preserve"> </w:t>
@@ -1557,7 +1556,7 @@
         <w:pStyle w:val="FirstParagraph"/>
       </w:pPr>
       <w:r>
-        <w:t xml:space="preserve">First, where Sentinel-1 has observed several floods, the record of where water has already stood was at least as good a guide to the next riverine flood as a terrain model alone, and in Rangpur and Rajshahi a better one. It costs little to compute, so agencies such as the Bangladesh Water Development Board and the Flood Forecasting and Warning Centre could publish it as a planning layer beside any susceptibility map. The terrain model adds most where the record is silent, on ground no mapped flood has reached and possibly on a coast where each surge strikes new ground, although the coastal lead did not survive wider blocks. Second, a susceptibility map used to site shelters, embankments or schools should be judged on held-out areas and later floods rather than on random splits, since the accuracy a random split reports overstates how far the map can be trusted in places it has not seen. Third, the composite risk classes rank unions within a region and must be read with their gaps, because a union without mapped assets carries no score rather than a low one. The best tabular models tested here were almost indistinguishable in AUC, so better OpenStreetMap coverage of rural unions would probably improve the map more than a new model would. Infrastructure also fails in networks, and the disruption of services beyond a flooded asset, which asset-level exposure omits, needs network modelling of the kind developed for Accra</w:t>
+        <w:t xml:space="preserve">First, where Sentinel-1 has observed several floods, the record of where water has already stood was at least as good a guide to the next riverine flood as a terrain model alone, and in Rangpur and Rajshahi a better one. It costs little to compute, so agencies such as the Bangladesh Water Development Board and the Flood Forecasting and Warning Centre could publish it as a planning layer beside any susceptibility map. The terrain model adds most where the record is silent, on ground no mapped flood has reached and possibly on a coast where each surge strikes new ground, although the coastal lead did not survive wider blocks, and even there the record made the better short list of assets to protect first. Second, a susceptibility map used to site shelters, embankments or schools should be judged on held-out areas and later floods rather than on random splits, since the accuracy a random split reports overstates how far the map can be trusted in places it has not seen. Third, the composite risk classes rank unions within a region and must be read with their gaps, because a union without mapped assets carries no score rather than a low one. The best tabular models tested here were almost indistinguishable in AUC, so better OpenStreetMap coverage of rural unions would probably improve the map more than a new model would. Disruption beyond a flooded asset, which asset-level exposure omits, needs network modelling such as that developed for Accra</w:t>
       </w:r>
       <w:r>
         <w:t xml:space="preserve"> </w:t>
@@ -1566,7 +1565,7 @@
         <w:t xml:space="preserve">(Schotten &amp; Bachmann, 2023)</w:t>
       </w:r>
       <w:r>
-        <w:t xml:space="preserve">. Validated against losses, maps of this kind could help set priorities among structural and non-structural flood measures in the districts they cover.</w:t>
+        <w:t xml:space="preserve">.</w:t>
       </w:r>
     </w:p>
     <w:bookmarkEnd w:id="36"/>

</xml_diff>

<commit_message>
Flood paper: cite data archive v5 (10.5281/zenodo.23267002); data statement names all five regions
</commit_message>
<xml_diff>
--- a/docs/paper/submission/manuscript.docx
+++ b/docs/paper/submission/manuscript.docx
@@ -1724,7 +1724,7 @@
           <w:rPr>
             <w:rStyle w:val="Hyperlink"/>
           </w:rPr>
-          <w:t xml:space="preserve">https://doi.org/10.5281/zenodo.23130732</w:t>
+          <w:t xml:space="preserve">https://doi.org/10.5281/zenodo.23267002</w:t>
         </w:r>
       </w:hyperlink>
       <w:r>
@@ -1745,7 +1745,7 @@
         <w:t xml:space="preserve"> </w:t>
       </w:r>
       <w:r>
-        <w:t xml:space="preserve">under the MIT licence. The repository holds the pipeline, region configurations, dashboard and test suite. The pipeline also holds a landslide susceptibility module for the Chittagong Hill Tracts, which is described in the technical documentation and will be reported separately. The Zenodo archive packages the input data and outputs for all four regions, including that one, per region with a manifest of checksums and licences. Every figure in this paper is written into the text by the analysis scripts in the code repository directly from the pipeline outputs, so a rerun of the pipeline updates text and results together. The results are published through an open dashboard at</w:t>
+        <w:t xml:space="preserve">under the MIT licence. The repository holds the pipeline, region configurations, dashboard and test suite. The pipeline also holds a landslide susceptibility module for the Chittagong Hill Tracts, which is described in the technical documentation and will be reported separately. The Zenodo archive packages the input data and outputs for all five regions, including the Hill Tracts, per region with a manifest of checksums and licences. Every figure in this paper is written into the text by the analysis scripts in the code repository directly from the pipeline outputs, so a rerun of the pipeline updates text and results together. The results are published through an open dashboard at</w:t>
       </w:r>
       <w:r>
         <w:t xml:space="preserve"> </w:t>

</xml_diff>

<commit_message>
Flood paper: cite data archive v6 (reserved DOI 10.5281/zenodo.23573843); data statement lists the validation regions
</commit_message>
<xml_diff>
--- a/docs/paper/submission/manuscript.docx
+++ b/docs/paper/submission/manuscript.docx
@@ -1863,7 +1863,7 @@
           <w:rPr>
             <w:rStyle w:val="Hyperlink"/>
           </w:rPr>
-          <w:t xml:space="preserve">https://doi.org/10.5281/zenodo.23267002</w:t>
+          <w:t xml:space="preserve">https://doi.org/10.5281/zenodo.23573843</w:t>
         </w:r>
       </w:hyperlink>
       <w:r>
@@ -1884,7 +1884,7 @@
         <w:t xml:space="preserve"> </w:t>
       </w:r>
       <w:r>
-        <w:t xml:space="preserve">under the MIT licence. The repository holds the pipeline, region configurations, dashboard and test suite. The pipeline also holds a landslide susceptibility module for the Chittagong Hill Tracts, which is described in the technical documentation and will be reported separately. The Zenodo archive packages the input data and outputs for all five regions, including the Hill Tracts, per region with a manifest of checksums and licences. Every figure in this paper is written into the text by the analysis scripts in the code repository directly from the pipeline outputs, so a rerun of the pipeline updates text and results together. The results are published through an open dashboard at</w:t>
+        <w:t xml:space="preserve">under the MIT licence. The repository holds the pipeline, region configurations, dashboard and test suite. The pipeline also holds a landslide susceptibility module for the Chittagong Hill Tracts, which is described in the technical documentation and will be reported separately. The Zenodo archive packages the input data and outputs for the three study regions, the four validation regions and the Hill Tracts, per region with a manifest of checksums and licences, together with the rolling-origin outputs. Every figure in this paper is written into the text by the analysis scripts in the code repository directly from the pipeline outputs, so a rerun of the pipeline updates text and results together. The results are published through an open dashboard at</w:t>
       </w:r>
       <w:r>
         <w:t xml:space="preserve"> </w:t>

</xml_diff>

<commit_message>
List the JRC hazard maps and their CC BY 4.0 licence in the datasets table
</commit_message>
<xml_diff>
--- a/docs/paper/submission/manuscript.docx
+++ b/docs/paper/submission/manuscript.docx
@@ -5425,6 +5425,56 @@
             </w:pPr>
             <w:r>
               <w:t xml:space="preserve">free with attribution</w:t>
+            </w:r>
+          </w:p>
+        </w:tc>
+      </w:tr>
+      <w:tr>
+        <w:tc>
+          <w:tcPr/>
+          <w:p>
+            <w:pPr>
+              <w:pStyle w:val="Compact"/>
+              <w:jc w:val="left"/>
+            </w:pPr>
+            <w:r>
+              <w:t xml:space="preserve">JRC global river flood hazard maps v2.1.2 (GloFAS)</w:t>
+            </w:r>
+          </w:p>
+        </w:tc>
+        <w:tc>
+          <w:tcPr/>
+          <w:p>
+            <w:pPr>
+              <w:pStyle w:val="Compact"/>
+              <w:jc w:val="left"/>
+            </w:pPr>
+            <w:r>
+              <w:t xml:space="preserve">reference ranking for later floods</w:t>
+            </w:r>
+          </w:p>
+        </w:tc>
+        <w:tc>
+          <w:tcPr/>
+          <w:p>
+            <w:pPr>
+              <w:pStyle w:val="Compact"/>
+              <w:jc w:val="left"/>
+            </w:pPr>
+            <w:r>
+              <w:t xml:space="preserve">3 arc-seconds (about 90 m)</w:t>
+            </w:r>
+          </w:p>
+        </w:tc>
+        <w:tc>
+          <w:tcPr/>
+          <w:p>
+            <w:pPr>
+              <w:pStyle w:val="Compact"/>
+              <w:jc w:val="left"/>
+            </w:pPr>
+            <w:r>
+              <w:t xml:space="preserve">CC BY 4.0</w:t>
             </w:r>
           </w:p>
         </w:tc>

</xml_diff>

<commit_message>
Spell out JRC and GloFAS in the datasets table caption
</commit_message>
<xml_diff>
--- a/docs/paper/submission/manuscript.docx
+++ b/docs/paper/submission/manuscript.docx
@@ -5210,7 +5210,7 @@
         <w:pStyle w:val="TableCaption"/>
       </w:pPr>
       <w:r>
-        <w:t xml:space="preserve">Table 3. Datasets ingested by the pipeline. National files (WorldPop, geoBoundaries, JRC tiles) are downloaded once into a shared cache and clipped per region.</w:t>
+        <w:t xml:space="preserve">Table 3. Datasets ingested by the pipeline. JRC is the European Commission Joint Research Centre and GloFAS its Global Flood Awareness System. National files (WorldPop, geoBoundaries, JRC tiles) are downloaded once into a shared cache and clipped per region.</w:t>
       </w:r>
     </w:p>
     <w:tbl>
@@ -5218,7 +5218,7 @@
         <w:tblStyle w:val="Table"/>
         <w:tblW w:type="auto" w:w="0"/>
         <w:tblLook w:firstRow="1" w:lastRow="0" w:firstColumn="0" w:lastColumn="0" w:noHBand="0" w:noVBand="0" w:val="0020"/>
-        <w:tblCaption w:val="Table 3. Datasets ingested by the pipeline. National files (WorldPop, geoBoundaries, JRC tiles) are downloaded once into a shared cache and clipped per region."/>
+        <w:tblCaption w:val="Table 3. Datasets ingested by the pipeline. JRC is the European Commission Joint Research Centre and GloFAS its Global Flood Awareness System. National files (WorldPop, geoBoundaries, JRC tiles) are downloaded once into a shared cache and clipped per region."/>
       </w:tblPr>
       <w:tblGrid>
         <w:gridCol w:w="1980"/>

</xml_diff>

<commit_message>
Check the new-ground relation with regions as the unit (SI S9); fair-rival caveat for the hazard map; keyword flood record
</commit_message>
<xml_diff>
--- a/docs/paper/submission/manuscript.docx
+++ b/docs/paper/submission/manuscript.docx
@@ -90,7 +90,7 @@
         <w:t xml:space="preserve"> </w:t>
       </w:r>
       <w:r>
-        <w:t xml:space="preserve">flood susceptibility; Sentinel-1; spatial cross-validation; temporal validation; gradient boosting; graph neural network; persistence baseline; Bangladesh</w:t>
+        <w:t xml:space="preserve">flood susceptibility; Sentinel-1; spatial cross-validation; temporal validation; gradient boosting; flood record; persistence baseline; Bangladesh</w:t>
       </w:r>
     </w:p>
     <w:bookmarkEnd w:id="10"/>
@@ -1537,7 +1537,7 @@
         </m:r>
       </m:oMath>
       <w:r>
-        <w:t xml:space="preserve">). In Rangpur and Rajshahi the model ranked the 2019 flood better, when 47.9 % of it reached new ground, the two were level in 2020, and the record led in 2024, at 6.8 %. Given the record as a feature, the model ranked the later flooding above both of its parts in 5 of 8 tests, all riverine.</w:t>
+        <w:t xml:space="preserve">). The relation also held with each region left out in turn and within every region with more than one test, although resampling whole regions widened the crossover interval to 2.6–42.6 % (Section S9). In Rangpur and Rajshahi the model ranked the 2019 flood better, when 47.9 % of it reached new ground, the two were level in 2020, and the record led in 2024, at 6.8 %. Given the record as a feature, the model ranked the later flooding above both of its parts in 5 of 8 tests, all riverine.</w:t>
       </w:r>
     </w:p>
     <w:p>
@@ -1545,7 +1545,7 @@
         <w:pStyle w:val="BodyText"/>
       </w:pPr>
       <w:r>
-        <w:t xml:space="preserve">The JRC hazard map ranked the later floods at 0.418 to 0.876, below chance on the coast, whose surges it does not simulate. It trailed the record significantly in 5 tests and led it in 4, each on a flood that reached much new ground, and the model ranked above it in 8 of 15. Landsat water occurrence, scored on the 8 floods after 2021, ranked them at 0.624 to 0.834, below the radar record in 4. Area skill scores ordered the record and the model as AUC did in 15 of 15 tests, and the Molchan trajectories show where the difference lay (Fig. 5b, c). In Rangpur and Rajshahi the record caught most of the 2024 flooding within the first sixth of the assets it flagged and then, holding nothing on the rest, ran down the diagonal, while on the coast the model missed fewer flooded assets at most list lengths.</w:t>
+        <w:t xml:space="preserve">The JRC hazard map ranked the later floods at 0.418 to 0.876, below chance on the coast, whose surges it does not simulate, so it is a fair rival only for river flooding. It trailed the record significantly in 5 tests and led it in 4, each on a flood that reached much new ground, and the model ranked above it in 8 of 15. Landsat water occurrence, scored on the 8 floods after 2021, ranked them at 0.624 to 0.834, below the radar record in 4. Area skill scores ordered the record and the model as AUC did in 15 of 15 tests, and the Molchan trajectories show where the difference lay (Fig. 5b, c). In Rangpur and Rajshahi the record caught most of the 2024 flooding within the first sixth of the assets it flagged and then, holding nothing on the rest, ran down the diagonal, while on the coast the model missed fewer flooded assets at most list lengths.</w:t>
       </w:r>
     </w:p>
     <w:bookmarkEnd w:id="27"/>
@@ -1784,7 +1784,7 @@
         <w:pStyle w:val="FirstParagraph"/>
       </w:pPr>
       <w:r>
-        <w:t xml:space="preserve">The coast is the clearest limit, since the terrain hazard surface reaches only 0.610 there on held-out ground and the river hazard map ranks surge flooding below chance, because surge follows embankments, tidal channels and landfall position, which neither describes. The composite risk index (Supporting Information, Section S2) depends on OpenStreetMap, whose rural completeness is unmeasured, and has not been checked against losses. The radar labels carry error of their own, agreeing only moderately with an independent MODIS map and counting inundated paddy as flooding, so every score here measures agreement with flooding mapped by radar rather than with flooding on the ground. Each test draws on one to three earlier flood years, and the threshold near a third of flooding on new ground is estimated from 15 tests, with an interval of 18.2 to 41.1 %. The calibrated probabilities hold for a region as a whole rather than for any one area, and none of the surfaces is a forecast.</w:t>
+        <w:t xml:space="preserve">The coast is the clearest limit, since the terrain hazard surface reaches only 0.610 there on held-out ground and the river hazard map ranks surge flooding below chance, because surge follows embankments, tidal channels and landfall position, which neither describes. The composite risk index (Supporting Information, Section S2) depends on OpenStreetMap, whose rural completeness is unmeasured, and has not been checked against losses. The radar labels carry error of their own, agreeing only moderately with an independent MODIS map and counting inundated paddy as flooding, so every score here measures agreement with flooding mapped by radar rather than with flooding on the ground. Each test draws on one to three earlier flood years, and the threshold near a third of flooding on new ground is estimated from 15 tests in 7 regions, with an interval of 18.2 to 41.1 % when tests are resampled and 2.6 to 42.6 % when whole regions are. The calibrated probabilities hold for a region as a whole rather than for any one area, and none of the surfaces is a forecast.</w:t>
       </w:r>
     </w:p>
     <w:bookmarkEnd w:id="34"/>

</xml_diff>

<commit_message>
Retitle: When do flood susceptibility models beat the flood record?
</commit_message>
<xml_diff>
--- a/docs/paper/submission/manuscript.docx
+++ b/docs/paper/submission/manuscript.docx
@@ -2,13 +2,13 @@
 <file path=word/document.xml><?xml version="1.0" encoding="utf-8"?>
 <w:document xmlns:w="http://schemas.openxmlformats.org/wordprocessingml/2006/main" xmlns:m="http://schemas.openxmlformats.org/officeDocument/2006/math" xmlns:r="http://schemas.openxmlformats.org/officeDocument/2006/relationships" xmlns:o="urn:schemas-microsoft-com:office:office" xmlns:v="urn:schemas-microsoft-com:vml" xmlns:w10="urn:schemas-microsoft-com:office:word" xmlns:a="http://schemas.openxmlformats.org/drawingml/2006/main" xmlns:pic="http://schemas.openxmlformats.org/drawingml/2006/picture" xmlns:wp="http://schemas.openxmlformats.org/drawingml/2006/wordprocessingDrawing">
   <w:body>
-    <w:bookmarkStart w:id="9" w:name="X40b935b031fc3d589964603713bf844fc60db52"/>
+    <w:bookmarkStart w:id="9" w:name="Xd9a5aadbc16cfb061abfd15f8131c4ec0f42f7f"/>
     <w:p>
       <w:pPr>
         <w:pStyle w:val="Heading1"/>
       </w:pPr>
       <w:r>
-        <w:t xml:space="preserve">Do flood susceptibility models know more than the flood record? Evidence from radar-observed floods in Bangladesh</w:t>
+        <w:t xml:space="preserve">When do flood susceptibility models beat the flood record? Evidence from radar-observed floods in Bangladesh</w:t>
       </w:r>
     </w:p>
     <w:bookmarkEnd w:id="9"/>

</xml_diff>

<commit_message>
Fig. 1 caption names all four validation regions; one region-wide new-ground figure for 2024
</commit_message>
<xml_diff>
--- a/docs/paper/submission/manuscript.docx
+++ b/docs/paper/submission/manuscript.docx
@@ -1151,7 +1151,7 @@
         <w:pStyle w:val="BodyText"/>
       </w:pPr>
       <w:r>
-        <w:t xml:space="preserve">Trained only on earlier floods, the model ranks the 2024 flooding at 0.801 in Rangpur and Rajshahi, 0.797 in Sylhet and 0.807 on the coast. In both riverine regions the record of earlier flooding ranks it better, at 0.896 and 0.851, with the model ahead on only 2 and 4 of 20 assignments, whereas on the coast the model leads, at 0.807 against 0.668. The regions differ in how often floods return to the same ground, since only 16.9 % and 22.3 % of the assets flooded in 2024 stood on ground no earlier event had reached, against 65.5 % on the coast, where each surge floods the stretch of coast where it lands. The 2024 floods in Rangpur and Rajshahi were also small, covering 4.9–8.3 % of the region against 19.9–24.8 % for each earlier flood, whereas in Sylhet they were as large as earlier ones.</w:t>
+        <w:t xml:space="preserve">Trained only on earlier floods, the model ranks the 2024 flooding at 0.801 in Rangpur and Rajshahi, 0.797 in Sylhet and 0.807 on the coast. In both riverine regions the record of earlier flooding ranks it better, at 0.896 and 0.851, with the model ahead on only 2 and 4 of 20 assignments, whereas on the coast the model leads, at 0.807 against 0.668. The regions differ in how often floods return to the same ground, since only 6.8 % and 22.1 % of the assets flooded in 2024 stood on ground no earlier event had reached, against 62.9 % on the coast, where each surge floods the stretch of coast where it lands. The 2024 floods in Rangpur and Rajshahi were also small, covering 4.9–8.3 % of the region against 19.9–24.8 % for each earlier flood, whereas in Sylhet they were as large as earlier ones.</w:t>
       </w:r>
     </w:p>
     <w:p>
@@ -9682,7 +9682,7 @@
         <w:t xml:space="preserve"> </w:t>
       </w:r>
       <w:r>
-        <w:t xml:space="preserve">(a) The three study regions, drawn as their configured bounding boxes, and the validation region east of the Jamuna (e, dashed), over the district boundaries of geoBoundaries, with neighbouring countries from Natural Earth. (b–d) Share of the mapped Sentinel-1 events in which each 100 m cell was flooded. Cells never seen flooded are left blank, and the removal of permanent water leaves the main river channels empty. Straight-edged bands follow the edges of radar swaths.</w:t>
+        <w:t xml:space="preserve">(a) The three study regions, drawn as their configured bounding boxes, and the four validation regions, outlined by their districts (e Jamuna east, f central, g Chattogram coast, h west-central; dashed), over the district boundaries of geoBoundaries, with neighbouring countries from Natural Earth. (b–d) Share of the mapped Sentinel-1 events in which each 100 m cell was flooded. Cells never seen flooded are left blank, and the removal of permanent water leaves the main river channels empty. Straight-edged bands follow the edges of radar swaths.</w:t>
       </w:r>
     </w:p>
     <w:p>

</xml_diff>

<commit_message>
JFRM pre-submission fixes: flood-size check (SI S9), crossover as about a third, pipeline chart to SI Fig. S1, Table 1 'This study'
</commit_message>
<xml_diff>
--- a/docs/paper/submission/manuscript.docx
+++ b/docs/paper/submission/manuscript.docx
@@ -72,7 +72,7 @@
         </m:r>
       </m:oMath>
       <w:r>
-        <w:t xml:space="preserve">), whatever the length of the record, and the two were level when about 33.4 % of flooded assets stood on such new ground. In Rangpur and Rajshahi, where only 6.8 % of the 2024 river flooding reached new ground, the record ranked it at 0.896 against 0.801 for the model and kept its lead with masks re-mapped from a single satellite, with other training targets and with 40 km blocks, while on the cyclone-struck coast, where most flooding reached new ground, the model led. A global hydrodynamic hazard map was no stronger a rival than the model, and the model given the record as a feature beat both of its parts in 5 of 8 tests, all riverine. Radar-observed extents also made better training labels than terrain thresholds, by 0.101, 0.087 and 0.080 in AUC on held-out areas. The radar masks agreed only moderately with an independent MODIS map, so every score measures agreement with flooding as radar sees it. Susceptibility studies with a radar flood history should report that record as a baseline and score their models by the share of its ranking error they remove.</w:t>
+        <w:t xml:space="preserve">), whatever the length of the record, and the two were level when about a third of flooded assets stood on such new ground. In Rangpur and Rajshahi, where only 6.8 % of the 2024 river flooding reached new ground, the record ranked it at 0.896 against 0.801 for the model and kept its lead with masks re-mapped from a single satellite, with other training targets and with 40 km blocks, while on the cyclone-struck coast, where most flooding reached new ground, the model led. A global hydrodynamic hazard map was no stronger a rival than the model, and the model given the record as a feature beat both of its parts in 5 of 8 tests, all riverine. Radar-observed extents also made better training labels than terrain thresholds, by 0.101, 0.087 and 0.080 in AUC on held-out areas. The radar masks agreed only moderately with an independent MODIS map, so every score measures agreement with flooding as radar sees it. Susceptibility studies with a radar flood history should report that record as a baseline and score their models by the share of its ranking error they remove.</w:t>
       </w:r>
     </w:p>
     <w:p>
@@ -652,7 +652,7 @@
         <w:pStyle w:val="FirstParagraph"/>
       </w:pPr>
       <w:r>
-        <w:t xml:space="preserve">The pipeline runs as a chain of steps (Fig. 2), and this section follows it in order. Settings not given here are in the Supporting Information (Section S1).</w:t>
+        <w:t xml:space="preserve">The pipeline runs as a chain of steps, drawn in the Supporting Information (Fig. S1, Section S1) with the settings not given here, and this section follows it in order.</w:t>
       </w:r>
     </w:p>
     <w:bookmarkStart w:id="17" w:name="assets-terrain-and-features"/>
@@ -1029,7 +1029,7 @@
         <w:pStyle w:val="FirstParagraph"/>
       </w:pPr>
       <w:r>
-        <w:t xml:space="preserve">Table 5 reports one block assignment, the pipeline’s default, which ranks 2, 1 and 17 of 20 by AUC in the three regions. In Sylhet 14.7 % of assets sit on flood-prone ground and the asset model reaches an AUC of 0.934. In Rangpur and Rajshahi only 6.7 % do, yet the model ranks well (AUC 0.884), with an average precision 7.0 times the base rate. Calibration lowers the Brier score from 0.069 to 0.029 in Rangpur and Rajshahi, slightly below the 0.032 of always predicting the base rate, and its deciles lie close to the diagonal in both riverine regions (Fig. 4). It carries less well to the coast, where the calibration blocks hold 5.5 % flood-prone assets against 1.7 % in the test blocks and the calibrated Brier score of 0.039 is worse than the base rate at 0.017.</w:t>
+        <w:t xml:space="preserve">Table 5 reports one block assignment, the pipeline’s default, which ranks 2, 1 and 17 of 20 by AUC in the three regions. In Sylhet 14.7 % of assets sit on flood-prone ground and the asset model reaches an AUC of 0.934. In Rangpur and Rajshahi only 6.7 % do, yet the model ranks well (AUC 0.884), with an average precision 7.0 times the base rate. Calibration lowers the Brier score from 0.069 to 0.029 in Rangpur and Rajshahi, slightly below the 0.032 of always predicting the base rate, and its deciles lie close to the diagonal in both riverine regions (Fig. 3). It carries less well to the coast, where the calibration blocks hold 5.5 % flood-prone assets against 1.7 % in the test blocks and the calibrated Brier score of 0.039 is worse than the base rate at 0.017.</w:t>
       </w:r>
     </w:p>
     <w:bookmarkEnd w:id="24"/>
@@ -1116,7 +1116,7 @@
         </m:r>
       </m:oMath>
       <w:r>
-        <w:t xml:space="preserve">; Fig. 3). This test favours the observed labels, since that model is scored against the definition it learned, so Section 5.3 repeats it against later floods that neither label source was trained on.</w:t>
+        <w:t xml:space="preserve">; Fig. 2). This test favours the observed labels, since that model is scored against the definition it learned, so Section 5.3 repeats it against later floods that neither label source was trained on.</w:t>
       </w:r>
     </w:p>
     <w:bookmarkEnd w:id="25"/>
@@ -1362,7 +1362,7 @@
         <w:pStyle w:val="FirstParagraph"/>
       </w:pPr>
       <w:r>
-        <w:t xml:space="preserve">Predicting every flood year from the years before it gives 15 tests, 8 in the study regions and 7 in the validation regions (Table 7). The record ranked the later flooding significantly better in 2, the model in 3, and in the other 10 the two could not be told apart, so the 2024 result in Rangpur and Rajshahi is not the rule for every year. The share of new ground decided which way a test went, ranging from 6.8 to 76.1 % (Fig. 5a). The record’s lead fell as that share rose (Spearman</w:t>
+        <w:t xml:space="preserve">Predicting every flood year from the years before it gives 15 tests, 8 in the study regions and 7 in the validation regions (Table 7). The record ranked the later flooding significantly better in 2, the model in 3, and in the other 10 the two could not be told apart, so the 2024 result in Rangpur and Rajshahi is not the rule for every year. The share of new ground decided which way a test went, ranging from 6.8 to 76.1 % (Fig. 4a). The record’s lead fell as that share rose (Spearman</w:t>
       </w:r>
       <w:r>
         <w:t xml:space="preserve"> </w:t>
@@ -1537,6 +1537,29 @@
         </m:r>
       </m:oMath>
       <w:r>
+        <w:t xml:space="preserve">), and the relation was unchanged with the size of each flood held fixed (</w:t>
+      </w:r>
+      <m:oMath>
+        <m:r>
+          <m:t>ρ</m:t>
+        </m:r>
+        <m:r>
+          <m:rPr>
+            <m:sty m:val="p"/>
+          </m:rPr>
+          <m:t>=</m:t>
+        </m:r>
+        <m:r>
+          <m:rPr>
+            <m:sty m:val="p"/>
+          </m:rPr>
+          <m:t>−</m:t>
+        </m:r>
+        <m:r>
+          <m:t>0.785</m:t>
+        </m:r>
+      </m:oMath>
+      <w:r>
         <w:t xml:space="preserve">). The relation also held with each region left out in turn and within every region with more than one test, although resampling whole regions widened the crossover interval to 2.6–42.6 % (Section S9). In Rangpur and Rajshahi the model ranked the 2019 flood better, when 47.9 % of it reached new ground, the two were level in 2020, and the record led in 2024, at 6.8 %. Given the record as a feature, the model ranked the later flooding above both of its parts in 5 of 8 tests, all riverine.</w:t>
       </w:r>
     </w:p>
@@ -1545,7 +1568,7 @@
         <w:pStyle w:val="BodyText"/>
       </w:pPr>
       <w:r>
-        <w:t xml:space="preserve">The JRC hazard map ranked the later floods at 0.418 to 0.876, below chance on the coast, whose surges it does not simulate, so it is a fair rival only for river flooding. It trailed the record significantly in 5 tests and led it in 4, each on a flood that reached much new ground, and the model ranked above it in 8 of 15. Landsat water occurrence, scored on the 8 floods after 2021, ranked them at 0.624 to 0.834, below the radar record in 4. Area skill scores ordered the record and the model as AUC did in 15 of 15 tests, and the Molchan trajectories show where the difference lay (Fig. 5b, c). In Rangpur and Rajshahi the record caught most of the 2024 flooding within the first sixth of the assets it flagged and then, holding nothing on the rest, ran down the diagonal, while on the coast the model missed fewer flooded assets at most list lengths.</w:t>
+        <w:t xml:space="preserve">The JRC hazard map ranked the later floods at 0.418 to 0.876, below chance on the coast, whose surges it does not simulate, so it is a fair rival only for river flooding. It trailed the record significantly in 5 tests and led it in 4, each on a flood that reached much new ground, and the model ranked above it in 8 of 15. Landsat water occurrence, scored on the 8 floods after 2021, ranked them at 0.624 to 0.834, below the radar record in 4. Area skill scores ordered the record and the model as AUC did in 15 of 15 tests, and the Molchan trajectories show where the difference lay (Fig. 4b, c). In Rangpur and Rajshahi the record caught most of the 2024 flooding within the first sixth of the assets it flagged and then, holding nothing on the rest, ran down the diagonal, while on the coast the model missed fewer flooded assets at most list lengths.</w:t>
       </w:r>
     </w:p>
     <w:bookmarkEnd w:id="27"/>
@@ -1599,7 +1622,7 @@
         <w:pStyle w:val="FirstParagraph"/>
       </w:pPr>
       <w:r>
-        <w:t xml:space="preserve">Shuffling each feature across the test assets over the same assignments shows what the default model uses (Fig. 6). Elevation carries almost all of the terrain signal, costing 0.086, 0.220 and 0.129 in AUC when shuffled, while TWI, HAND, slope and flow accumulation cost at most 0.000, 0.009 and 0.007. Shuffled together, since correlated features can stand in for one another, the five terrain features cost 0.080, 0.214 and 0.132, about as much as elevation alone, and slightly less in Rangpur and Rajshahi, a difference within the noise of the shuffling. The five access distances together cost 0.110, 0.133 and 0.142, more than the terrain in Rangpur and Rajshahi and on the coast and second to it in Sylhet. They describe distance to services rather than any property of flooding and most likely stand in for where roads and settlements sit on the floodplain, a reading that was not tested directly.</w:t>
+        <w:t xml:space="preserve">Shuffling each feature across the test assets over the same assignments shows what the default model uses (Fig. 5). Elevation carries almost all of the terrain signal, costing 0.086, 0.220 and 0.129 in AUC when shuffled, while TWI, HAND, slope and flow accumulation cost at most 0.000, 0.009 and 0.007. Shuffled together, since correlated features can stand in for one another, the five terrain features cost 0.080, 0.214 and 0.132, about as much as elevation alone, and slightly less in Rangpur and Rajshahi, a difference within the noise of the shuffling. The five access distances together cost 0.110, 0.133 and 0.142, more than the terrain in Rangpur and Rajshahi and on the coast and second to it in Sylhet. They describe distance to services rather than any property of flooding and most likely stand in for where roads and settlements sit on the floodplain, a reading that was not tested directly.</w:t>
       </w:r>
     </w:p>
     <w:bookmarkEnd w:id="29"/>
@@ -1835,7 +1858,7 @@
         </m:r>
       </m:oMath>
       <w:r>
-        <w:t xml:space="preserve">), and the two were level at about 33.4 % of flooded assets. In Rangpur and Rajshahi the record predicted the 2024 flooding better than the model under every check applied, a global hydrodynamic hazard map was no stronger a rival, and a model given the record as a feature beat both of its parts in most riverine tests. Radar-observed flood extents made better training labels than terrain thresholds, by 0.101, 0.087 and 0.080 in AUC on held-out ground and by 0.069, 0.024 and 0.071 against later floods. Every number in this paper is generated from the released pipeline outputs, so each can be checked and rebuilt.</w:t>
+        <w:t xml:space="preserve">), and the two were level at about a third of flooded assets. In Rangpur and Rajshahi the record predicted the 2024 flooding better than the model under every check applied, a global hydrodynamic hazard map was no stronger a rival, and a model given the record as a feature beat both of its parts in most riverine tests. Radar-observed flood extents made better training labels than terrain thresholds, by 0.101, 0.087 and 0.080 in AUC on held-out ground and by 0.069, 0.024 and 0.071 against later floods. Every number in this paper is generated from the released pipeline outputs, so each can be checked and rebuilt.</w:t>
       </w:r>
     </w:p>
     <w:bookmarkEnd w:id="36"/>
@@ -3962,7 +3985,7 @@
         <w:pStyle w:val="TableCaption"/>
       </w:pPr>
       <w:r>
-        <w:t xml:space="preserve">Table 1. Flood susceptibility studies in Bangladesh compared with this system. Every study was read in full, and where a figure is given for training and validation separately the validation figure is shown. This system’s figures are means over 20 assignments of spatially held-out blocks, scored against observed floods, so the columns are not directly comparable, for the reasons given in the text.</w:t>
+        <w:t xml:space="preserve">Table 1. Flood susceptibility studies in Bangladesh compared with this study. Every study was read in full, and where a figure is given for training and validation separately the validation figure is shown. This system’s figures are means over 20 assignments of spatially held-out blocks, scored against observed floods, so the columns are not directly comparable, for the reasons given in the text.</w:t>
       </w:r>
     </w:p>
     <w:tbl>
@@ -3970,7 +3993,7 @@
         <w:tblStyle w:val="Table"/>
         <w:tblW w:type="auto" w:w="0"/>
         <w:tblLook w:firstRow="1" w:lastRow="0" w:firstColumn="0" w:lastColumn="0" w:noHBand="0" w:noVBand="0" w:val="0020"/>
-        <w:tblCaption w:val="Table 1. Flood susceptibility studies in Bangladesh compared with this system. Every study was read in full, and where a figure is given for training and validation separately the validation figure is shown. This system’s figures are means over 20 assignments of spatially held-out blocks, scored against observed floods, so the columns are not directly comparable, for the reasons given in the text."/>
+        <w:tblCaption w:val="Table 1. Flood susceptibility studies in Bangladesh compared with this study. Every study was read in full, and where a figure is given for training and validation separately the validation figure is shown. This system’s figures are means over 20 assignments of spatially held-out blocks, scored against observed floods, so the columns are not directly comparable, for the reasons given in the text."/>
       </w:tblPr>
       <w:tblGrid>
         <w:gridCol w:w="1584"/>
@@ -4501,7 +4524,7 @@
               <w:jc w:val="left"/>
             </w:pPr>
             <w:r>
-              <w:t xml:space="preserve">This system</w:t>
+              <w:t xml:space="preserve">This study</w:t>
             </w:r>
           </w:p>
         </w:tc>
@@ -4563,7 +4586,7 @@
               <w:jc w:val="left"/>
             </w:pPr>
             <w:r>
-              <w:t xml:space="preserve">This system</w:t>
+              <w:t xml:space="preserve">This study</w:t>
             </w:r>
           </w:p>
         </w:tc>
@@ -4625,7 +4648,7 @@
               <w:jc w:val="left"/>
             </w:pPr>
             <w:r>
-              <w:t xml:space="preserve">This system</w:t>
+              <w:t xml:space="preserve">This study</w:t>
             </w:r>
           </w:p>
         </w:tc>
@@ -9700,7 +9723,21 @@
         <w:t xml:space="preserve"> </w:t>
       </w:r>
       <w:r>
-        <w:t xml:space="preserve">The processing chain, top to bottom. Source counts are totals over the three flood regions. Each asset enters the models as a vector of terrain, population, access-distance and asset-type features, with a label from the Sentinel-1 flood frequency. The asset model is expanded, with the graph network it replaced shown as the alternative it now is. Both models train on the same spatial blocks, and dashed connectors mark what the validation scores on the test blocks.</w:t>
+        <w:t xml:space="preserve">ROC curves on the held-out test blocks of each flood region, scored against the observed definition of flood-prone ground. Both curves come from the default gradient-boosted model on one block assignment, sharing features and blocks and differing only in their training labels. The dotted diagonal is a random ranking, and</w:t>
+      </w:r>
+      <w:r>
+        <w:t xml:space="preserve"> </w:t>
+      </w:r>
+      <m:oMath>
+        <m:r>
+          <m:t>n</m:t>
+        </m:r>
+      </m:oMath>
+      <w:r>
+        <w:t xml:space="preserve"> </w:t>
+      </w:r>
+      <w:r>
+        <w:t xml:space="preserve">is the number of assets in the test blocks.</w:t>
       </w:r>
     </w:p>
     <w:p>
@@ -9718,21 +9755,7 @@
         <w:t xml:space="preserve"> </w:t>
       </w:r>
       <w:r>
-        <w:t xml:space="preserve">ROC curves on the held-out test blocks of each flood region, scored against the observed definition of flood-prone ground. Both curves come from the default gradient-boosted model on one block assignment, sharing features and blocks and differing only in their training labels. The dotted diagonal is a random ranking, and</w:t>
-      </w:r>
-      <w:r>
-        <w:t xml:space="preserve"> </w:t>
-      </w:r>
-      <m:oMath>
-        <m:r>
-          <m:t>n</m:t>
-        </m:r>
-      </m:oMath>
-      <w:r>
-        <w:t xml:space="preserve"> </w:t>
-      </w:r>
-      <w:r>
-        <w:t xml:space="preserve">is the number of assets in the test blocks.</w:t>
+        <w:t xml:space="preserve">Reliability of the flood model on the test blocks, with assets grouped into deciles of each prediction. The raw class-weighted score overstates the likelihood of flooding. The isotonic calibration, fitted on other blocks, brings the riverine deciles close to the diagonal. On the coast, where the calibration blocks hold more flood-prone ground than the test blocks (5.5 % against 1.7 %), it still overstates the flooding observed.</w:t>
       </w:r>
     </w:p>
     <w:p>
@@ -9750,7 +9773,7 @@
         <w:t xml:space="preserve"> </w:t>
       </w:r>
       <w:r>
-        <w:t xml:space="preserve">Reliability of the flood model on the test blocks, with assets grouped into deciles of each prediction. The raw class-weighted score overstates the likelihood of flooding. The isotonic calibration, fitted on other blocks, brings the riverine deciles close to the diagonal. On the coast, where the calibration blocks hold more flood-prone ground than the test blocks (5.5 % against 1.7 %), it still overstates the flooding observed.</w:t>
+        <w:t xml:space="preserve">(a) The record’s lead over the model in AUC against the share of each later flood that reached new ground, for every test in Table 7, with the least-squares line. (b, c) Molchan trajectories of the 2024 tests on one block assignment, the share of flooded assets missed against the share of assets flagged, lower being better; the grey diagonal is a random ranking.</w:t>
       </w:r>
     </w:p>
     <w:p>
@@ -9763,24 +9786,6 @@
           <w:bCs/>
         </w:rPr>
         <w:t xml:space="preserve">Figure 5.</w:t>
-      </w:r>
-      <w:r>
-        <w:t xml:space="preserve"> </w:t>
-      </w:r>
-      <w:r>
-        <w:t xml:space="preserve">(a) The record’s lead over the model in AUC against the share of each later flood that reached new ground, for every test in Table 7, with the least-squares line. (b, c) Molchan trajectories of the 2024 tests on one block assignment, the share of flooded assets missed against the share of assets flagged, lower being better; the grey diagonal is a random ranking.</w:t>
-      </w:r>
-    </w:p>
-    <w:p>
-      <w:pPr>
-        <w:pStyle w:val="BodyText"/>
-      </w:pPr>
-      <w:r>
-        <w:rPr>
-          <w:b/>
-          <w:bCs/>
-        </w:rPr>
-        <w:t xml:space="preserve">Figure 6.</w:t>
       </w:r>
       <w:r>
         <w:t xml:space="preserve"> </w:t>

</xml_diff>

<commit_message>
End abstract and Conclusions on the implication for flood management
</commit_message>
<xml_diff>
--- a/docs/paper/submission/manuscript.docx
+++ b/docs/paper/submission/manuscript.docx
@@ -70,7 +70,7 @@
         </m:r>
       </m:oMath>
       <w:r>
-        <w:t xml:space="preserve">), whatever the length of the record, and the two were level when about a third of flooded assets stood on such new ground. In Rangpur and Rajshahi, where only 6.8 % of the 2024 river flooding reached new ground, the record ranked it at 0.896 against 0.801 for the model and kept its lead with masks re-mapped from a single satellite, with other training targets and with 40 km blocks, while on the cyclone-struck coast, where most flooding reached new ground, the model led. A global hydrodynamic hazard map was no stronger a rival than the model, and the model given the record as a feature beat both of its parts in 5 of 8 tests, all riverine. Radar-observed extents also made better training labels than terrain thresholds, by 0.101, 0.087 and 0.080 in AUC on held-out areas. The radar masks agreed only moderately with an independent MODIS map, so every score measures agreement with flooding as radar sees it. Susceptibility studies with a radar flood history should report that record as a baseline and score their models by the share of its ranking error they remove.</w:t>
+        <w:t xml:space="preserve">), whatever the length of the record, and the two were level when about a third of flooded assets stood on such new ground. In Rangpur and Rajshahi, where only 6.8 % of the 2024 river flooding reached new ground, the record ranked it at 0.896 against 0.801 for the model and kept its lead with masks re-mapped from a single satellite, with other training targets and with 40 km blocks, while on the cyclone-struck coast, where most flooding reached new ground, the model led. A global hydrodynamic hazard map was no stronger a rival than the model, and the model given the record as a feature beat both of its parts in 5 of 8 tests, all riverine. Radar-observed extents also made better training labels than terrain thresholds, by 0.101, 0.087 and 0.080 in AUC on held-out areas. The radar masks agreed only moderately with an independent MODIS map, so every score measures agreement with flooding as radar sees it. Where a radar flood history exists, it can serve as a free planning map wherever floods return to the same ground, a susceptibility model earns its place mainly where floods reach new ground, and susceptibility studies should report the record as a baseline and score their models by the share of its ranking error they remove.</w:t>
       </w:r>
     </w:p>
     <w:p>
@@ -1856,7 +1856,7 @@
         </m:r>
       </m:oMath>
       <w:r>
-        <w:t xml:space="preserve">), and the two were level at about a third of flooded assets. In Rangpur and Rajshahi the record predicted the 2024 flooding better than the model under every check applied, a global hydrodynamic hazard map was no stronger a rival, and a model given the record as a feature beat both of its parts in most riverine tests. Radar-observed flood extents made better training labels than terrain thresholds, by 0.101, 0.087 and 0.080 in AUC on held-out ground and by 0.069, 0.024 and 0.071 against later floods. Every number in this paper is generated from the released pipeline outputs, so each can be checked and rebuilt.</w:t>
+        <w:t xml:space="preserve">), and the two were level at about a third of flooded assets. In Rangpur and Rajshahi the record predicted the 2024 flooding better than the model under every check applied, a global hydrodynamic hazard map was no stronger a rival, and a model given the record as a feature beat both of its parts in most riverine tests. Radar-observed flood extents made better training labels than terrain thresholds, by 0.101, 0.087 and 0.080 in AUC on held-out ground and by 0.069, 0.024 and 0.071 against later floods. For flood management, a radar flood history is therefore a free planning map wherever floods return to the same ground, and a model is worth building mainly where floods reach new ground. Every number in this paper is generated from the released pipeline outputs, so each can be checked and rebuilt.</w:t>
       </w:r>
     </w:p>
     <w:bookmarkEnd w:id="35"/>

</xml_diff>